<commit_message>
feat(clima): raios e temporais no Radar, socorro a vitima de raio; checklist sem categoria por pergunta
- Radar BR: alerta de raios para todas as regioes (fora de casa, abrigo,
  ultimo recurso, dentro de casa, para-raios, pets, link para o socorro) e
  alerta de vendaval, granizo e ciclone no Sul. O de chuvas do Centro-Sul
  deixou de repetir o assunto raios.
- Primeiros Socorros: tema novo "Atingido por Raio" nos 4 idiomas (a vitima
  nao fica com carga; RCP; triagem de quem nao respira primeiro).
- Busca dos Primeiros Socorros: os sinonimos estavam em chaves que nenhum
  tema tem e nunca entravam; agora ligados por tema.
- Checklists (vistoria, Escola, Asilo, kits): a categoria deixou de aparecer
  em cada pergunta — e dado de parametrizacao (pedido do Agnaldo).
- RK regerado com o conteudo de clima (170 textos, com ANTES).

Co-Authored-By: Claude Opus 5.5 <noreply@anthropic.com>
</commit_message>
<xml_diff>
--- a/docs/revisao-conteudo/RK-Retorno-CK-AV-IF.docx
+++ b/docs/revisao-conteudo/RK-Retorno-CK-AV-IF.docx
@@ -42,7 +42,7 @@
           <w:sz w:val="22"/>
           <w:szCs w:val="22"/>
         </w:rPr>
-        <w:t xml:space="preserve">Retorno da sua revisao do CK, do AV e do IF. Suas edicoes entraram como voce escreveu; aqui estao so os textos que voce ainda nao viu: onde ajustei a sua edicao ao aplicar (concordancia, repeticao), as respostas aos seus comentarios (sobrocado, pilha botao, cerca de piscina, aranha-marrom, churrasqueira, radonio, soro de reidratacao...), a cautela que estava esperando estes documentos, os ambientes do checklist e as telas EPI e Ferramentas que nao tinham traducao, e o que levei das partes mortas do checklist para as telas vivas de Escola, Asilo e Kits. A linha ANTES mostra como estava; texto sem ANTES e novo.</w:t>
+        <w:t xml:space="preserve">Retorno da sua revisao do CK, do AV e do IF. Suas edicoes entraram como voce escreveu; aqui estao so os textos que voce ainda nao viu: onde ajustei a sua edicao ao aplicar (concordancia, repeticao), as respostas aos seus comentarios (sobrocado, pilha botao, cerca de piscina, aranha-marrom, churrasqueira, radonio, soro de reidratacao...), a cautela que estava esperando estes documentos, os ambientes do checklist e as telas EPI e Ferramentas que nao tinham traducao, e o que levei das partes mortas do checklist para as telas vivas de Escola, Asilo e Kits. No fim, o conteudo de clima que voce pediu: alerta de raios para todas as regioes, alerta de vendaval, granizo e ciclone no Sul e o tema de primeiros socorros Atingido por Raio. A linha ANTES mostra como estava; texto sem ANTES e novo.</w:t>
       </w:r>
     </w:p>
     <w:p>
@@ -176,7 +176,7 @@
           <w:sz w:val="20"/>
           <w:szCs w:val="20"/>
         </w:rPr>
-        <w:t xml:space="preserve">77 textos neste documento.</w:t>
+        <w:t xml:space="preserve">107 textos neste documento.</w:t>
       </w:r>
     </w:p>
     <w:p>
@@ -236,22 +236,31 @@
           <w:sz w:val="34"/>
           <w:szCs w:val="34"/>
         </w:rPr>
-        <w:t xml:space="preserve">Micro-blog</w:t>
-      </w:r>
-    </w:p>
-    <w:p>
-      <w:pPr>
-        <w:pStyle w:val="Heading2"/>
-        <w:spacing w:after="120" w:before="280"/>
-      </w:pPr>
-      <w:r>
-        <w:rPr>
-          <w:b/>
-          <w:bCs/>
-          <w:sz w:val="26"/>
-          <w:szCs w:val="26"/>
-        </w:rPr>
-        <w:t xml:space="preserve">Como evitar afogamentos de crianças</w:t>
+        <w:t xml:space="preserve">Primeiros Socorros — Atingido por Raio (tema novo)</w:t>
+      </w:r>
+    </w:p>
+    <w:p>
+      <w:pPr>
+        <w:pStyle w:val="Heading2"/>
+        <w:spacing w:after="120" w:before="280"/>
+      </w:pPr>
+      <w:r>
+        <w:rPr>
+          <w:rFonts w:ascii="Consolas" w:cs="Consolas" w:eastAsia="Consolas" w:hAnsi="Consolas"/>
+          <w:color w:val="9AA0A6"/>
+          <w:sz w:val="14"/>
+          <w:szCs w:val="14"/>
+        </w:rPr>
+        <w:t xml:space="preserve">RK-0001  </w:t>
+      </w:r>
+      <w:r>
+        <w:rPr>
+          <w:b/>
+          <w:bCs/>
+          <w:sz w:val="26"/>
+          <w:szCs w:val="26"/>
+        </w:rPr>
+        <w:t xml:space="preserve">Atingido por Raio</w:t>
       </w:r>
     </w:p>
     <w:p>
@@ -267,91 +276,44 @@
           <w:sz w:val="16"/>
           <w:szCs w:val="16"/>
         </w:rPr>
-        <w:t xml:space="preserve">RESUMO</w:t>
-      </w:r>
-    </w:p>
-    <w:p>
-      <w:pPr>
-        <w:spacing w:after="160" w:line="300"/>
-      </w:pPr>
-      <w:r>
-        <w:rPr>
-          <w:rFonts w:ascii="Consolas" w:cs="Consolas" w:eastAsia="Consolas" w:hAnsi="Consolas"/>
-          <w:color w:val="9AA0A6"/>
-          <w:sz w:val="14"/>
-          <w:szCs w:val="14"/>
-        </w:rPr>
-        <w:t xml:space="preserve">RK-0001  </w:t>
-      </w:r>
-      <w:r>
-        <w:rPr>
-          <w:sz w:val="22"/>
-          <w:szCs w:val="22"/>
-        </w:rPr>
-        <w:t xml:space="preserve">Riscos silenciosos:</w:t>
-      </w:r>
-      <w:r>
-        <w:rPr>
-          <w:sz w:val="22"/>
-          <w:szCs w:val="22"/>
-        </w:rPr>
-        <w:br/>
-        <w:t xml:space="preserve">• Apenas 3 cm: É a profundidade suficiente para uma criança se afogar em minutos.</w:t>
-      </w:r>
-      <w:r>
-        <w:rPr>
-          <w:sz w:val="22"/>
-          <w:szCs w:val="22"/>
-        </w:rPr>
-        <w:br/>
-        <w:t xml:space="preserve">• Esvazie: Baldes, bacias e banheiras devem estar sempre vazios após o uso.</w:t>
-      </w:r>
-      <w:r>
-        <w:rPr>
-          <w:sz w:val="22"/>
-          <w:szCs w:val="22"/>
-        </w:rPr>
-        <w:br/>
-        <w:t xml:space="preserve">• Tampe: Mantenha o vaso sanitário sempre fechado e travado.</w:t>
-      </w:r>
-      <w:r>
-        <w:rPr>
-          <w:sz w:val="22"/>
-          <w:szCs w:val="22"/>
-        </w:rPr>
-        <w:br/>
-        <w:t xml:space="preserve">• Piscinas: Exigem cerca de pelo menos 1,50 m e portão autotrancante. Supervisão total, mesmo sabendo nadar.</w:t>
-      </w:r>
-    </w:p>
-    <w:p>
-      <w:pPr>
-        <w:spacing w:after="160" w:before="0"/>
-        <w:ind w:left="360"/>
-      </w:pPr>
-      <w:r>
-        <w:rPr>
-          <w:i/>
-          <w:iCs/>
-          <w:color w:val="8A6D00"/>
-          <w:sz w:val="18"/>
-          <w:szCs w:val="18"/>
-        </w:rPr>
-        <w:t xml:space="preserve">ANTES (até 22/10/2026): Riscos silenciosos: / • Apenas 3 cm: É a profundidade suficiente para uma criança se afogar em minutos. / • Esvazie: Baldes, bacias e banheiras devem estar sempre vazios após o uso. / • Tampe: Mantenha o vaso sanitário sempre fechado e travado. / • Piscinas: Exigem cerca de pelo menos 1,20m e portão autotrancante. Supervisão total, mesmo sabendo nadar.</w:t>
-      </w:r>
-    </w:p>
-    <w:p>
-      <w:pPr>
-        <w:pStyle w:val="Heading2"/>
-        <w:spacing w:after="120" w:before="280"/>
-      </w:pPr>
-      <w:r>
-        <w:rPr>
-          <w:b/>
-          <w:bCs/>
-          <w:sz w:val="26"/>
-          <w:szCs w:val="26"/>
-        </w:rPr>
-        <w:t xml:space="preserve">Segurança Aquática para Pets</w:t>
+        <w:t xml:space="preserve">SITUACAO</w:t>
+      </w:r>
+    </w:p>
+    <w:p>
+      <w:pPr>
+        <w:spacing w:after="160" w:line="300"/>
+      </w:pPr>
+      <w:r>
+        <w:rPr>
+          <w:rFonts w:ascii="Consolas" w:cs="Consolas" w:eastAsia="Consolas" w:hAnsi="Consolas"/>
+          <w:color w:val="9AA0A6"/>
+          <w:sz w:val="14"/>
+          <w:szCs w:val="14"/>
+        </w:rPr>
+        <w:t xml:space="preserve">RK-0002  </w:t>
+      </w:r>
+      <w:r>
+        <w:rPr>
+          <w:sz w:val="22"/>
+          <w:szCs w:val="22"/>
+        </w:rPr>
+        <w:t xml:space="preserve">Pessoa atingida por um raio ou que estava muito perto de onde ele caiu</w:t>
+      </w:r>
+    </w:p>
+    <w:p>
+      <w:pPr>
+        <w:spacing w:after="160" w:before="0"/>
+        <w:ind w:left="360"/>
+      </w:pPr>
+      <w:r>
+        <w:rPr>
+          <w:i/>
+          <w:iCs/>
+          <w:color w:val="065F46"/>
+          <w:sz w:val="18"/>
+          <w:szCs w:val="18"/>
+        </w:rPr>
+        <w:t xml:space="preserve">NOVO EM 22/10/2026 — este texto nao existia.</w:t>
       </w:r>
     </w:p>
     <w:p>
@@ -367,76 +329,483 @@
           <w:sz w:val="16"/>
           <w:szCs w:val="16"/>
         </w:rPr>
-        <w:t xml:space="preserve">RESUMO</w:t>
-      </w:r>
-    </w:p>
-    <w:p>
-      <w:pPr>
-        <w:spacing w:after="160" w:line="300"/>
-      </w:pPr>
-      <w:r>
-        <w:rPr>
-          <w:rFonts w:ascii="Consolas" w:cs="Consolas" w:eastAsia="Consolas" w:hAnsi="Consolas"/>
-          <w:color w:val="9AA0A6"/>
-          <w:sz w:val="14"/>
-          <w:szCs w:val="14"/>
-        </w:rPr>
-        <w:t xml:space="preserve">RK-0002  </w:t>
-      </w:r>
-      <w:r>
-        <w:rPr>
-          <w:sz w:val="22"/>
-          <w:szCs w:val="22"/>
-        </w:rPr>
-        <w:t xml:space="preserve">Nem todo pet sabe nadar:</w:t>
-      </w:r>
-      <w:r>
-        <w:rPr>
-          <w:sz w:val="22"/>
-          <w:szCs w:val="22"/>
-        </w:rPr>
-        <w:br/>
-        <w:t xml:space="preserve">• Exaustão: O pânico em quedas acidentais causa fadiga fatal em minutos.</w:t>
-      </w:r>
-      <w:r>
-        <w:rPr>
-          <w:sz w:val="22"/>
-          <w:szCs w:val="22"/>
-        </w:rPr>
-        <w:br/>
-        <w:t xml:space="preserve">• Barreiras: Cerca de isolamento (pelo menos 1,50 m) ao redor da piscina é uma das melhores defesas.</w:t>
-      </w:r>
-      <w:r>
-        <w:rPr>
-          <w:sz w:val="22"/>
-          <w:szCs w:val="22"/>
-        </w:rPr>
-        <w:br/>
-        <w:t xml:space="preserve">• Rampa: Escadas convencionais são impossíveis para eles. Instale uma "Rampa de Emergência" submersa com superfície antiderrapante.</w:t>
-      </w:r>
-      <w:r>
-        <w:rPr>
-          <w:sz w:val="22"/>
-          <w:szCs w:val="22"/>
-        </w:rPr>
-        <w:br/>
-        <w:t xml:space="preserve">Treine seu cão para saber onde fica a saída.</w:t>
-      </w:r>
-    </w:p>
-    <w:p>
-      <w:pPr>
-        <w:spacing w:after="160" w:before="0"/>
-        <w:ind w:left="360"/>
-      </w:pPr>
-      <w:r>
-        <w:rPr>
-          <w:i/>
-          <w:iCs/>
-          <w:color w:val="8A6D00"/>
-          <w:sz w:val="18"/>
-          <w:szCs w:val="18"/>
-        </w:rPr>
-        <w:t xml:space="preserve">ANTES (até 22/10/2026): Nem todo pet sabe nadar: / • Exaustão: O pânico em quedas acidentais causa fadiga fatal em minutos. / • Barreiras: Cerca de isolamento (1,20m) ao redor da piscina é a melhor defesa. / • Rampa: Escadas convencionais são impossíveis para eles. Instale uma "Rampa de Emergência" submersa com superfície antiderrapante. / Treine seu cão para saber onde fica a saída.</w:t>
+        <w:t xml:space="preserve">O QUE FAZER</w:t>
+      </w:r>
+    </w:p>
+    <w:p>
+      <w:pPr>
+        <w:spacing w:after="160" w:line="300"/>
+      </w:pPr>
+      <w:r>
+        <w:rPr>
+          <w:rFonts w:ascii="Consolas" w:cs="Consolas" w:eastAsia="Consolas" w:hAnsi="Consolas"/>
+          <w:color w:val="9AA0A6"/>
+          <w:sz w:val="14"/>
+          <w:szCs w:val="14"/>
+        </w:rPr>
+        <w:t xml:space="preserve">RK-0003  </w:t>
+      </w:r>
+      <w:r>
+        <w:rPr>
+          <w:sz w:val="22"/>
+          <w:szCs w:val="22"/>
+        </w:rPr>
+        <w:t xml:space="preserve">Ligue para o {{EMERGENCY_MEDICAL}} imediatamente.</w:t>
+      </w:r>
+    </w:p>
+    <w:p>
+      <w:pPr>
+        <w:spacing w:after="160" w:before="0"/>
+        <w:ind w:left="360"/>
+      </w:pPr>
+      <w:r>
+        <w:rPr>
+          <w:i/>
+          <w:iCs/>
+          <w:color w:val="065F46"/>
+          <w:sz w:val="18"/>
+          <w:szCs w:val="18"/>
+        </w:rPr>
+        <w:t xml:space="preserve">NOVO EM 22/10/2026 — este texto nao existia.</w:t>
+      </w:r>
+    </w:p>
+    <w:p>
+      <w:pPr>
+        <w:spacing w:after="160" w:line="300"/>
+      </w:pPr>
+      <w:r>
+        <w:rPr>
+          <w:rFonts w:ascii="Consolas" w:cs="Consolas" w:eastAsia="Consolas" w:hAnsi="Consolas"/>
+          <w:color w:val="9AA0A6"/>
+          <w:sz w:val="14"/>
+          <w:szCs w:val="14"/>
+        </w:rPr>
+        <w:t xml:space="preserve">RK-0004  </w:t>
+      </w:r>
+      <w:r>
+        <w:rPr>
+          <w:sz w:val="22"/>
+          <w:szCs w:val="22"/>
+        </w:rPr>
+        <w:t xml:space="preserve">Pode tocar na vítima: o corpo de quem foi atingido NÃO fica com carga elétrica.</w:t>
+      </w:r>
+    </w:p>
+    <w:p>
+      <w:pPr>
+        <w:spacing w:after="160" w:before="0"/>
+        <w:ind w:left="360"/>
+      </w:pPr>
+      <w:r>
+        <w:rPr>
+          <w:i/>
+          <w:iCs/>
+          <w:color w:val="065F46"/>
+          <w:sz w:val="18"/>
+          <w:szCs w:val="18"/>
+        </w:rPr>
+        <w:t xml:space="preserve">NOVO EM 22/10/2026 — este texto nao existia.</w:t>
+      </w:r>
+    </w:p>
+    <w:p>
+      <w:pPr>
+        <w:spacing w:after="160" w:line="300"/>
+      </w:pPr>
+      <w:r>
+        <w:rPr>
+          <w:rFonts w:ascii="Consolas" w:cs="Consolas" w:eastAsia="Consolas" w:hAnsi="Consolas"/>
+          <w:color w:val="9AA0A6"/>
+          <w:sz w:val="14"/>
+          <w:szCs w:val="14"/>
+        </w:rPr>
+        <w:t xml:space="preserve">RK-0005  </w:t>
+      </w:r>
+      <w:r>
+        <w:rPr>
+          <w:sz w:val="22"/>
+          <w:szCs w:val="22"/>
+        </w:rPr>
+        <w:t xml:space="preserve">Se a tempestade continuar e for possível sem risco para você, leve a vítima para um lugar abrigado — o raio pode cair de novo no mesmo lugar.</w:t>
+      </w:r>
+    </w:p>
+    <w:p>
+      <w:pPr>
+        <w:spacing w:after="160" w:before="0"/>
+        <w:ind w:left="360"/>
+      </w:pPr>
+      <w:r>
+        <w:rPr>
+          <w:i/>
+          <w:iCs/>
+          <w:color w:val="065F46"/>
+          <w:sz w:val="18"/>
+          <w:szCs w:val="18"/>
+        </w:rPr>
+        <w:t xml:space="preserve">NOVO EM 22/10/2026 — este texto nao existia.</w:t>
+      </w:r>
+    </w:p>
+    <w:p>
+      <w:pPr>
+        <w:spacing w:after="160" w:line="300"/>
+      </w:pPr>
+      <w:r>
+        <w:rPr>
+          <w:rFonts w:ascii="Consolas" w:cs="Consolas" w:eastAsia="Consolas" w:hAnsi="Consolas"/>
+          <w:color w:val="9AA0A6"/>
+          <w:sz w:val="14"/>
+          <w:szCs w:val="14"/>
+        </w:rPr>
+        <w:t xml:space="preserve">RK-0006  </w:t>
+      </w:r>
+      <w:r>
+        <w:rPr>
+          <w:sz w:val="22"/>
+          <w:szCs w:val="22"/>
+        </w:rPr>
+        <w:t xml:space="preserve">Veja se a pessoa responde e respira. Se não respirar, inicie a RCP e continue até o socorro chegar.</w:t>
+      </w:r>
+    </w:p>
+    <w:p>
+      <w:pPr>
+        <w:spacing w:after="160" w:before="0"/>
+        <w:ind w:left="360"/>
+      </w:pPr>
+      <w:r>
+        <w:rPr>
+          <w:i/>
+          <w:iCs/>
+          <w:color w:val="065F46"/>
+          <w:sz w:val="18"/>
+          <w:szCs w:val="18"/>
+        </w:rPr>
+        <w:t xml:space="preserve">NOVO EM 22/10/2026 — este texto nao existia.</w:t>
+      </w:r>
+    </w:p>
+    <w:p>
+      <w:pPr>
+        <w:spacing w:after="160" w:line="300"/>
+      </w:pPr>
+      <w:r>
+        <w:rPr>
+          <w:rFonts w:ascii="Consolas" w:cs="Consolas" w:eastAsia="Consolas" w:hAnsi="Consolas"/>
+          <w:color w:val="9AA0A6"/>
+          <w:sz w:val="14"/>
+          <w:szCs w:val="14"/>
+        </w:rPr>
+        <w:t xml:space="preserve">RK-0007  </w:t>
+      </w:r>
+      <w:r>
+        <w:rPr>
+          <w:sz w:val="22"/>
+          <w:szCs w:val="22"/>
+        </w:rPr>
+        <w:t xml:space="preserve">Com várias vítimas, atenda primeiro quem não se mexe e não respira — quem grita ou se mexe está respirando.</w:t>
+      </w:r>
+    </w:p>
+    <w:p>
+      <w:pPr>
+        <w:spacing w:after="160" w:before="0"/>
+        <w:ind w:left="360"/>
+      </w:pPr>
+      <w:r>
+        <w:rPr>
+          <w:i/>
+          <w:iCs/>
+          <w:color w:val="065F46"/>
+          <w:sz w:val="18"/>
+          <w:szCs w:val="18"/>
+        </w:rPr>
+        <w:t xml:space="preserve">NOVO EM 22/10/2026 — este texto nao existia.</w:t>
+      </w:r>
+    </w:p>
+    <w:p>
+      <w:pPr>
+        <w:spacing w:after="160" w:line="300"/>
+      </w:pPr>
+      <w:r>
+        <w:rPr>
+          <w:rFonts w:ascii="Consolas" w:cs="Consolas" w:eastAsia="Consolas" w:hAnsi="Consolas"/>
+          <w:color w:val="9AA0A6"/>
+          <w:sz w:val="14"/>
+          <w:szCs w:val="14"/>
+        </w:rPr>
+        <w:t xml:space="preserve">RK-0008  </w:t>
+      </w:r>
+      <w:r>
+        <w:rPr>
+          <w:sz w:val="22"/>
+          <w:szCs w:val="22"/>
+        </w:rPr>
+        <w:t xml:space="preserve">Se a pessoa respira, deite-a de lado (posição lateral de segurança), mantenha-a aquecida e fique ao lado dela.</w:t>
+      </w:r>
+    </w:p>
+    <w:p>
+      <w:pPr>
+        <w:spacing w:after="160" w:before="0"/>
+        <w:ind w:left="360"/>
+      </w:pPr>
+      <w:r>
+        <w:rPr>
+          <w:i/>
+          <w:iCs/>
+          <w:color w:val="065F46"/>
+          <w:sz w:val="18"/>
+          <w:szCs w:val="18"/>
+        </w:rPr>
+        <w:t xml:space="preserve">NOVO EM 22/10/2026 — este texto nao existia.</w:t>
+      </w:r>
+    </w:p>
+    <w:p>
+      <w:pPr>
+        <w:spacing w:after="160" w:line="300"/>
+      </w:pPr>
+      <w:r>
+        <w:rPr>
+          <w:rFonts w:ascii="Consolas" w:cs="Consolas" w:eastAsia="Consolas" w:hAnsi="Consolas"/>
+          <w:color w:val="9AA0A6"/>
+          <w:sz w:val="14"/>
+          <w:szCs w:val="14"/>
+        </w:rPr>
+        <w:t xml:space="preserve">RK-0009  </w:t>
+      </w:r>
+      <w:r>
+        <w:rPr>
+          <w:sz w:val="22"/>
+          <w:szCs w:val="22"/>
+        </w:rPr>
+        <w:t xml:space="preserve">Cubra as queimaduras com pano limpo ou filme plástico, sem apertar.</w:t>
+      </w:r>
+    </w:p>
+    <w:p>
+      <w:pPr>
+        <w:spacing w:after="160" w:before="0"/>
+        <w:ind w:left="360"/>
+      </w:pPr>
+      <w:r>
+        <w:rPr>
+          <w:i/>
+          <w:iCs/>
+          <w:color w:val="065F46"/>
+          <w:sz w:val="18"/>
+          <w:szCs w:val="18"/>
+        </w:rPr>
+        <w:t xml:space="preserve">NOVO EM 22/10/2026 — este texto nao existia.</w:t>
+      </w:r>
+    </w:p>
+    <w:p>
+      <w:pPr>
+        <w:spacing w:after="60" w:before="180"/>
+      </w:pPr>
+      <w:r>
+        <w:rPr>
+          <w:b/>
+          <w:bCs/>
+          <w:color w:val="9AA0A6"/>
+          <w:spacing w:val="20"/>
+          <w:sz w:val="16"/>
+          <w:szCs w:val="16"/>
+        </w:rPr>
+        <w:t xml:space="preserve">O QUE NUNCA FAZER</w:t>
+      </w:r>
+    </w:p>
+    <w:p>
+      <w:pPr>
+        <w:spacing w:after="160" w:line="300"/>
+      </w:pPr>
+      <w:r>
+        <w:rPr>
+          <w:rFonts w:ascii="Consolas" w:cs="Consolas" w:eastAsia="Consolas" w:hAnsi="Consolas"/>
+          <w:color w:val="9AA0A6"/>
+          <w:sz w:val="14"/>
+          <w:szCs w:val="14"/>
+        </w:rPr>
+        <w:t xml:space="preserve">RK-0010  </w:t>
+      </w:r>
+      <w:r>
+        <w:rPr>
+          <w:sz w:val="22"/>
+          <w:szCs w:val="22"/>
+        </w:rPr>
+        <w:t xml:space="preserve">NÃO espere a vítima "descarregar" para socorrer — isso é mito, e cada minuto conta.</w:t>
+      </w:r>
+    </w:p>
+    <w:p>
+      <w:pPr>
+        <w:spacing w:after="160" w:before="0"/>
+        <w:ind w:left="360"/>
+      </w:pPr>
+      <w:r>
+        <w:rPr>
+          <w:i/>
+          <w:iCs/>
+          <w:color w:val="065F46"/>
+          <w:sz w:val="18"/>
+          <w:szCs w:val="18"/>
+        </w:rPr>
+        <w:t xml:space="preserve">NOVO EM 22/10/2026 — este texto nao existia.</w:t>
+      </w:r>
+    </w:p>
+    <w:p>
+      <w:pPr>
+        <w:spacing w:after="160" w:line="300"/>
+      </w:pPr>
+      <w:r>
+        <w:rPr>
+          <w:rFonts w:ascii="Consolas" w:cs="Consolas" w:eastAsia="Consolas" w:hAnsi="Consolas"/>
+          <w:color w:val="9AA0A6"/>
+          <w:sz w:val="14"/>
+          <w:szCs w:val="14"/>
+        </w:rPr>
+        <w:t xml:space="preserve">RK-0011  </w:t>
+      </w:r>
+      <w:r>
+        <w:rPr>
+          <w:sz w:val="22"/>
+          <w:szCs w:val="22"/>
+        </w:rPr>
+        <w:t xml:space="preserve">NÃO se exponha: se ainda houver raios, abrigue-se com a vítima assim que possível.</w:t>
+      </w:r>
+    </w:p>
+    <w:p>
+      <w:pPr>
+        <w:spacing w:after="160" w:before="0"/>
+        <w:ind w:left="360"/>
+      </w:pPr>
+      <w:r>
+        <w:rPr>
+          <w:i/>
+          <w:iCs/>
+          <w:color w:val="065F46"/>
+          <w:sz w:val="18"/>
+          <w:szCs w:val="18"/>
+        </w:rPr>
+        <w:t xml:space="preserve">NOVO EM 22/10/2026 — este texto nao existia.</w:t>
+      </w:r>
+    </w:p>
+    <w:p>
+      <w:pPr>
+        <w:spacing w:after="160" w:line="300"/>
+      </w:pPr>
+      <w:r>
+        <w:rPr>
+          <w:rFonts w:ascii="Consolas" w:cs="Consolas" w:eastAsia="Consolas" w:hAnsi="Consolas"/>
+          <w:color w:val="9AA0A6"/>
+          <w:sz w:val="14"/>
+          <w:szCs w:val="14"/>
+        </w:rPr>
+        <w:t xml:space="preserve">RK-0012  </w:t>
+      </w:r>
+      <w:r>
+        <w:rPr>
+          <w:sz w:val="22"/>
+          <w:szCs w:val="22"/>
+        </w:rPr>
+        <w:t xml:space="preserve">NÃO dê nada de beber a quem está confuso ou sonolento.</w:t>
+      </w:r>
+    </w:p>
+    <w:p>
+      <w:pPr>
+        <w:spacing w:after="160" w:before="0"/>
+        <w:ind w:left="360"/>
+      </w:pPr>
+      <w:r>
+        <w:rPr>
+          <w:i/>
+          <w:iCs/>
+          <w:color w:val="065F46"/>
+          <w:sz w:val="18"/>
+          <w:szCs w:val="18"/>
+        </w:rPr>
+        <w:t xml:space="preserve">NOVO EM 22/10/2026 — este texto nao existia.</w:t>
+      </w:r>
+    </w:p>
+    <w:p>
+      <w:pPr>
+        <w:spacing w:after="160" w:line="300"/>
+      </w:pPr>
+      <w:r>
+        <w:rPr>
+          <w:rFonts w:ascii="Consolas" w:cs="Consolas" w:eastAsia="Consolas" w:hAnsi="Consolas"/>
+          <w:color w:val="9AA0A6"/>
+          <w:sz w:val="14"/>
+          <w:szCs w:val="14"/>
+        </w:rPr>
+        <w:t xml:space="preserve">RK-0013  </w:t>
+      </w:r>
+      <w:r>
+        <w:rPr>
+          <w:sz w:val="22"/>
+          <w:szCs w:val="22"/>
+        </w:rPr>
+        <w:t xml:space="preserve">NÃO dispense o atendimento de quem parece bem.</w:t>
+      </w:r>
+    </w:p>
+    <w:p>
+      <w:pPr>
+        <w:spacing w:after="160" w:before="0"/>
+        <w:ind w:left="360"/>
+      </w:pPr>
+      <w:r>
+        <w:rPr>
+          <w:i/>
+          <w:iCs/>
+          <w:color w:val="065F46"/>
+          <w:sz w:val="18"/>
+          <w:szCs w:val="18"/>
+        </w:rPr>
+        <w:t xml:space="preserve">NOVO EM 22/10/2026 — este texto nao existia.</w:t>
+      </w:r>
+    </w:p>
+    <w:p>
+      <w:pPr>
+        <w:spacing w:after="60" w:before="180"/>
+      </w:pPr>
+      <w:r>
+        <w:rPr>
+          <w:b/>
+          <w:bCs/>
+          <w:color w:val="9AA0A6"/>
+          <w:spacing w:val="20"/>
+          <w:sz w:val="16"/>
+          <w:szCs w:val="16"/>
+        </w:rPr>
+        <w:t xml:space="preserve">QUANDO CHAMAR AJUDA</w:t>
+      </w:r>
+    </w:p>
+    <w:p>
+      <w:pPr>
+        <w:spacing w:after="160" w:line="300"/>
+      </w:pPr>
+      <w:r>
+        <w:rPr>
+          <w:rFonts w:ascii="Consolas" w:cs="Consolas" w:eastAsia="Consolas" w:hAnsi="Consolas"/>
+          <w:color w:val="9AA0A6"/>
+          <w:sz w:val="14"/>
+          <w:szCs w:val="14"/>
+        </w:rPr>
+        <w:t xml:space="preserve">RK-0014  </w:t>
+      </w:r>
+      <w:r>
+        <w:rPr>
+          <w:sz w:val="22"/>
+          <w:szCs w:val="22"/>
+        </w:rPr>
+        <w:t xml:space="preserve">SEMPRE chame o {{EMERGENCY_MEDICAL}}: mesmo quem parece bem pode ter lesões no coração, nos nervos, nos ouvidos e nos olhos que só aparecem depois.</w:t>
+      </w:r>
+    </w:p>
+    <w:p>
+      <w:pPr>
+        <w:spacing w:after="160" w:before="0"/>
+        <w:ind w:left="360"/>
+      </w:pPr>
+      <w:r>
+        <w:rPr>
+          <w:i/>
+          <w:iCs/>
+          <w:color w:val="065F46"/>
+          <w:sz w:val="18"/>
+          <w:szCs w:val="18"/>
+        </w:rPr>
+        <w:t xml:space="preserve">NOVO EM 22/10/2026 — este texto nao existia.</w:t>
       </w:r>
     </w:p>
     <w:p>
@@ -453,43 +822,59 @@
           <w:sz w:val="34"/>
           <w:szCs w:val="34"/>
         </w:rPr>
-        <w:t xml:space="preserve">Fases da vida</w:t>
-      </w:r>
-    </w:p>
-    <w:p>
-      <w:pPr>
-        <w:pStyle w:val="Heading2"/>
-        <w:spacing w:after="120" w:before="280"/>
-      </w:pPr>
-      <w:r>
-        <w:rPr>
-          <w:b/>
-          <w:bCs/>
-          <w:sz w:val="26"/>
-          <w:szCs w:val="26"/>
-        </w:rPr>
-        <w:t xml:space="preserve">Crianças (3-12 anos)</w:t>
-      </w:r>
-    </w:p>
-    <w:p>
-      <w:pPr>
-        <w:spacing w:after="160" w:line="300"/>
-      </w:pPr>
-      <w:r>
-        <w:rPr>
-          <w:rFonts w:ascii="Consolas" w:cs="Consolas" w:eastAsia="Consolas" w:hAnsi="Consolas"/>
-          <w:color w:val="9AA0A6"/>
-          <w:sz w:val="14"/>
-          <w:szCs w:val="14"/>
-        </w:rPr>
-        <w:t xml:space="preserve">RK-0003  </w:t>
-      </w:r>
-      <w:r>
-        <w:rPr>
-          <w:sz w:val="22"/>
-          <w:szCs w:val="22"/>
-        </w:rPr>
-        <w:t xml:space="preserve"># Brinquedos: Diversão com Segurança</w:t>
+        <w:t xml:space="preserve">Micro-blog</w:t>
+      </w:r>
+    </w:p>
+    <w:p>
+      <w:pPr>
+        <w:pStyle w:val="Heading2"/>
+        <w:spacing w:after="120" w:before="280"/>
+      </w:pPr>
+      <w:r>
+        <w:rPr>
+          <w:b/>
+          <w:bCs/>
+          <w:sz w:val="26"/>
+          <w:szCs w:val="26"/>
+        </w:rPr>
+        <w:t xml:space="preserve">Como evitar afogamentos de crianças</w:t>
+      </w:r>
+    </w:p>
+    <w:p>
+      <w:pPr>
+        <w:spacing w:after="60" w:before="180"/>
+      </w:pPr>
+      <w:r>
+        <w:rPr>
+          <w:b/>
+          <w:bCs/>
+          <w:color w:val="9AA0A6"/>
+          <w:spacing w:val="20"/>
+          <w:sz w:val="16"/>
+          <w:szCs w:val="16"/>
+        </w:rPr>
+        <w:t xml:space="preserve">RESUMO</w:t>
+      </w:r>
+    </w:p>
+    <w:p>
+      <w:pPr>
+        <w:spacing w:after="160" w:line="300"/>
+      </w:pPr>
+      <w:r>
+        <w:rPr>
+          <w:rFonts w:ascii="Consolas" w:cs="Consolas" w:eastAsia="Consolas" w:hAnsi="Consolas"/>
+          <w:color w:val="9AA0A6"/>
+          <w:sz w:val="14"/>
+          <w:szCs w:val="14"/>
+        </w:rPr>
+        <w:t xml:space="preserve">RK-0015  </w:t>
+      </w:r>
+      <w:r>
+        <w:rPr>
+          <w:sz w:val="22"/>
+          <w:szCs w:val="22"/>
+        </w:rPr>
+        <w:t xml:space="preserve">Riscos silenciosos:</w:t>
       </w:r>
       <w:r>
         <w:rPr>
@@ -497,7 +882,7 @@
           <w:szCs w:val="22"/>
         </w:rPr>
         <w:br/>
-        <w:t xml:space="preserve"/>
+        <w:t xml:space="preserve">• Apenas 3 cm: É a profundidade suficiente para uma criança se afogar em minutos.</w:t>
       </w:r>
       <w:r>
         <w:rPr>
@@ -505,7 +890,7 @@
           <w:szCs w:val="22"/>
         </w:rPr>
         <w:br/>
-        <w:t xml:space="preserve">Ao escolher brinquedos, verifique sempre a classificação etária indicativa. Um brinquedo seguro para uma criança de 7 anos pode ser mortal para uma de 2.</w:t>
+        <w:t xml:space="preserve">• Esvazie: Baldes, bacias e banheiras devem estar sempre vazios após o uso.</w:t>
       </w:r>
       <w:r>
         <w:rPr>
@@ -513,7 +898,7 @@
           <w:szCs w:val="22"/>
         </w:rPr>
         <w:br/>
-        <w:t xml:space="preserve"/>
+        <w:t xml:space="preserve">• Tampe: Mantenha o vaso sanitário sempre fechado e travado.</w:t>
       </w:r>
       <w:r>
         <w:rPr>
@@ -521,7 +906,75 @@
           <w:szCs w:val="22"/>
         </w:rPr>
         <w:br/>
-        <w:t xml:space="preserve">### Pontos de Atenção:</w:t>
+        <w:t xml:space="preserve">• Piscinas: Exigem cerca de pelo menos 1,50 m e portão autotrancante. Supervisão total, mesmo sabendo nadar.</w:t>
+      </w:r>
+    </w:p>
+    <w:p>
+      <w:pPr>
+        <w:spacing w:after="160" w:before="0"/>
+        <w:ind w:left="360"/>
+      </w:pPr>
+      <w:r>
+        <w:rPr>
+          <w:i/>
+          <w:iCs/>
+          <w:color w:val="8A6D00"/>
+          <w:sz w:val="18"/>
+          <w:szCs w:val="18"/>
+        </w:rPr>
+        <w:t xml:space="preserve">ANTES (até 22/10/2026): Riscos silenciosos: / • Apenas 3 cm: É a profundidade suficiente para uma criança se afogar em minutos. / • Esvazie: Baldes, bacias e banheiras devem estar sempre vazios após o uso. / • Tampe: Mantenha o vaso sanitário sempre fechado e travado. / • Piscinas: Exigem cerca de pelo menos 1,20m e portão autotrancante. Supervisão total, mesmo sabendo nadar.</w:t>
+      </w:r>
+    </w:p>
+    <w:p>
+      <w:pPr>
+        <w:pStyle w:val="Heading2"/>
+        <w:spacing w:after="120" w:before="280"/>
+      </w:pPr>
+      <w:r>
+        <w:rPr>
+          <w:b/>
+          <w:bCs/>
+          <w:sz w:val="26"/>
+          <w:szCs w:val="26"/>
+        </w:rPr>
+        <w:t xml:space="preserve">Segurança Aquática para Pets</w:t>
+      </w:r>
+    </w:p>
+    <w:p>
+      <w:pPr>
+        <w:spacing w:after="60" w:before="180"/>
+      </w:pPr>
+      <w:r>
+        <w:rPr>
+          <w:b/>
+          <w:bCs/>
+          <w:color w:val="9AA0A6"/>
+          <w:spacing w:val="20"/>
+          <w:sz w:val="16"/>
+          <w:szCs w:val="16"/>
+        </w:rPr>
+        <w:t xml:space="preserve">RESUMO</w:t>
+      </w:r>
+    </w:p>
+    <w:p>
+      <w:pPr>
+        <w:spacing w:after="160" w:line="300"/>
+      </w:pPr>
+      <w:r>
+        <w:rPr>
+          <w:rFonts w:ascii="Consolas" w:cs="Consolas" w:eastAsia="Consolas" w:hAnsi="Consolas"/>
+          <w:color w:val="9AA0A6"/>
+          <w:sz w:val="14"/>
+          <w:szCs w:val="14"/>
+        </w:rPr>
+        <w:t xml:space="preserve">RK-0016  </w:t>
+      </w:r>
+      <w:r>
+        <w:rPr>
+          <w:sz w:val="22"/>
+          <w:szCs w:val="22"/>
+        </w:rPr>
+        <w:t xml:space="preserve">Nem todo pet sabe nadar:</w:t>
       </w:r>
       <w:r>
         <w:rPr>
@@ -529,7 +982,7 @@
           <w:szCs w:val="22"/>
         </w:rPr>
         <w:br/>
-        <w:t xml:space="preserve">*   **Peças Pequenas:** Risco de ingestão e engasgo para menores de 3 anos.</w:t>
+        <w:t xml:space="preserve">• Exaustão: O pânico em quedas acidentais causa fadiga fatal em minutos.</w:t>
       </w:r>
       <w:r>
         <w:rPr>
@@ -537,7 +990,7 @@
           <w:szCs w:val="22"/>
         </w:rPr>
         <w:br/>
-        <w:t xml:space="preserve">*   **Baterias Botão:** Extremamente perigosas se engolidas (risco de queimadura interna grave). Verifique se o compartimento da bateria é parafusado ou tem uma trava que a criança não consegue abrir.</w:t>
+        <w:t xml:space="preserve">• Barreiras: Cerca de isolamento (pelo menos 1,50 m) ao redor da piscina é uma das melhores defesas.</w:t>
       </w:r>
       <w:r>
         <w:rPr>
@@ -545,7 +998,7 @@
           <w:szCs w:val="22"/>
         </w:rPr>
         <w:br/>
-        <w:t xml:space="preserve">*   **Tintas Tóxicas:** Prefira produtos com {{CERT_SEAL}}.</w:t>
+        <w:t xml:space="preserve">• Rampa: Escadas convencionais são impossíveis para eles. Instale uma "Rampa de Emergência" submersa com superfície antiderrapante.</w:t>
       </w:r>
       <w:r>
         <w:rPr>
@@ -553,327 +1006,7 @@
           <w:szCs w:val="22"/>
         </w:rPr>
         <w:br/>
-        <w:t xml:space="preserve">*   **Barulho Excessivo:** Brinquedos muito barulhentos podem prejudicar a audição sensível da criança.</w:t>
-      </w:r>
-      <w:r>
-        <w:rPr>
-          <w:sz w:val="22"/>
-          <w:szCs w:val="22"/>
-        </w:rPr>
-        <w:br/>
-        <w:t xml:space="preserve">*   **Quebráveis:** Evite materiais que possam estilhaçar (vidro, plástico rígido quebradiço).</w:t>
-      </w:r>
-      <w:r>
-        <w:rPr>
-          <w:sz w:val="22"/>
-          <w:szCs w:val="22"/>
-        </w:rPr>
-        <w:br/>
-        <w:t xml:space="preserve"/>
-      </w:r>
-      <w:r>
-        <w:rPr>
-          <w:sz w:val="22"/>
-          <w:szCs w:val="22"/>
-        </w:rPr>
-        <w:br/>
-        <w:t xml:space="preserve">---</w:t>
-      </w:r>
-      <w:r>
-        <w:rPr>
-          <w:sz w:val="22"/>
-          <w:szCs w:val="22"/>
-        </w:rPr>
-        <w:br/>
-        <w:t xml:space="preserve"/>
-      </w:r>
-      <w:r>
-        <w:rPr>
-          <w:sz w:val="22"/>
-          <w:szCs w:val="22"/>
-        </w:rPr>
-        <w:br/>
-        <w:t xml:space="preserve"># Prevenção de Afogamentos</w:t>
-      </w:r>
-      <w:r>
-        <w:rPr>
-          <w:sz w:val="22"/>
-          <w:szCs w:val="22"/>
-        </w:rPr>
-        <w:br/>
-        <w:t xml:space="preserve"/>
-      </w:r>
-      <w:r>
-        <w:rPr>
-          <w:sz w:val="22"/>
-          <w:szCs w:val="22"/>
-        </w:rPr>
-        <w:br/>
-        <w:t xml:space="preserve">**O Risco Invisível:** O afogamento real é rápido e silencioso. Pode ocorrer em apenas 2,5 cm de água (baldes, bacias, banheiras, tanques e similares), devido ao peso da cabeça dos bebês.</w:t>
-      </w:r>
-      <w:r>
-        <w:rPr>
-          <w:sz w:val="22"/>
-          <w:szCs w:val="22"/>
-        </w:rPr>
-        <w:br/>
-        <w:t xml:space="preserve"/>
-      </w:r>
-      <w:r>
-        <w:rPr>
-          <w:sz w:val="22"/>
-          <w:szCs w:val="22"/>
-        </w:rPr>
-        <w:br/>
-        <w:t xml:space="preserve">**Ação Tática Imediata:** Mantenha barreiras difíceis de transpor (cercas de pelo menos 1,50 m) ao redor de piscinas. Esvazie baldes imediatamente após o uso. Mantenha a tampa do vaso sanitário abaixada e travada.</w:t>
-      </w:r>
-      <w:r>
-        <w:rPr>
-          <w:sz w:val="22"/>
-          <w:szCs w:val="22"/>
-        </w:rPr>
-        <w:br/>
-        <w:t xml:space="preserve"/>
-      </w:r>
-      <w:r>
-        <w:rPr>
-          <w:sz w:val="22"/>
-          <w:szCs w:val="22"/>
-        </w:rPr>
-        <w:br/>
-        <w:t xml:space="preserve">[Acesse o guia de afogamento em preveniremcasa.com.br](https://www.preveniremcasa.com.br)</w:t>
-      </w:r>
-      <w:r>
-        <w:rPr>
-          <w:sz w:val="22"/>
-          <w:szCs w:val="22"/>
-        </w:rPr>
-        <w:br/>
-        <w:t xml:space="preserve"/>
-      </w:r>
-      <w:r>
-        <w:rPr>
-          <w:sz w:val="22"/>
-          <w:szCs w:val="22"/>
-        </w:rPr>
-        <w:br/>
-        <w:t xml:space="preserve">---</w:t>
-      </w:r>
-      <w:r>
-        <w:rPr>
-          <w:sz w:val="22"/>
-          <w:szCs w:val="22"/>
-        </w:rPr>
-        <w:br/>
-        <w:t xml:space="preserve"/>
-      </w:r>
-      <w:r>
-        <w:rPr>
-          <w:sz w:val="22"/>
-          <w:szCs w:val="22"/>
-        </w:rPr>
-        <w:br/>
-        <w:t xml:space="preserve"># Queimaduras em Crianças</w:t>
-      </w:r>
-      <w:r>
-        <w:rPr>
-          <w:sz w:val="22"/>
-          <w:szCs w:val="22"/>
-        </w:rPr>
-        <w:br/>
-        <w:t xml:space="preserve"/>
-      </w:r>
-      <w:r>
-        <w:rPr>
-          <w:sz w:val="22"/>
-          <w:szCs w:val="22"/>
-        </w:rPr>
-        <w:br/>
-        <w:t xml:space="preserve">A pele da criança é muito mais sensível que a do adulto. O que é "quente" para você pode causar queimadura de 3º grau nela.</w:t>
-      </w:r>
-      <w:r>
-        <w:rPr>
-          <w:sz w:val="22"/>
-          <w:szCs w:val="22"/>
-        </w:rPr>
-        <w:br/>
-        <w:t xml:space="preserve"/>
-      </w:r>
-      <w:r>
-        <w:rPr>
-          <w:sz w:val="22"/>
-          <w:szCs w:val="22"/>
-        </w:rPr>
-        <w:br/>
-        <w:t xml:space="preserve">### Dicas Práticas:</w:t>
-      </w:r>
-      <w:r>
-        <w:rPr>
-          <w:sz w:val="22"/>
-          <w:szCs w:val="22"/>
-        </w:rPr>
-        <w:br/>
-        <w:t xml:space="preserve">*   **Banho:** Teste a temperatura da água com o cotovelo ou termômetro digital antes de colocar a criança na água do banho.</w:t>
-      </w:r>
-      <w:r>
-        <w:rPr>
-          <w:sz w:val="22"/>
-          <w:szCs w:val="22"/>
-        </w:rPr>
-        <w:br/>
-        <w:t xml:space="preserve">*   **Cozinha:** Use as bocas de trás do fogão e vire os cabos das panelas para dentro.</w:t>
-      </w:r>
-      <w:r>
-        <w:rPr>
-          <w:sz w:val="22"/>
-          <w:szCs w:val="22"/>
-        </w:rPr>
-        <w:br/>
-        <w:t xml:space="preserve">*   **Toalhas de Mesa:** Evite toalhas longas que a criança possa puxar, derrubando líquidos quentes sobre si.</w:t>
-      </w:r>
-      <w:r>
-        <w:rPr>
-          <w:sz w:val="22"/>
-          <w:szCs w:val="22"/>
-        </w:rPr>
-        <w:br/>
-        <w:t xml:space="preserve">*   **Ferro de Passar:** Nunca deixe o ferro ligado sem supervisão e cuidado com o fio pendurado.</w:t>
-      </w:r>
-      <w:r>
-        <w:rPr>
-          <w:sz w:val="22"/>
-          <w:szCs w:val="22"/>
-        </w:rPr>
-        <w:br/>
-        <w:t xml:space="preserve"/>
-      </w:r>
-      <w:r>
-        <w:rPr>
-          <w:sz w:val="22"/>
-          <w:szCs w:val="22"/>
-        </w:rPr>
-        <w:br/>
-        <w:t xml:space="preserve">---</w:t>
-      </w:r>
-      <w:r>
-        <w:rPr>
-          <w:sz w:val="22"/>
-          <w:szCs w:val="22"/>
-        </w:rPr>
-        <w:br/>
-        <w:t xml:space="preserve"/>
-      </w:r>
-      <w:r>
-        <w:rPr>
-          <w:sz w:val="22"/>
-          <w:szCs w:val="22"/>
-        </w:rPr>
-        <w:br/>
-        <w:t xml:space="preserve"># Corpo Estranho no Nariz</w:t>
-      </w:r>
-      <w:r>
-        <w:rPr>
-          <w:sz w:val="22"/>
-          <w:szCs w:val="22"/>
-        </w:rPr>
-        <w:br/>
-        <w:t xml:space="preserve"/>
-      </w:r>
-      <w:r>
-        <w:rPr>
-          <w:sz w:val="22"/>
-          <w:szCs w:val="22"/>
-        </w:rPr>
-        <w:br/>
-        <w:t xml:space="preserve">Feijão, milho, peças de brinquedo, espuma, pequenos insetos... crianças podem introduzir de tudo no nariz.</w:t>
-      </w:r>
-      <w:r>
-        <w:rPr>
-          <w:sz w:val="22"/>
-          <w:szCs w:val="22"/>
-        </w:rPr>
-        <w:br/>
-        <w:t xml:space="preserve"/>
-      </w:r>
-      <w:r>
-        <w:rPr>
-          <w:sz w:val="22"/>
-          <w:szCs w:val="22"/>
-        </w:rPr>
-        <w:br/>
-        <w:t xml:space="preserve">### Sinais de Alerta:</w:t>
-      </w:r>
-      <w:r>
-        <w:rPr>
-          <w:sz w:val="22"/>
-          <w:szCs w:val="22"/>
-        </w:rPr>
-        <w:br/>
-        <w:t xml:space="preserve">*   Secreção nasal unilateral (apenas de um lado), muitas vezes com mau cheiro.</w:t>
-      </w:r>
-      <w:r>
-        <w:rPr>
-          <w:sz w:val="22"/>
-          <w:szCs w:val="22"/>
-        </w:rPr>
-        <w:br/>
-        <w:t xml:space="preserve">*   Dificuldade de respirar por uma narina.</w:t>
-      </w:r>
-      <w:r>
-        <w:rPr>
-          <w:sz w:val="22"/>
-          <w:szCs w:val="22"/>
-        </w:rPr>
-        <w:br/>
-        <w:t xml:space="preserve">*   Dor ou desconforto no nariz.</w:t>
-      </w:r>
-      <w:r>
-        <w:rPr>
-          <w:sz w:val="22"/>
-          <w:szCs w:val="22"/>
-        </w:rPr>
-        <w:br/>
-        <w:t xml:space="preserve"/>
-      </w:r>
-      <w:r>
-        <w:rPr>
-          <w:sz w:val="22"/>
-          <w:szCs w:val="22"/>
-        </w:rPr>
-        <w:br/>
-        <w:t xml:space="preserve">### O que fazer (e NÃO fazer):</w:t>
-      </w:r>
-      <w:r>
-        <w:rPr>
-          <w:sz w:val="22"/>
-          <w:szCs w:val="22"/>
-        </w:rPr>
-        <w:br/>
-        <w:t xml:space="preserve">*   **NÃO** tente retirar com pinça ou cotonete se não estiver muito visível e fácil — você pode empurrar mais para dentro.</w:t>
-      </w:r>
-      <w:r>
-        <w:rPr>
-          <w:sz w:val="22"/>
-          <w:szCs w:val="22"/>
-        </w:rPr>
-        <w:br/>
-        <w:t xml:space="preserve">*   **Se você NÃO sabe o que é o objeto:** incentive a criança a assoar o nariz tapando a narina livre.</w:t>
-      </w:r>
-      <w:r>
-        <w:rPr>
-          <w:sz w:val="22"/>
-          <w:szCs w:val="22"/>
-        </w:rPr>
-        <w:br/>
-        <w:t xml:space="preserve">*   **SE FOR UMA BATERIA BOTÃO (pila moeda): NÃO tente nenhuma manobra.** Vá **IMEDIATAMENTE** ao Pronto-Socorro. Cada minuto conta. A queimadura química interna começa em minutos e pode ser fatal. (Fonte: CIATOX/SBP 2023)</w:t>
-      </w:r>
-      <w:r>
-        <w:rPr>
-          <w:sz w:val="22"/>
-          <w:szCs w:val="22"/>
-        </w:rPr>
-        <w:br/>
-        <w:t xml:space="preserve">*   Para qualquer outro objeto: procure o PS se não sair facilmente com o assoar.</w:t>
+        <w:t xml:space="preserve">Treine seu cão para saber onde fica a saída.</w:t>
       </w:r>
     </w:p>
     <w:p>
@@ -889,211 +1022,7 @@
           <w:sz w:val="18"/>
           <w:szCs w:val="18"/>
         </w:rPr>
-        <w:t xml:space="preserve">ANTES (até 22/10/2026): # Brinquedos: Diversão com Segurança /  / Ao escolher brinquedos, verifique sempre a classificação etária indicativa. Um brinquedo seguro para uma criança de 7 anos pode ser mortal para uma de 2. /  / ### Pontos de Atenção: / *   **Peças Pequenas:** Risco de ingestão e engasgo para menores de 3 anos. / *   **Baterias Botão:** Extremamente perigosas se engolidas (risco de queimadura interna grave). Verifique se o compartimento da bateria é parafusado. / *   **Tintas Tóxicas:** Prefira produtos com {{CERT_SEAL}}. / *   **Barulho Excessivo:** Brinquedos muito barulhentos podem prejudicar a audição sensível da criança. / *   **Quebráveis:** Evite materiais que possam estilhaçar (vidro, plástico rígido quebradiço). /  / --- /  / # Prevenção de Afogamentos /  / **O Risco Invisível:** O afogamento real é rápido e silencioso. Pode ocorrer em apenas 2,5 cm de água (baldes, bacias, banheiras, tanques e similares), devido ao peso da cabeça dos bebês. /  / **Ação Tática Imediata:** Mantenha barreiras intransponíveis (cercas de 1,5m) ao redor de piscinas. Esvazie baldes imediatamente após o uso. Mantenha a tampa do vaso sanitário abaixada e travada. /  / [Acesse o guia de afogamento em preveniremcasa.com.br](https://www.preveniremcasa.com.br) /  / --- /  / # Queimaduras em Crianças /  / A pele da criança é muito mais sensível que a do adulto. O que é "quente" para você pode causar queimadura de 3º grau nela. /  / ### Dicas Práticas: / *   **Banho:** Teste a temperatura da água com o cotovelo ou termômetro digital antes de colocar a criança na água do banho. / *   **Cozinha:** Use as bocas de trás do fogão e vire os cabos das panelas para dentro. / *   **Toalhas de Mesa:** Evite toalhas longas que a criança possa puxar, derrubando líquidos quentes sobre si. / *   **Ferro de Passar:** Nunca deixe o ferro ligado sem supervisão e cuidado com o fio pendurado. /  / --- /  / # Corpo Estranho no Nariz /  / Feijão, milho, peças de brinquedo, espuma, pequenos insetos... crianças podem introduzir de tudo no nariz. /  / ### Sinais de Alerta: / *   Secreção nasal unilateral (apenas de um lado), muitas vezes com mau cheiro. / *   Dificuldade de respirar por uma narina. / *   Dor ou desconforto no nariz. /  / ### O que fazer (e NÃO fazer): / *   **NÃO** tente retirar com pinça ou cotonete se não estiver muito visível e fácil — você pode empurrar mais para dentro. / *   **Se você NÃO sabe o que é o objeto:** incentive a criança a assoar o nariz tapando a narina livre. / *   **SE FOR UMA BATERIA BOTÃO (pila moeda): NÃO tente nenhuma manobra.** Vá **IMEDIATAMENTE** ao Pronto-Socorro. Cada minuto conta. A queimadura química interna começa em minutos e pode ser fatal. (Fonte: CIATOX/SBP 2023) / *   Para qualquer outro objeto: procure o PS se não sair facilmente com o assoar.</w:t>
-      </w:r>
-    </w:p>
-    <w:p>
-      <w:pPr>
-        <w:pStyle w:val="Heading2"/>
-        <w:spacing w:after="120" w:before="280"/>
-      </w:pPr>
-      <w:r>
-        <w:rPr>
-          <w:b/>
-          <w:bCs/>
-          <w:sz w:val="26"/>
-          <w:szCs w:val="26"/>
-        </w:rPr>
-        <w:t xml:space="preserve">Crianças (6 a 14 anos)</w:t>
-      </w:r>
-    </w:p>
-    <w:p>
-      <w:pPr>
-        <w:spacing w:after="160" w:line="300"/>
-      </w:pPr>
-      <w:r>
-        <w:rPr>
-          <w:rFonts w:ascii="Consolas" w:cs="Consolas" w:eastAsia="Consolas" w:hAnsi="Consolas"/>
-          <w:color w:val="9AA0A6"/>
-          <w:sz w:val="14"/>
-          <w:szCs w:val="14"/>
-        </w:rPr>
-        <w:t xml:space="preserve">RK-0004  </w:t>
-      </w:r>
-      <w:r>
-        <w:rPr>
-          <w:sz w:val="22"/>
-          <w:szCs w:val="22"/>
-        </w:rPr>
-        <w:t xml:space="preserve"># Brinquedos: Diversão com Segurança</w:t>
-      </w:r>
-      <w:r>
-        <w:rPr>
-          <w:sz w:val="22"/>
-          <w:szCs w:val="22"/>
-        </w:rPr>
-        <w:br/>
-        <w:t xml:space="preserve"/>
-      </w:r>
-      <w:r>
-        <w:rPr>
-          <w:sz w:val="22"/>
-          <w:szCs w:val="22"/>
-        </w:rPr>
-        <w:br/>
-        <w:t xml:space="preserve">Ao escolher brinquedos, verifique sempre a classificação etária indicativa. Um brinquedo seguro para uma criança de 7 anos pode ser mortal para uma de 2.</w:t>
-      </w:r>
-      <w:r>
-        <w:rPr>
-          <w:sz w:val="22"/>
-          <w:szCs w:val="22"/>
-        </w:rPr>
-        <w:br/>
-        <w:t xml:space="preserve"/>
-      </w:r>
-      <w:r>
-        <w:rPr>
-          <w:sz w:val="22"/>
-          <w:szCs w:val="22"/>
-        </w:rPr>
-        <w:br/>
-        <w:t xml:space="preserve">### Pontos de Atenção:</w:t>
-      </w:r>
-      <w:r>
-        <w:rPr>
-          <w:sz w:val="22"/>
-          <w:szCs w:val="22"/>
-        </w:rPr>
-        <w:br/>
-        <w:t xml:space="preserve">*   **Peças Pequenas:** Risco de ingestão e engasgo para menores de 3 anos.</w:t>
-      </w:r>
-      <w:r>
-        <w:rPr>
-          <w:sz w:val="22"/>
-          <w:szCs w:val="22"/>
-        </w:rPr>
-        <w:br/>
-        <w:t xml:space="preserve">*   **Baterias Botão:** Extremamente perigosas se engolidas (risco de queimadura interna grave). Verifique se o compartimento da bateria é parafusado ou tem uma trava que a criança não consegue abrir.</w:t>
-      </w:r>
-      <w:r>
-        <w:rPr>
-          <w:sz w:val="22"/>
-          <w:szCs w:val="22"/>
-        </w:rPr>
-        <w:br/>
-        <w:t xml:space="preserve">*   **Tintas Tóxicas:** Prefira produtos com {{CERT_SEAL}}.</w:t>
-      </w:r>
-      <w:r>
-        <w:rPr>
-          <w:sz w:val="22"/>
-          <w:szCs w:val="22"/>
-        </w:rPr>
-        <w:br/>
-        <w:t xml:space="preserve">*   **Barulho Excessivo:** Brinquedos muito barulhentos podem prejudicar a audição sensível da criança.</w:t>
-      </w:r>
-      <w:r>
-        <w:rPr>
-          <w:sz w:val="22"/>
-          <w:szCs w:val="22"/>
-        </w:rPr>
-        <w:br/>
-        <w:t xml:space="preserve">*   **Quebráveis:** Evite materiais que possam estilhaçar (vidro, plástico rígido quebradiço).</w:t>
-      </w:r>
-      <w:r>
-        <w:rPr>
-          <w:sz w:val="22"/>
-          <w:szCs w:val="22"/>
-        </w:rPr>
-        <w:br/>
-        <w:t xml:space="preserve"/>
-      </w:r>
-      <w:r>
-        <w:rPr>
-          <w:sz w:val="22"/>
-          <w:szCs w:val="22"/>
-        </w:rPr>
-        <w:br/>
-        <w:t xml:space="preserve">---</w:t>
-      </w:r>
-      <w:r>
-        <w:rPr>
-          <w:sz w:val="22"/>
-          <w:szCs w:val="22"/>
-        </w:rPr>
-        <w:br/>
-        <w:t xml:space="preserve"/>
-      </w:r>
-      <w:r>
-        <w:rPr>
-          <w:sz w:val="22"/>
-          <w:szCs w:val="22"/>
-        </w:rPr>
-        <w:br/>
-        <w:t xml:space="preserve"># Prevenção de Afogamentos</w:t>
-      </w:r>
-      <w:r>
-        <w:rPr>
-          <w:sz w:val="22"/>
-          <w:szCs w:val="22"/>
-        </w:rPr>
-        <w:br/>
-        <w:t xml:space="preserve"/>
-      </w:r>
-      <w:r>
-        <w:rPr>
-          <w:sz w:val="22"/>
-          <w:szCs w:val="22"/>
-        </w:rPr>
-        <w:br/>
-        <w:t xml:space="preserve">**O Risco Invisível:** O afogamento real é rápido e silencioso. Pode ocorrer em apenas 2,5 cm de água (baldes, bacias, banheiras, tanques e similares), devido ao peso da cabeça dos bebês.</w:t>
-      </w:r>
-      <w:r>
-        <w:rPr>
-          <w:sz w:val="22"/>
-          <w:szCs w:val="22"/>
-        </w:rPr>
-        <w:br/>
-        <w:t xml:space="preserve"/>
-      </w:r>
-      <w:r>
-        <w:rPr>
-          <w:sz w:val="22"/>
-          <w:szCs w:val="22"/>
-        </w:rPr>
-        <w:br/>
-        <w:t xml:space="preserve">**Ação Tática Imediata:** Mantenha barreiras difíceis de transpor (cercas de pelo menos 1,50 m) ao redor de piscinas. Esvazie baldes imediatamente após o uso. Mantenha a tampa do vaso sanitário abaixada e travada.</w:t>
-      </w:r>
-      <w:r>
-        <w:rPr>
-          <w:sz w:val="22"/>
-          <w:szCs w:val="22"/>
-        </w:rPr>
-        <w:br/>
-        <w:t xml:space="preserve"/>
-      </w:r>
-      <w:r>
-        <w:rPr>
-          <w:sz w:val="22"/>
-          <w:szCs w:val="22"/>
-        </w:rPr>
-        <w:br/>
-        <w:t xml:space="preserve">[Acesse o guia de afogamento em preveniremcasa.com.br](https://www.preveniremcasa.com.br)</w:t>
-      </w:r>
-    </w:p>
-    <w:p>
-      <w:pPr>
-        <w:spacing w:after="160" w:before="0"/>
-        <w:ind w:left="360"/>
-      </w:pPr>
-      <w:r>
-        <w:rPr>
-          <w:i/>
-          <w:iCs/>
-          <w:color w:val="8A6D00"/>
-          <w:sz w:val="18"/>
-          <w:szCs w:val="18"/>
-        </w:rPr>
-        <w:t xml:space="preserve">ANTES (até 22/10/2026): # Brinquedos: Diversão com Segurança /  / Ao escolher brinquedos, verifique sempre a classificação etária indicativa. Um brinquedo seguro para uma criança de 7 anos pode ser mortal para uma de 2. /  / ### Pontos de Atenção: / *   **Peças Pequenas:** Risco de ingestão e engasgo para menores de 3 anos. / *   **Baterias Botão:** Extremamente perigosas se engolidas (risco de queimadura interna grave). Verifique se o compartimento da bateria é parafusado. / *   **Tintas Tóxicas:** Prefira produtos com {{CERT_SEAL}}. / *   **Barulho Excessivo:** Brinquedos muito barulhentos podem prejudicar a audição sensível da criança. / *   **Quebráveis:** Evite materiais que possam estilhaçar (vidro, plástico rígido quebradiço). /  / --- /  / # Prevenção de Afogamentos /  / **O Risco Invisível:** O afogamento real é rápido e silencioso. Pode ocorrer em apenas 2,5 cm de água (baldes, bacias, banheiras, tanques e similares), devido ao peso da cabeça dos bebês. /  / **Ação Tática Imediata:** Mantenha barreiras que sejam intransponíveis (cercas de 1,5m) ao redor de piscinas. Esvazie baldes imediatamente após o uso. Mantenha a tampa do vaso sanitário abaixada e travada. /  / [Acesse o guia de afogamento em preveniremcasa.com.br](https://www.preveniremcasa.com.br)</w:t>
+        <w:t xml:space="preserve">ANTES (até 22/10/2026): Nem todo pet sabe nadar: / • Exaustão: O pânico em quedas acidentais causa fadiga fatal em minutos. / • Barreiras: Cerca de isolamento (1,20m) ao redor da piscina é a melhor defesa. / • Rampa: Escadas convencionais são impossíveis para eles. Instale uma "Rampa de Emergência" submersa com superfície antiderrapante. / Treine seu cão para saber onde fica a saída.</w:t>
       </w:r>
     </w:p>
     <w:p>
@@ -1110,28 +1039,427 @@
           <w:sz w:val="34"/>
           <w:szCs w:val="34"/>
         </w:rPr>
-        <w:t xml:space="preserve">Guias educativos</w:t>
-      </w:r>
-    </w:p>
-    <w:p>
-      <w:pPr>
-        <w:spacing w:after="160" w:line="300"/>
-      </w:pPr>
-      <w:r>
-        <w:rPr>
-          <w:rFonts w:ascii="Consolas" w:cs="Consolas" w:eastAsia="Consolas" w:hAnsi="Consolas"/>
-          <w:color w:val="9AA0A6"/>
-          <w:sz w:val="14"/>
-          <w:szCs w:val="14"/>
-        </w:rPr>
-        <w:t xml:space="preserve">RK-0005  </w:t>
-      </w:r>
-      <w:r>
-        <w:rPr>
-          <w:sz w:val="22"/>
-          <w:szCs w:val="22"/>
-        </w:rPr>
-        <w:t xml:space="preserve">Piscina precisa de cerca alta (pelo menos 1,50 m) e portão que tranca sozinho para nenhuma criança entrar sem querer. Use ralos que não sugam o cabelo. E escolha um adulto para vigiar os pequenos o tempo todo — sem celular nem distrações.</w:t>
+        <w:t xml:space="preserve">Fases da vida</w:t>
+      </w:r>
+    </w:p>
+    <w:p>
+      <w:pPr>
+        <w:pStyle w:val="Heading2"/>
+        <w:spacing w:after="120" w:before="280"/>
+      </w:pPr>
+      <w:r>
+        <w:rPr>
+          <w:b/>
+          <w:bCs/>
+          <w:sz w:val="26"/>
+          <w:szCs w:val="26"/>
+        </w:rPr>
+        <w:t xml:space="preserve">Crianças (3-12 anos)</w:t>
+      </w:r>
+    </w:p>
+    <w:p>
+      <w:pPr>
+        <w:spacing w:after="160" w:line="300"/>
+      </w:pPr>
+      <w:r>
+        <w:rPr>
+          <w:rFonts w:ascii="Consolas" w:cs="Consolas" w:eastAsia="Consolas" w:hAnsi="Consolas"/>
+          <w:color w:val="9AA0A6"/>
+          <w:sz w:val="14"/>
+          <w:szCs w:val="14"/>
+        </w:rPr>
+        <w:t xml:space="preserve">RK-0017  </w:t>
+      </w:r>
+      <w:r>
+        <w:rPr>
+          <w:sz w:val="22"/>
+          <w:szCs w:val="22"/>
+        </w:rPr>
+        <w:t xml:space="preserve"># Brinquedos: Diversão com Segurança</w:t>
+      </w:r>
+      <w:r>
+        <w:rPr>
+          <w:sz w:val="22"/>
+          <w:szCs w:val="22"/>
+        </w:rPr>
+        <w:br/>
+        <w:t xml:space="preserve"/>
+      </w:r>
+      <w:r>
+        <w:rPr>
+          <w:sz w:val="22"/>
+          <w:szCs w:val="22"/>
+        </w:rPr>
+        <w:br/>
+        <w:t xml:space="preserve">Ao escolher brinquedos, verifique sempre a classificação etária indicativa. Um brinquedo seguro para uma criança de 7 anos pode ser mortal para uma de 2.</w:t>
+      </w:r>
+      <w:r>
+        <w:rPr>
+          <w:sz w:val="22"/>
+          <w:szCs w:val="22"/>
+        </w:rPr>
+        <w:br/>
+        <w:t xml:space="preserve"/>
+      </w:r>
+      <w:r>
+        <w:rPr>
+          <w:sz w:val="22"/>
+          <w:szCs w:val="22"/>
+        </w:rPr>
+        <w:br/>
+        <w:t xml:space="preserve">### Pontos de Atenção:</w:t>
+      </w:r>
+      <w:r>
+        <w:rPr>
+          <w:sz w:val="22"/>
+          <w:szCs w:val="22"/>
+        </w:rPr>
+        <w:br/>
+        <w:t xml:space="preserve">*   **Peças Pequenas:** Risco de ingestão e engasgo para menores de 3 anos.</w:t>
+      </w:r>
+      <w:r>
+        <w:rPr>
+          <w:sz w:val="22"/>
+          <w:szCs w:val="22"/>
+        </w:rPr>
+        <w:br/>
+        <w:t xml:space="preserve">*   **Baterias Botão:** Extremamente perigosas se engolidas (risco de queimadura interna grave). Verifique se o compartimento da bateria é parafusado ou tem uma trava que a criança não consegue abrir.</w:t>
+      </w:r>
+      <w:r>
+        <w:rPr>
+          <w:sz w:val="22"/>
+          <w:szCs w:val="22"/>
+        </w:rPr>
+        <w:br/>
+        <w:t xml:space="preserve">*   **Tintas Tóxicas:** Prefira produtos com {{CERT_SEAL}}.</w:t>
+      </w:r>
+      <w:r>
+        <w:rPr>
+          <w:sz w:val="22"/>
+          <w:szCs w:val="22"/>
+        </w:rPr>
+        <w:br/>
+        <w:t xml:space="preserve">*   **Barulho Excessivo:** Brinquedos muito barulhentos podem prejudicar a audição sensível da criança.</w:t>
+      </w:r>
+      <w:r>
+        <w:rPr>
+          <w:sz w:val="22"/>
+          <w:szCs w:val="22"/>
+        </w:rPr>
+        <w:br/>
+        <w:t xml:space="preserve">*   **Quebráveis:** Evite materiais que possam estilhaçar (vidro, plástico rígido quebradiço).</w:t>
+      </w:r>
+      <w:r>
+        <w:rPr>
+          <w:sz w:val="22"/>
+          <w:szCs w:val="22"/>
+        </w:rPr>
+        <w:br/>
+        <w:t xml:space="preserve"/>
+      </w:r>
+      <w:r>
+        <w:rPr>
+          <w:sz w:val="22"/>
+          <w:szCs w:val="22"/>
+        </w:rPr>
+        <w:br/>
+        <w:t xml:space="preserve">---</w:t>
+      </w:r>
+      <w:r>
+        <w:rPr>
+          <w:sz w:val="22"/>
+          <w:szCs w:val="22"/>
+        </w:rPr>
+        <w:br/>
+        <w:t xml:space="preserve"/>
+      </w:r>
+      <w:r>
+        <w:rPr>
+          <w:sz w:val="22"/>
+          <w:szCs w:val="22"/>
+        </w:rPr>
+        <w:br/>
+        <w:t xml:space="preserve"># Prevenção de Afogamentos</w:t>
+      </w:r>
+      <w:r>
+        <w:rPr>
+          <w:sz w:val="22"/>
+          <w:szCs w:val="22"/>
+        </w:rPr>
+        <w:br/>
+        <w:t xml:space="preserve"/>
+      </w:r>
+      <w:r>
+        <w:rPr>
+          <w:sz w:val="22"/>
+          <w:szCs w:val="22"/>
+        </w:rPr>
+        <w:br/>
+        <w:t xml:space="preserve">**O Risco Invisível:** O afogamento real é rápido e silencioso. Pode ocorrer em apenas 2,5 cm de água (baldes, bacias, banheiras, tanques e similares), devido ao peso da cabeça dos bebês.</w:t>
+      </w:r>
+      <w:r>
+        <w:rPr>
+          <w:sz w:val="22"/>
+          <w:szCs w:val="22"/>
+        </w:rPr>
+        <w:br/>
+        <w:t xml:space="preserve"/>
+      </w:r>
+      <w:r>
+        <w:rPr>
+          <w:sz w:val="22"/>
+          <w:szCs w:val="22"/>
+        </w:rPr>
+        <w:br/>
+        <w:t xml:space="preserve">**Ação Tática Imediata:** Mantenha barreiras difíceis de transpor (cercas de pelo menos 1,50 m) ao redor de piscinas. Esvazie baldes imediatamente após o uso. Mantenha a tampa do vaso sanitário abaixada e travada.</w:t>
+      </w:r>
+      <w:r>
+        <w:rPr>
+          <w:sz w:val="22"/>
+          <w:szCs w:val="22"/>
+        </w:rPr>
+        <w:br/>
+        <w:t xml:space="preserve"/>
+      </w:r>
+      <w:r>
+        <w:rPr>
+          <w:sz w:val="22"/>
+          <w:szCs w:val="22"/>
+        </w:rPr>
+        <w:br/>
+        <w:t xml:space="preserve">[Acesse o guia de afogamento em preveniremcasa.com.br](https://www.preveniremcasa.com.br)</w:t>
+      </w:r>
+      <w:r>
+        <w:rPr>
+          <w:sz w:val="22"/>
+          <w:szCs w:val="22"/>
+        </w:rPr>
+        <w:br/>
+        <w:t xml:space="preserve"/>
+      </w:r>
+      <w:r>
+        <w:rPr>
+          <w:sz w:val="22"/>
+          <w:szCs w:val="22"/>
+        </w:rPr>
+        <w:br/>
+        <w:t xml:space="preserve">---</w:t>
+      </w:r>
+      <w:r>
+        <w:rPr>
+          <w:sz w:val="22"/>
+          <w:szCs w:val="22"/>
+        </w:rPr>
+        <w:br/>
+        <w:t xml:space="preserve"/>
+      </w:r>
+      <w:r>
+        <w:rPr>
+          <w:sz w:val="22"/>
+          <w:szCs w:val="22"/>
+        </w:rPr>
+        <w:br/>
+        <w:t xml:space="preserve"># Queimaduras em Crianças</w:t>
+      </w:r>
+      <w:r>
+        <w:rPr>
+          <w:sz w:val="22"/>
+          <w:szCs w:val="22"/>
+        </w:rPr>
+        <w:br/>
+        <w:t xml:space="preserve"/>
+      </w:r>
+      <w:r>
+        <w:rPr>
+          <w:sz w:val="22"/>
+          <w:szCs w:val="22"/>
+        </w:rPr>
+        <w:br/>
+        <w:t xml:space="preserve">A pele da criança é muito mais sensível que a do adulto. O que é "quente" para você pode causar queimadura de 3º grau nela.</w:t>
+      </w:r>
+      <w:r>
+        <w:rPr>
+          <w:sz w:val="22"/>
+          <w:szCs w:val="22"/>
+        </w:rPr>
+        <w:br/>
+        <w:t xml:space="preserve"/>
+      </w:r>
+      <w:r>
+        <w:rPr>
+          <w:sz w:val="22"/>
+          <w:szCs w:val="22"/>
+        </w:rPr>
+        <w:br/>
+        <w:t xml:space="preserve">### Dicas Práticas:</w:t>
+      </w:r>
+      <w:r>
+        <w:rPr>
+          <w:sz w:val="22"/>
+          <w:szCs w:val="22"/>
+        </w:rPr>
+        <w:br/>
+        <w:t xml:space="preserve">*   **Banho:** Teste a temperatura da água com o cotovelo ou termômetro digital antes de colocar a criança na água do banho.</w:t>
+      </w:r>
+      <w:r>
+        <w:rPr>
+          <w:sz w:val="22"/>
+          <w:szCs w:val="22"/>
+        </w:rPr>
+        <w:br/>
+        <w:t xml:space="preserve">*   **Cozinha:** Use as bocas de trás do fogão e vire os cabos das panelas para dentro.</w:t>
+      </w:r>
+      <w:r>
+        <w:rPr>
+          <w:sz w:val="22"/>
+          <w:szCs w:val="22"/>
+        </w:rPr>
+        <w:br/>
+        <w:t xml:space="preserve">*   **Toalhas de Mesa:** Evite toalhas longas que a criança possa puxar, derrubando líquidos quentes sobre si.</w:t>
+      </w:r>
+      <w:r>
+        <w:rPr>
+          <w:sz w:val="22"/>
+          <w:szCs w:val="22"/>
+        </w:rPr>
+        <w:br/>
+        <w:t xml:space="preserve">*   **Ferro de Passar:** Nunca deixe o ferro ligado sem supervisão e cuidado com o fio pendurado.</w:t>
+      </w:r>
+      <w:r>
+        <w:rPr>
+          <w:sz w:val="22"/>
+          <w:szCs w:val="22"/>
+        </w:rPr>
+        <w:br/>
+        <w:t xml:space="preserve"/>
+      </w:r>
+      <w:r>
+        <w:rPr>
+          <w:sz w:val="22"/>
+          <w:szCs w:val="22"/>
+        </w:rPr>
+        <w:br/>
+        <w:t xml:space="preserve">---</w:t>
+      </w:r>
+      <w:r>
+        <w:rPr>
+          <w:sz w:val="22"/>
+          <w:szCs w:val="22"/>
+        </w:rPr>
+        <w:br/>
+        <w:t xml:space="preserve"/>
+      </w:r>
+      <w:r>
+        <w:rPr>
+          <w:sz w:val="22"/>
+          <w:szCs w:val="22"/>
+        </w:rPr>
+        <w:br/>
+        <w:t xml:space="preserve"># Corpo Estranho no Nariz</w:t>
+      </w:r>
+      <w:r>
+        <w:rPr>
+          <w:sz w:val="22"/>
+          <w:szCs w:val="22"/>
+        </w:rPr>
+        <w:br/>
+        <w:t xml:space="preserve"/>
+      </w:r>
+      <w:r>
+        <w:rPr>
+          <w:sz w:val="22"/>
+          <w:szCs w:val="22"/>
+        </w:rPr>
+        <w:br/>
+        <w:t xml:space="preserve">Feijão, milho, peças de brinquedo, espuma, pequenos insetos... crianças podem introduzir de tudo no nariz.</w:t>
+      </w:r>
+      <w:r>
+        <w:rPr>
+          <w:sz w:val="22"/>
+          <w:szCs w:val="22"/>
+        </w:rPr>
+        <w:br/>
+        <w:t xml:space="preserve"/>
+      </w:r>
+      <w:r>
+        <w:rPr>
+          <w:sz w:val="22"/>
+          <w:szCs w:val="22"/>
+        </w:rPr>
+        <w:br/>
+        <w:t xml:space="preserve">### Sinais de Alerta:</w:t>
+      </w:r>
+      <w:r>
+        <w:rPr>
+          <w:sz w:val="22"/>
+          <w:szCs w:val="22"/>
+        </w:rPr>
+        <w:br/>
+        <w:t xml:space="preserve">*   Secreção nasal unilateral (apenas de um lado), muitas vezes com mau cheiro.</w:t>
+      </w:r>
+      <w:r>
+        <w:rPr>
+          <w:sz w:val="22"/>
+          <w:szCs w:val="22"/>
+        </w:rPr>
+        <w:br/>
+        <w:t xml:space="preserve">*   Dificuldade de respirar por uma narina.</w:t>
+      </w:r>
+      <w:r>
+        <w:rPr>
+          <w:sz w:val="22"/>
+          <w:szCs w:val="22"/>
+        </w:rPr>
+        <w:br/>
+        <w:t xml:space="preserve">*   Dor ou desconforto no nariz.</w:t>
+      </w:r>
+      <w:r>
+        <w:rPr>
+          <w:sz w:val="22"/>
+          <w:szCs w:val="22"/>
+        </w:rPr>
+        <w:br/>
+        <w:t xml:space="preserve"/>
+      </w:r>
+      <w:r>
+        <w:rPr>
+          <w:sz w:val="22"/>
+          <w:szCs w:val="22"/>
+        </w:rPr>
+        <w:br/>
+        <w:t xml:space="preserve">### O que fazer (e NÃO fazer):</w:t>
+      </w:r>
+      <w:r>
+        <w:rPr>
+          <w:sz w:val="22"/>
+          <w:szCs w:val="22"/>
+        </w:rPr>
+        <w:br/>
+        <w:t xml:space="preserve">*   **NÃO** tente retirar com pinça ou cotonete se não estiver muito visível e fácil — você pode empurrar mais para dentro.</w:t>
+      </w:r>
+      <w:r>
+        <w:rPr>
+          <w:sz w:val="22"/>
+          <w:szCs w:val="22"/>
+        </w:rPr>
+        <w:br/>
+        <w:t xml:space="preserve">*   **Se você NÃO sabe o que é o objeto:** incentive a criança a assoar o nariz tapando a narina livre.</w:t>
+      </w:r>
+      <w:r>
+        <w:rPr>
+          <w:sz w:val="22"/>
+          <w:szCs w:val="22"/>
+        </w:rPr>
+        <w:br/>
+        <w:t xml:space="preserve">*   **SE FOR UMA BATERIA BOTÃO (pila moeda): NÃO tente nenhuma manobra.** Vá **IMEDIATAMENTE** ao Pronto-Socorro. Cada minuto conta. A queimadura química interna começa em minutos e pode ser fatal. (Fonte: CIATOX/SBP 2023)</w:t>
+      </w:r>
+      <w:r>
+        <w:rPr>
+          <w:sz w:val="22"/>
+          <w:szCs w:val="22"/>
+        </w:rPr>
+        <w:br/>
+        <w:t xml:space="preserve">*   Para qualquer outro objeto: procure o PS se não sair facilmente com o assoar.</w:t>
       </w:r>
     </w:p>
     <w:p>
@@ -1147,7 +1475,211 @@
           <w:sz w:val="18"/>
           <w:szCs w:val="18"/>
         </w:rPr>
-        <w:t xml:space="preserve">ANTES (até 22/10/2026): Piscina precisa de cerca alta (pelo menos 1,20m) e portão que tranca sozinho para nenhuma criança entrar sem querer. Use ralos que não sugam o cabelo. E escolha um adulto para vigiar os pequenos o tempo todo — sem celular nem distrações.</w:t>
+        <w:t xml:space="preserve">ANTES (até 22/10/2026): # Brinquedos: Diversão com Segurança /  / Ao escolher brinquedos, verifique sempre a classificação etária indicativa. Um brinquedo seguro para uma criança de 7 anos pode ser mortal para uma de 2. /  / ### Pontos de Atenção: / *   **Peças Pequenas:** Risco de ingestão e engasgo para menores de 3 anos. / *   **Baterias Botão:** Extremamente perigosas se engolidas (risco de queimadura interna grave). Verifique se o compartimento da bateria é parafusado. / *   **Tintas Tóxicas:** Prefira produtos com {{CERT_SEAL}}. / *   **Barulho Excessivo:** Brinquedos muito barulhentos podem prejudicar a audição sensível da criança. / *   **Quebráveis:** Evite materiais que possam estilhaçar (vidro, plástico rígido quebradiço). /  / --- /  / # Prevenção de Afogamentos /  / **O Risco Invisível:** O afogamento real é rápido e silencioso. Pode ocorrer em apenas 2,5 cm de água (baldes, bacias, banheiras, tanques e similares), devido ao peso da cabeça dos bebês. /  / **Ação Tática Imediata:** Mantenha barreiras intransponíveis (cercas de 1,5m) ao redor de piscinas. Esvazie baldes imediatamente após o uso. Mantenha a tampa do vaso sanitário abaixada e travada. /  / [Acesse o guia de afogamento em preveniremcasa.com.br](https://www.preveniremcasa.com.br) /  / --- /  / # Queimaduras em Crianças /  / A pele da criança é muito mais sensível que a do adulto. O que é "quente" para você pode causar queimadura de 3º grau nela. /  / ### Dicas Práticas: / *   **Banho:** Teste a temperatura da água com o cotovelo ou termômetro digital antes de colocar a criança na água do banho. / *   **Cozinha:** Use as bocas de trás do fogão e vire os cabos das panelas para dentro. / *   **Toalhas de Mesa:** Evite toalhas longas que a criança possa puxar, derrubando líquidos quentes sobre si. / *   **Ferro de Passar:** Nunca deixe o ferro ligado sem supervisão e cuidado com o fio pendurado. /  / --- /  / # Corpo Estranho no Nariz /  / Feijão, milho, peças de brinquedo, espuma, pequenos insetos... crianças podem introduzir de tudo no nariz. /  / ### Sinais de Alerta: / *   Secreção nasal unilateral (apenas de um lado), muitas vezes com mau cheiro. / *   Dificuldade de respirar por uma narina. / *   Dor ou desconforto no nariz. /  / ### O que fazer (e NÃO fazer): / *   **NÃO** tente retirar com pinça ou cotonete se não estiver muito visível e fácil — você pode empurrar mais para dentro. / *   **Se você NÃO sabe o que é o objeto:** incentive a criança a assoar o nariz tapando a narina livre. / *   **SE FOR UMA BATERIA BOTÃO (pila moeda): NÃO tente nenhuma manobra.** Vá **IMEDIATAMENTE** ao Pronto-Socorro. Cada minuto conta. A queimadura química interna começa em minutos e pode ser fatal. (Fonte: CIATOX/SBP 2023) / *   Para qualquer outro objeto: procure o PS se não sair facilmente com o assoar.</w:t>
+      </w:r>
+    </w:p>
+    <w:p>
+      <w:pPr>
+        <w:pStyle w:val="Heading2"/>
+        <w:spacing w:after="120" w:before="280"/>
+      </w:pPr>
+      <w:r>
+        <w:rPr>
+          <w:b/>
+          <w:bCs/>
+          <w:sz w:val="26"/>
+          <w:szCs w:val="26"/>
+        </w:rPr>
+        <w:t xml:space="preserve">Crianças (6 a 14 anos)</w:t>
+      </w:r>
+    </w:p>
+    <w:p>
+      <w:pPr>
+        <w:spacing w:after="160" w:line="300"/>
+      </w:pPr>
+      <w:r>
+        <w:rPr>
+          <w:rFonts w:ascii="Consolas" w:cs="Consolas" w:eastAsia="Consolas" w:hAnsi="Consolas"/>
+          <w:color w:val="9AA0A6"/>
+          <w:sz w:val="14"/>
+          <w:szCs w:val="14"/>
+        </w:rPr>
+        <w:t xml:space="preserve">RK-0018  </w:t>
+      </w:r>
+      <w:r>
+        <w:rPr>
+          <w:sz w:val="22"/>
+          <w:szCs w:val="22"/>
+        </w:rPr>
+        <w:t xml:space="preserve"># Brinquedos: Diversão com Segurança</w:t>
+      </w:r>
+      <w:r>
+        <w:rPr>
+          <w:sz w:val="22"/>
+          <w:szCs w:val="22"/>
+        </w:rPr>
+        <w:br/>
+        <w:t xml:space="preserve"/>
+      </w:r>
+      <w:r>
+        <w:rPr>
+          <w:sz w:val="22"/>
+          <w:szCs w:val="22"/>
+        </w:rPr>
+        <w:br/>
+        <w:t xml:space="preserve">Ao escolher brinquedos, verifique sempre a classificação etária indicativa. Um brinquedo seguro para uma criança de 7 anos pode ser mortal para uma de 2.</w:t>
+      </w:r>
+      <w:r>
+        <w:rPr>
+          <w:sz w:val="22"/>
+          <w:szCs w:val="22"/>
+        </w:rPr>
+        <w:br/>
+        <w:t xml:space="preserve"/>
+      </w:r>
+      <w:r>
+        <w:rPr>
+          <w:sz w:val="22"/>
+          <w:szCs w:val="22"/>
+        </w:rPr>
+        <w:br/>
+        <w:t xml:space="preserve">### Pontos de Atenção:</w:t>
+      </w:r>
+      <w:r>
+        <w:rPr>
+          <w:sz w:val="22"/>
+          <w:szCs w:val="22"/>
+        </w:rPr>
+        <w:br/>
+        <w:t xml:space="preserve">*   **Peças Pequenas:** Risco de ingestão e engasgo para menores de 3 anos.</w:t>
+      </w:r>
+      <w:r>
+        <w:rPr>
+          <w:sz w:val="22"/>
+          <w:szCs w:val="22"/>
+        </w:rPr>
+        <w:br/>
+        <w:t xml:space="preserve">*   **Baterias Botão:** Extremamente perigosas se engolidas (risco de queimadura interna grave). Verifique se o compartimento da bateria é parafusado ou tem uma trava que a criança não consegue abrir.</w:t>
+      </w:r>
+      <w:r>
+        <w:rPr>
+          <w:sz w:val="22"/>
+          <w:szCs w:val="22"/>
+        </w:rPr>
+        <w:br/>
+        <w:t xml:space="preserve">*   **Tintas Tóxicas:** Prefira produtos com {{CERT_SEAL}}.</w:t>
+      </w:r>
+      <w:r>
+        <w:rPr>
+          <w:sz w:val="22"/>
+          <w:szCs w:val="22"/>
+        </w:rPr>
+        <w:br/>
+        <w:t xml:space="preserve">*   **Barulho Excessivo:** Brinquedos muito barulhentos podem prejudicar a audição sensível da criança.</w:t>
+      </w:r>
+      <w:r>
+        <w:rPr>
+          <w:sz w:val="22"/>
+          <w:szCs w:val="22"/>
+        </w:rPr>
+        <w:br/>
+        <w:t xml:space="preserve">*   **Quebráveis:** Evite materiais que possam estilhaçar (vidro, plástico rígido quebradiço).</w:t>
+      </w:r>
+      <w:r>
+        <w:rPr>
+          <w:sz w:val="22"/>
+          <w:szCs w:val="22"/>
+        </w:rPr>
+        <w:br/>
+        <w:t xml:space="preserve"/>
+      </w:r>
+      <w:r>
+        <w:rPr>
+          <w:sz w:val="22"/>
+          <w:szCs w:val="22"/>
+        </w:rPr>
+        <w:br/>
+        <w:t xml:space="preserve">---</w:t>
+      </w:r>
+      <w:r>
+        <w:rPr>
+          <w:sz w:val="22"/>
+          <w:szCs w:val="22"/>
+        </w:rPr>
+        <w:br/>
+        <w:t xml:space="preserve"/>
+      </w:r>
+      <w:r>
+        <w:rPr>
+          <w:sz w:val="22"/>
+          <w:szCs w:val="22"/>
+        </w:rPr>
+        <w:br/>
+        <w:t xml:space="preserve"># Prevenção de Afogamentos</w:t>
+      </w:r>
+      <w:r>
+        <w:rPr>
+          <w:sz w:val="22"/>
+          <w:szCs w:val="22"/>
+        </w:rPr>
+        <w:br/>
+        <w:t xml:space="preserve"/>
+      </w:r>
+      <w:r>
+        <w:rPr>
+          <w:sz w:val="22"/>
+          <w:szCs w:val="22"/>
+        </w:rPr>
+        <w:br/>
+        <w:t xml:space="preserve">**O Risco Invisível:** O afogamento real é rápido e silencioso. Pode ocorrer em apenas 2,5 cm de água (baldes, bacias, banheiras, tanques e similares), devido ao peso da cabeça dos bebês.</w:t>
+      </w:r>
+      <w:r>
+        <w:rPr>
+          <w:sz w:val="22"/>
+          <w:szCs w:val="22"/>
+        </w:rPr>
+        <w:br/>
+        <w:t xml:space="preserve"/>
+      </w:r>
+      <w:r>
+        <w:rPr>
+          <w:sz w:val="22"/>
+          <w:szCs w:val="22"/>
+        </w:rPr>
+        <w:br/>
+        <w:t xml:space="preserve">**Ação Tática Imediata:** Mantenha barreiras difíceis de transpor (cercas de pelo menos 1,50 m) ao redor de piscinas. Esvazie baldes imediatamente após o uso. Mantenha a tampa do vaso sanitário abaixada e travada.</w:t>
+      </w:r>
+      <w:r>
+        <w:rPr>
+          <w:sz w:val="22"/>
+          <w:szCs w:val="22"/>
+        </w:rPr>
+        <w:br/>
+        <w:t xml:space="preserve"/>
+      </w:r>
+      <w:r>
+        <w:rPr>
+          <w:sz w:val="22"/>
+          <w:szCs w:val="22"/>
+        </w:rPr>
+        <w:br/>
+        <w:t xml:space="preserve">[Acesse o guia de afogamento em preveniremcasa.com.br](https://www.preveniremcasa.com.br)</w:t>
+      </w:r>
+    </w:p>
+    <w:p>
+      <w:pPr>
+        <w:spacing w:after="160" w:before="0"/>
+        <w:ind w:left="360"/>
+      </w:pPr>
+      <w:r>
+        <w:rPr>
+          <w:i/>
+          <w:iCs/>
+          <w:color w:val="8A6D00"/>
+          <w:sz w:val="18"/>
+          <w:szCs w:val="18"/>
+        </w:rPr>
+        <w:t xml:space="preserve">ANTES (até 22/10/2026): # Brinquedos: Diversão com Segurança /  / Ao escolher brinquedos, verifique sempre a classificação etária indicativa. Um brinquedo seguro para uma criança de 7 anos pode ser mortal para uma de 2. /  / ### Pontos de Atenção: / *   **Peças Pequenas:** Risco de ingestão e engasgo para menores de 3 anos. / *   **Baterias Botão:** Extremamente perigosas se engolidas (risco de queimadura interna grave). Verifique se o compartimento da bateria é parafusado. / *   **Tintas Tóxicas:** Prefira produtos com {{CERT_SEAL}}. / *   **Barulho Excessivo:** Brinquedos muito barulhentos podem prejudicar a audição sensível da criança. / *   **Quebráveis:** Evite materiais que possam estilhaçar (vidro, plástico rígido quebradiço). /  / --- /  / # Prevenção de Afogamentos /  / **O Risco Invisível:** O afogamento real é rápido e silencioso. Pode ocorrer em apenas 2,5 cm de água (baldes, bacias, banheiras, tanques e similares), devido ao peso da cabeça dos bebês. /  / **Ação Tática Imediata:** Mantenha barreiras que sejam intransponíveis (cercas de 1,5m) ao redor de piscinas. Esvazie baldes imediatamente após o uso. Mantenha a tampa do vaso sanitário abaixada e travada. /  / [Acesse o guia de afogamento em preveniremcasa.com.br](https://www.preveniremcasa.com.br)</w:t>
       </w:r>
     </w:p>
     <w:p>
@@ -1164,169 +1696,28 @@
           <w:sz w:val="34"/>
           <w:szCs w:val="34"/>
         </w:rPr>
-        <w:t xml:space="preserve">Guia de Kits</w:t>
-      </w:r>
-    </w:p>
-    <w:p>
-      <w:pPr>
-        <w:pStyle w:val="Heading2"/>
-        <w:spacing w:after="120" w:before="280"/>
-      </w:pPr>
-      <w:r>
-        <w:rPr>
-          <w:b/>
-          <w:bCs/>
-          <w:sz w:val="26"/>
-          <w:szCs w:val="26"/>
-        </w:rPr>
-        <w:t xml:space="preserve">Comunicação</w:t>
-      </w:r>
-    </w:p>
-    <w:p>
-      <w:pPr>
-        <w:spacing w:after="160" w:line="300"/>
-      </w:pPr>
-      <w:r>
-        <w:rPr>
-          <w:rFonts w:ascii="Consolas" w:cs="Consolas" w:eastAsia="Consolas" w:hAnsi="Consolas"/>
-          <w:color w:val="9AA0A6"/>
-          <w:sz w:val="14"/>
-          <w:szCs w:val="14"/>
-        </w:rPr>
-        <w:t xml:space="preserve">RK-0006  </w:t>
-      </w:r>
-      <w:r>
-        <w:rPr>
-          <w:sz w:val="22"/>
-          <w:szCs w:val="22"/>
-        </w:rPr>
-        <w:t xml:space="preserve">**Lista em papel:** os mesmos contatos impressos, perto da porta ou na geladeira — servem quando o celular está sem bateria.</w:t>
-      </w:r>
-    </w:p>
-    <w:p>
-      <w:pPr>
-        <w:spacing w:after="160" w:before="0"/>
-        <w:ind w:left="360"/>
-      </w:pPr>
-      <w:r>
-        <w:rPr>
-          <w:i/>
-          <w:iCs/>
-          <w:color w:val="065F46"/>
-          <w:sz w:val="18"/>
-          <w:szCs w:val="18"/>
-        </w:rPr>
-        <w:t xml:space="preserve">NOVO EM 22/10/2026 — este texto nao existia.</w:t>
-      </w:r>
-    </w:p>
-    <w:p>
-      <w:pPr>
-        <w:spacing w:after="160" w:line="300"/>
-      </w:pPr>
-      <w:r>
-        <w:rPr>
-          <w:rFonts w:ascii="Consolas" w:cs="Consolas" w:eastAsia="Consolas" w:hAnsi="Consolas"/>
-          <w:color w:val="9AA0A6"/>
-          <w:sz w:val="14"/>
-          <w:szCs w:val="14"/>
-        </w:rPr>
-        <w:t xml:space="preserve">RK-0007  </w:t>
-      </w:r>
-      <w:r>
-        <w:rPr>
-          <w:sz w:val="22"/>
-          <w:szCs w:val="22"/>
-        </w:rPr>
-        <w:t xml:space="preserve">**Documentos:** identidade e cartão do SUS ou do plano de saúde num lugar fácil de pegar numa saída às pressas.</w:t>
-      </w:r>
-    </w:p>
-    <w:p>
-      <w:pPr>
-        <w:spacing w:after="160" w:before="0"/>
-        <w:ind w:left="360"/>
-      </w:pPr>
-      <w:r>
-        <w:rPr>
-          <w:i/>
-          <w:iCs/>
-          <w:color w:val="065F46"/>
-          <w:sz w:val="18"/>
-          <w:szCs w:val="18"/>
-        </w:rPr>
-        <w:t xml:space="preserve">NOVO EM 22/10/2026 — este texto nao existia.</w:t>
-      </w:r>
-    </w:p>
-    <w:p>
-      <w:pPr>
-        <w:pStyle w:val="Heading2"/>
-        <w:spacing w:after="120" w:before="280"/>
-      </w:pPr>
-      <w:r>
-        <w:rPr>
-          <w:b/>
-          <w:bCs/>
-          <w:sz w:val="26"/>
-          <w:szCs w:val="26"/>
-        </w:rPr>
-        <w:t xml:space="preserve">Medicamentos Básicos (Uso Livre/Sintomáticos)</w:t>
-      </w:r>
-    </w:p>
-    <w:p>
-      <w:pPr>
-        <w:spacing w:after="160" w:line="300"/>
-      </w:pPr>
-      <w:r>
-        <w:rPr>
-          <w:rFonts w:ascii="Consolas" w:cs="Consolas" w:eastAsia="Consolas" w:hAnsi="Consolas"/>
-          <w:color w:val="9AA0A6"/>
-          <w:sz w:val="14"/>
-          <w:szCs w:val="14"/>
-        </w:rPr>
-        <w:t xml:space="preserve">RK-0008  </w:t>
-      </w:r>
-      <w:r>
-        <w:rPr>
-          <w:sz w:val="22"/>
-          <w:szCs w:val="22"/>
-        </w:rPr>
-        <w:t xml:space="preserve">**Antes de montar:** combine a lista e as doses com o médico ou o farmacêutico — sobretudo se houver crianças, gestantes, idosos, alergias ou doenças crônicas.</w:t>
-      </w:r>
-    </w:p>
-    <w:p>
-      <w:pPr>
-        <w:spacing w:after="160" w:before="0"/>
-        <w:ind w:left="360"/>
-      </w:pPr>
-      <w:r>
-        <w:rPr>
-          <w:i/>
-          <w:iCs/>
-          <w:color w:val="065F46"/>
-          <w:sz w:val="18"/>
-          <w:szCs w:val="18"/>
-        </w:rPr>
-        <w:t xml:space="preserve">NOVO EM 22/10/2026 — este texto nao existia.</w:t>
-      </w:r>
-    </w:p>
-    <w:p>
-      <w:pPr>
-        <w:spacing w:after="160" w:line="300"/>
-      </w:pPr>
-      <w:r>
-        <w:rPr>
-          <w:rFonts w:ascii="Consolas" w:cs="Consolas" w:eastAsia="Consolas" w:hAnsi="Consolas"/>
-          <w:color w:val="9AA0A6"/>
-          <w:sz w:val="14"/>
-          <w:szCs w:val="14"/>
-        </w:rPr>
-        <w:t xml:space="preserve">RK-0009  </w:t>
-      </w:r>
-      <w:r>
-        <w:rPr>
-          <w:sz w:val="22"/>
-          <w:szCs w:val="22"/>
-        </w:rPr>
-        <w:t xml:space="preserve">**Analgésicos e Antitérmicos:** os que o médico ou o farmacêutico indicarem para a família (por exemplo, paracetamol ou dipirona), para dor de cabeça, febre ou dores leves.</w:t>
+        <w:t xml:space="preserve">Guias educativos</w:t>
+      </w:r>
+    </w:p>
+    <w:p>
+      <w:pPr>
+        <w:spacing w:after="160" w:line="300"/>
+      </w:pPr>
+      <w:r>
+        <w:rPr>
+          <w:rFonts w:ascii="Consolas" w:cs="Consolas" w:eastAsia="Consolas" w:hAnsi="Consolas"/>
+          <w:color w:val="9AA0A6"/>
+          <w:sz w:val="14"/>
+          <w:szCs w:val="14"/>
+        </w:rPr>
+        <w:t xml:space="preserve">RK-0019  </w:t>
+      </w:r>
+      <w:r>
+        <w:rPr>
+          <w:sz w:val="22"/>
+          <w:szCs w:val="22"/>
+        </w:rPr>
+        <w:t xml:space="preserve">Piscina precisa de cerca alta (pelo menos 1,50 m) e portão que tranca sozinho para nenhuma criança entrar sem querer. Use ralos que não sugam o cabelo. E escolha um adulto para vigiar os pequenos o tempo todo — sem celular nem distrações.</w:t>
       </w:r>
     </w:p>
     <w:p>
@@ -1342,44 +1733,7 @@
           <w:sz w:val="18"/>
           <w:szCs w:val="18"/>
         </w:rPr>
-        <w:t xml:space="preserve">ANTES (até 22/10/2026): **Analgésicos e Antitérmicos:** Paracetamol ou Dipirona para dor de cabeça, febre ou dores leves.</w:t>
-      </w:r>
-    </w:p>
-    <w:p>
-      <w:pPr>
-        <w:spacing w:after="160" w:line="300"/>
-      </w:pPr>
-      <w:r>
-        <w:rPr>
-          <w:rFonts w:ascii="Consolas" w:cs="Consolas" w:eastAsia="Consolas" w:hAnsi="Consolas"/>
-          <w:color w:val="9AA0A6"/>
-          <w:sz w:val="14"/>
-          <w:szCs w:val="14"/>
-        </w:rPr>
-        <w:t xml:space="preserve">RK-0010  </w:t>
-      </w:r>
-      <w:r>
-        <w:rPr>
-          <w:sz w:val="22"/>
-          <w:szCs w:val="22"/>
-        </w:rPr>
-        <w:t xml:space="preserve">**Soro de reidratação oral** (vendido em farmácia, em pó para misturar na água): ajuda a repor os líquidos perdidos em diarreia ou vômito. Em bebês, idosos ou se a pessoa não melhorar, procure atendimento.</w:t>
-      </w:r>
-    </w:p>
-    <w:p>
-      <w:pPr>
-        <w:spacing w:after="160" w:before="0"/>
-        <w:ind w:left="360"/>
-      </w:pPr>
-      <w:r>
-        <w:rPr>
-          <w:i/>
-          <w:iCs/>
-          <w:color w:val="065F46"/>
-          <w:sz w:val="18"/>
-          <w:szCs w:val="18"/>
-        </w:rPr>
-        <w:t xml:space="preserve">NOVO EM 22/10/2026 — este texto nao existia.</w:t>
+        <w:t xml:space="preserve">ANTES (até 22/10/2026): Piscina precisa de cerca alta (pelo menos 1,20m) e portão que tranca sozinho para nenhuma criança entrar sem querer. Use ralos que não sugam o cabelo. E escolha um adulto para vigiar os pequenos o tempo todo — sem celular nem distrações.</w:t>
       </w:r>
     </w:p>
     <w:p>
@@ -1396,6 +1750,238 @@
           <w:sz w:val="34"/>
           <w:szCs w:val="34"/>
         </w:rPr>
+        <w:t xml:space="preserve">Guia de Kits</w:t>
+      </w:r>
+    </w:p>
+    <w:p>
+      <w:pPr>
+        <w:pStyle w:val="Heading2"/>
+        <w:spacing w:after="120" w:before="280"/>
+      </w:pPr>
+      <w:r>
+        <w:rPr>
+          <w:b/>
+          <w:bCs/>
+          <w:sz w:val="26"/>
+          <w:szCs w:val="26"/>
+        </w:rPr>
+        <w:t xml:space="preserve">Comunicação</w:t>
+      </w:r>
+    </w:p>
+    <w:p>
+      <w:pPr>
+        <w:spacing w:after="160" w:line="300"/>
+      </w:pPr>
+      <w:r>
+        <w:rPr>
+          <w:rFonts w:ascii="Consolas" w:cs="Consolas" w:eastAsia="Consolas" w:hAnsi="Consolas"/>
+          <w:color w:val="9AA0A6"/>
+          <w:sz w:val="14"/>
+          <w:szCs w:val="14"/>
+        </w:rPr>
+        <w:t xml:space="preserve">RK-0020  </w:t>
+      </w:r>
+      <w:r>
+        <w:rPr>
+          <w:sz w:val="22"/>
+          <w:szCs w:val="22"/>
+        </w:rPr>
+        <w:t xml:space="preserve">**Lista em papel:** os mesmos contatos impressos, perto da porta ou na geladeira — servem quando o celular está sem bateria.</w:t>
+      </w:r>
+    </w:p>
+    <w:p>
+      <w:pPr>
+        <w:spacing w:after="160" w:before="0"/>
+        <w:ind w:left="360"/>
+      </w:pPr>
+      <w:r>
+        <w:rPr>
+          <w:i/>
+          <w:iCs/>
+          <w:color w:val="065F46"/>
+          <w:sz w:val="18"/>
+          <w:szCs w:val="18"/>
+        </w:rPr>
+        <w:t xml:space="preserve">NOVO EM 22/10/2026 — este texto nao existia.</w:t>
+      </w:r>
+    </w:p>
+    <w:p>
+      <w:pPr>
+        <w:spacing w:after="160" w:line="300"/>
+      </w:pPr>
+      <w:r>
+        <w:rPr>
+          <w:rFonts w:ascii="Consolas" w:cs="Consolas" w:eastAsia="Consolas" w:hAnsi="Consolas"/>
+          <w:color w:val="9AA0A6"/>
+          <w:sz w:val="14"/>
+          <w:szCs w:val="14"/>
+        </w:rPr>
+        <w:t xml:space="preserve">RK-0021  </w:t>
+      </w:r>
+      <w:r>
+        <w:rPr>
+          <w:sz w:val="22"/>
+          <w:szCs w:val="22"/>
+        </w:rPr>
+        <w:t xml:space="preserve">**Documentos:** identidade e cartão do SUS ou do plano de saúde num lugar fácil de pegar numa saída às pressas.</w:t>
+      </w:r>
+    </w:p>
+    <w:p>
+      <w:pPr>
+        <w:spacing w:after="160" w:before="0"/>
+        <w:ind w:left="360"/>
+      </w:pPr>
+      <w:r>
+        <w:rPr>
+          <w:i/>
+          <w:iCs/>
+          <w:color w:val="065F46"/>
+          <w:sz w:val="18"/>
+          <w:szCs w:val="18"/>
+        </w:rPr>
+        <w:t xml:space="preserve">NOVO EM 22/10/2026 — este texto nao existia.</w:t>
+      </w:r>
+    </w:p>
+    <w:p>
+      <w:pPr>
+        <w:pStyle w:val="Heading2"/>
+        <w:spacing w:after="120" w:before="280"/>
+      </w:pPr>
+      <w:r>
+        <w:rPr>
+          <w:b/>
+          <w:bCs/>
+          <w:sz w:val="26"/>
+          <w:szCs w:val="26"/>
+        </w:rPr>
+        <w:t xml:space="preserve">Medicamentos Básicos (Uso Livre/Sintomáticos)</w:t>
+      </w:r>
+    </w:p>
+    <w:p>
+      <w:pPr>
+        <w:spacing w:after="160" w:line="300"/>
+      </w:pPr>
+      <w:r>
+        <w:rPr>
+          <w:rFonts w:ascii="Consolas" w:cs="Consolas" w:eastAsia="Consolas" w:hAnsi="Consolas"/>
+          <w:color w:val="9AA0A6"/>
+          <w:sz w:val="14"/>
+          <w:szCs w:val="14"/>
+        </w:rPr>
+        <w:t xml:space="preserve">RK-0022  </w:t>
+      </w:r>
+      <w:r>
+        <w:rPr>
+          <w:sz w:val="22"/>
+          <w:szCs w:val="22"/>
+        </w:rPr>
+        <w:t xml:space="preserve">**Antes de montar:** combine a lista e as doses com o médico ou o farmacêutico — sobretudo se houver crianças, gestantes, idosos, alergias ou doenças crônicas.</w:t>
+      </w:r>
+    </w:p>
+    <w:p>
+      <w:pPr>
+        <w:spacing w:after="160" w:before="0"/>
+        <w:ind w:left="360"/>
+      </w:pPr>
+      <w:r>
+        <w:rPr>
+          <w:i/>
+          <w:iCs/>
+          <w:color w:val="065F46"/>
+          <w:sz w:val="18"/>
+          <w:szCs w:val="18"/>
+        </w:rPr>
+        <w:t xml:space="preserve">NOVO EM 22/10/2026 — este texto nao existia.</w:t>
+      </w:r>
+    </w:p>
+    <w:p>
+      <w:pPr>
+        <w:spacing w:after="160" w:line="300"/>
+      </w:pPr>
+      <w:r>
+        <w:rPr>
+          <w:rFonts w:ascii="Consolas" w:cs="Consolas" w:eastAsia="Consolas" w:hAnsi="Consolas"/>
+          <w:color w:val="9AA0A6"/>
+          <w:sz w:val="14"/>
+          <w:szCs w:val="14"/>
+        </w:rPr>
+        <w:t xml:space="preserve">RK-0023  </w:t>
+      </w:r>
+      <w:r>
+        <w:rPr>
+          <w:sz w:val="22"/>
+          <w:szCs w:val="22"/>
+        </w:rPr>
+        <w:t xml:space="preserve">**Analgésicos e Antitérmicos:** os que o médico ou o farmacêutico indicarem para a família (por exemplo, paracetamol ou dipirona), para dor de cabeça, febre ou dores leves.</w:t>
+      </w:r>
+    </w:p>
+    <w:p>
+      <w:pPr>
+        <w:spacing w:after="160" w:before="0"/>
+        <w:ind w:left="360"/>
+      </w:pPr>
+      <w:r>
+        <w:rPr>
+          <w:i/>
+          <w:iCs/>
+          <w:color w:val="8A6D00"/>
+          <w:sz w:val="18"/>
+          <w:szCs w:val="18"/>
+        </w:rPr>
+        <w:t xml:space="preserve">ANTES (até 22/10/2026): **Analgésicos e Antitérmicos:** Paracetamol ou Dipirona para dor de cabeça, febre ou dores leves.</w:t>
+      </w:r>
+    </w:p>
+    <w:p>
+      <w:pPr>
+        <w:spacing w:after="160" w:line="300"/>
+      </w:pPr>
+      <w:r>
+        <w:rPr>
+          <w:rFonts w:ascii="Consolas" w:cs="Consolas" w:eastAsia="Consolas" w:hAnsi="Consolas"/>
+          <w:color w:val="9AA0A6"/>
+          <w:sz w:val="14"/>
+          <w:szCs w:val="14"/>
+        </w:rPr>
+        <w:t xml:space="preserve">RK-0024  </w:t>
+      </w:r>
+      <w:r>
+        <w:rPr>
+          <w:sz w:val="22"/>
+          <w:szCs w:val="22"/>
+        </w:rPr>
+        <w:t xml:space="preserve">**Soro de reidratação oral** (vendido em farmácia, em pó para misturar na água): ajuda a repor os líquidos perdidos em diarreia ou vômito. Em bebês, idosos ou se a pessoa não melhorar, procure atendimento.</w:t>
+      </w:r>
+    </w:p>
+    <w:p>
+      <w:pPr>
+        <w:spacing w:after="160" w:before="0"/>
+        <w:ind w:left="360"/>
+      </w:pPr>
+      <w:r>
+        <w:rPr>
+          <w:i/>
+          <w:iCs/>
+          <w:color w:val="065F46"/>
+          <w:sz w:val="18"/>
+          <w:szCs w:val="18"/>
+        </w:rPr>
+        <w:t xml:space="preserve">NOVO EM 22/10/2026 — este texto nao existia.</w:t>
+      </w:r>
+    </w:p>
+    <w:p>
+      <w:pPr>
+        <w:pStyle w:val="Heading1"/>
+        <w:pageBreakBefore/>
+        <w:spacing w:after="200"/>
+      </w:pPr>
+      <w:r>
+        <w:rPr>
+          <w:b/>
+          <w:bCs/>
+          <w:color w:val="065F46"/>
+          <w:sz w:val="34"/>
+          <w:szCs w:val="34"/>
+        </w:rPr>
         <w:t xml:space="preserve">Riscos Fisicos</w:t>
       </w:r>
     </w:p>
@@ -1441,7 +2027,7 @@
           <w:sz w:val="14"/>
           <w:szCs w:val="14"/>
         </w:rPr>
-        <w:t xml:space="preserve">RK-0011  </w:t>
+        <w:t xml:space="preserve">RK-0025  </w:t>
       </w:r>
       <w:r>
         <w:rPr>
@@ -1509,7 +2095,7 @@
           <w:sz w:val="14"/>
           <w:szCs w:val="14"/>
         </w:rPr>
-        <w:t xml:space="preserve">RK-0012  </w:t>
+        <w:t xml:space="preserve">RK-0026  </w:t>
       </w:r>
       <w:r>
         <w:rPr>
@@ -1577,7 +2163,7 @@
           <w:sz w:val="14"/>
           <w:szCs w:val="14"/>
         </w:rPr>
-        <w:t xml:space="preserve">RK-0013  </w:t>
+        <w:t xml:space="preserve">RK-0027  </w:t>
       </w:r>
       <w:r>
         <w:rPr>
@@ -1645,7 +2231,7 @@
           <w:sz w:val="14"/>
           <w:szCs w:val="14"/>
         </w:rPr>
-        <w:t xml:space="preserve">RK-0014  </w:t>
+        <w:t xml:space="preserve">RK-0028  </w:t>
       </w:r>
       <w:r>
         <w:rPr>
@@ -1713,7 +2299,7 @@
           <w:sz w:val="14"/>
           <w:szCs w:val="14"/>
         </w:rPr>
-        <w:t xml:space="preserve">RK-0015  </w:t>
+        <w:t xml:space="preserve">RK-0029  </w:t>
       </w:r>
       <w:r>
         <w:rPr>
@@ -1781,7 +2367,7 @@
           <w:sz w:val="14"/>
           <w:szCs w:val="14"/>
         </w:rPr>
-        <w:t xml:space="preserve">RK-0016  </w:t>
+        <w:t xml:space="preserve">RK-0030  </w:t>
       </w:r>
       <w:r>
         <w:rPr>
@@ -1849,7 +2435,7 @@
           <w:sz w:val="14"/>
           <w:szCs w:val="14"/>
         </w:rPr>
-        <w:t xml:space="preserve">RK-0017  </w:t>
+        <w:t xml:space="preserve">RK-0031  </w:t>
       </w:r>
       <w:r>
         <w:rPr>
@@ -1917,7 +2503,7 @@
           <w:sz w:val="14"/>
           <w:szCs w:val="14"/>
         </w:rPr>
-        <w:t xml:space="preserve">RK-0018  </w:t>
+        <w:t xml:space="preserve">RK-0032  </w:t>
       </w:r>
       <w:r>
         <w:rPr>
@@ -1985,7 +2571,7 @@
           <w:sz w:val="14"/>
           <w:szCs w:val="14"/>
         </w:rPr>
-        <w:t xml:space="preserve">RK-0019  </w:t>
+        <w:t xml:space="preserve">RK-0033  </w:t>
       </w:r>
       <w:r>
         <w:rPr>
@@ -2053,7 +2639,7 @@
           <w:sz w:val="14"/>
           <w:szCs w:val="14"/>
         </w:rPr>
-        <w:t xml:space="preserve">RK-0020  </w:t>
+        <w:t xml:space="preserve">RK-0034  </w:t>
       </w:r>
       <w:r>
         <w:rPr>
@@ -2121,7 +2707,7 @@
           <w:sz w:val="14"/>
           <w:szCs w:val="14"/>
         </w:rPr>
-        <w:t xml:space="preserve">RK-0021  </w:t>
+        <w:t xml:space="preserve">RK-0035  </w:t>
       </w:r>
       <w:r>
         <w:rPr>
@@ -2191,7 +2777,7 @@
           <w:sz w:val="14"/>
           <w:szCs w:val="14"/>
         </w:rPr>
-        <w:t xml:space="preserve">RK-0022  </w:t>
+        <w:t xml:space="preserve">RK-0036  </w:t>
       </w:r>
       <w:r>
         <w:rPr>
@@ -2276,7 +2862,7 @@
           <w:sz w:val="14"/>
           <w:szCs w:val="14"/>
         </w:rPr>
-        <w:t xml:space="preserve">RK-0023  </w:t>
+        <w:t xml:space="preserve">RK-0037  </w:t>
       </w:r>
       <w:r>
         <w:rPr>
@@ -2328,7 +2914,7 @@
           <w:sz w:val="14"/>
           <w:szCs w:val="14"/>
         </w:rPr>
-        <w:t xml:space="preserve">RK-0024  </w:t>
+        <w:t xml:space="preserve">RK-0038  </w:t>
       </w:r>
       <w:r>
         <w:rPr>
@@ -2381,7 +2967,7 @@
           <w:sz w:val="14"/>
           <w:szCs w:val="14"/>
         </w:rPr>
-        <w:t xml:space="preserve">RK-0025  </w:t>
+        <w:t xml:space="preserve">RK-0039  </w:t>
       </w:r>
       <w:r>
         <w:rPr>
@@ -2418,7 +3004,7 @@
           <w:sz w:val="14"/>
           <w:szCs w:val="14"/>
         </w:rPr>
-        <w:t xml:space="preserve">RK-0026  </w:t>
+        <w:t xml:space="preserve">RK-0040  </w:t>
       </w:r>
       <w:r>
         <w:rPr>
@@ -2471,7 +3057,7 @@
           <w:sz w:val="14"/>
           <w:szCs w:val="14"/>
         </w:rPr>
-        <w:t xml:space="preserve">RK-0027  </w:t>
+        <w:t xml:space="preserve">RK-0041  </w:t>
       </w:r>
       <w:r>
         <w:rPr>
@@ -2539,7 +3125,7 @@
           <w:sz w:val="14"/>
           <w:szCs w:val="14"/>
         </w:rPr>
-        <w:t xml:space="preserve">RK-0028  </w:t>
+        <w:t xml:space="preserve">RK-0042  </w:t>
       </w:r>
       <w:r>
         <w:rPr>
@@ -2608,7 +3194,7 @@
           <w:sz w:val="14"/>
           <w:szCs w:val="14"/>
         </w:rPr>
-        <w:t xml:space="preserve">RK-0029  </w:t>
+        <w:t xml:space="preserve">RK-0043  </w:t>
       </w:r>
       <w:r>
         <w:rPr>
@@ -2645,7 +3231,7 @@
           <w:sz w:val="14"/>
           <w:szCs w:val="14"/>
         </w:rPr>
-        <w:t xml:space="preserve">RK-0030  </w:t>
+        <w:t xml:space="preserve">RK-0044  </w:t>
       </w:r>
       <w:r>
         <w:rPr>
@@ -2730,7 +3316,7 @@
           <w:sz w:val="14"/>
           <w:szCs w:val="14"/>
         </w:rPr>
-        <w:t xml:space="preserve">RK-0031  </w:t>
+        <w:t xml:space="preserve">RK-0045  </w:t>
       </w:r>
       <w:r>
         <w:rPr>
@@ -2815,7 +3401,7 @@
           <w:sz w:val="14"/>
           <w:szCs w:val="14"/>
         </w:rPr>
-        <w:t xml:space="preserve">RK-0032  </w:t>
+        <w:t xml:space="preserve">RK-0046  </w:t>
       </w:r>
       <w:r>
         <w:rPr>
@@ -2883,7 +3469,7 @@
           <w:sz w:val="14"/>
           <w:szCs w:val="14"/>
         </w:rPr>
-        <w:t xml:space="preserve">RK-0033  </w:t>
+        <w:t xml:space="preserve">RK-0047  </w:t>
       </w:r>
       <w:r>
         <w:rPr>
@@ -2968,7 +3554,7 @@
           <w:sz w:val="14"/>
           <w:szCs w:val="14"/>
         </w:rPr>
-        <w:t xml:space="preserve">RK-0034  </w:t>
+        <w:t xml:space="preserve">RK-0048  </w:t>
       </w:r>
       <w:r>
         <w:rPr>
@@ -3037,7 +3623,7 @@
           <w:sz w:val="14"/>
           <w:szCs w:val="14"/>
         </w:rPr>
-        <w:t xml:space="preserve">RK-0035  </w:t>
+        <w:t xml:space="preserve">RK-0049  </w:t>
       </w:r>
       <w:r>
         <w:rPr>
@@ -3089,7 +3675,7 @@
           <w:sz w:val="14"/>
           <w:szCs w:val="14"/>
         </w:rPr>
-        <w:t xml:space="preserve">RK-0036  </w:t>
+        <w:t xml:space="preserve">RK-0050  </w:t>
       </w:r>
       <w:r>
         <w:rPr>
@@ -3141,7 +3727,7 @@
           <w:sz w:val="14"/>
           <w:szCs w:val="14"/>
         </w:rPr>
-        <w:t xml:space="preserve">RK-0037  </w:t>
+        <w:t xml:space="preserve">RK-0051  </w:t>
       </w:r>
       <w:r>
         <w:rPr>
@@ -3193,7 +3779,7 @@
           <w:sz w:val="14"/>
           <w:szCs w:val="14"/>
         </w:rPr>
-        <w:t xml:space="preserve">RK-0038  </w:t>
+        <w:t xml:space="preserve">RK-0052  </w:t>
       </w:r>
       <w:r>
         <w:rPr>
@@ -3245,7 +3831,7 @@
           <w:sz w:val="14"/>
           <w:szCs w:val="14"/>
         </w:rPr>
-        <w:t xml:space="preserve">RK-0039  </w:t>
+        <w:t xml:space="preserve">RK-0053  </w:t>
       </w:r>
       <w:r>
         <w:rPr>
@@ -3297,7 +3883,7 @@
           <w:sz w:val="14"/>
           <w:szCs w:val="14"/>
         </w:rPr>
-        <w:t xml:space="preserve">RK-0040  </w:t>
+        <w:t xml:space="preserve">RK-0054  </w:t>
       </w:r>
       <w:r>
         <w:rPr>
@@ -3349,7 +3935,7 @@
           <w:sz w:val="14"/>
           <w:szCs w:val="14"/>
         </w:rPr>
-        <w:t xml:space="preserve">RK-0041  </w:t>
+        <w:t xml:space="preserve">RK-0055  </w:t>
       </w:r>
       <w:r>
         <w:rPr>
@@ -3418,7 +4004,7 @@
           <w:sz w:val="14"/>
           <w:szCs w:val="14"/>
         </w:rPr>
-        <w:t xml:space="preserve">RK-0042  </w:t>
+        <w:t xml:space="preserve">RK-0056  </w:t>
       </w:r>
       <w:r>
         <w:rPr>
@@ -3470,7 +4056,7 @@
           <w:sz w:val="14"/>
           <w:szCs w:val="14"/>
         </w:rPr>
-        <w:t xml:space="preserve">RK-0043  </w:t>
+        <w:t xml:space="preserve">RK-0057  </w:t>
       </w:r>
       <w:r>
         <w:rPr>
@@ -3508,7 +4094,7 @@
           <w:sz w:val="14"/>
           <w:szCs w:val="14"/>
         </w:rPr>
-        <w:t xml:space="preserve">RK-0044  </w:t>
+        <w:t xml:space="preserve">RK-0058  </w:t>
       </w:r>
       <w:r>
         <w:rPr>
@@ -3546,7 +4132,7 @@
           <w:sz w:val="14"/>
           <w:szCs w:val="14"/>
         </w:rPr>
-        <w:t xml:space="preserve">RK-0045  </w:t>
+        <w:t xml:space="preserve">RK-0059  </w:t>
       </w:r>
       <w:r>
         <w:rPr>
@@ -3598,7 +4184,7 @@
           <w:sz w:val="14"/>
           <w:szCs w:val="14"/>
         </w:rPr>
-        <w:t xml:space="preserve">RK-0046  </w:t>
+        <w:t xml:space="preserve">RK-0060  </w:t>
       </w:r>
       <w:r>
         <w:rPr>
@@ -3683,7 +4269,7 @@
           <w:sz w:val="14"/>
           <w:szCs w:val="14"/>
         </w:rPr>
-        <w:t xml:space="preserve">RK-0047  </w:t>
+        <w:t xml:space="preserve">RK-0061  </w:t>
       </w:r>
       <w:r>
         <w:rPr>
@@ -3751,7 +4337,7 @@
           <w:sz w:val="14"/>
           <w:szCs w:val="14"/>
         </w:rPr>
-        <w:t xml:space="preserve">RK-0048  </w:t>
+        <w:t xml:space="preserve">RK-0062  </w:t>
       </w:r>
       <w:r>
         <w:rPr>
@@ -3819,7 +4405,7 @@
           <w:sz w:val="14"/>
           <w:szCs w:val="14"/>
         </w:rPr>
-        <w:t xml:space="preserve">RK-0049  </w:t>
+        <w:t xml:space="preserve">RK-0063  </w:t>
       </w:r>
       <w:r>
         <w:rPr>
@@ -3887,7 +4473,7 @@
           <w:sz w:val="14"/>
           <w:szCs w:val="14"/>
         </w:rPr>
-        <w:t xml:space="preserve">RK-0050  </w:t>
+        <w:t xml:space="preserve">RK-0064  </w:t>
       </w:r>
       <w:r>
         <w:rPr>
@@ -3955,7 +4541,7 @@
           <w:sz w:val="14"/>
           <w:szCs w:val="14"/>
         </w:rPr>
-        <w:t xml:space="preserve">RK-0051  </w:t>
+        <w:t xml:space="preserve">RK-0065  </w:t>
       </w:r>
       <w:r>
         <w:rPr>
@@ -4023,7 +4609,7 @@
           <w:sz w:val="14"/>
           <w:szCs w:val="14"/>
         </w:rPr>
-        <w:t xml:space="preserve">RK-0052  </w:t>
+        <w:t xml:space="preserve">RK-0066  </w:t>
       </w:r>
       <w:r>
         <w:rPr>
@@ -4091,7 +4677,7 @@
           <w:sz w:val="14"/>
           <w:szCs w:val="14"/>
         </w:rPr>
-        <w:t xml:space="preserve">RK-0053  </w:t>
+        <w:t xml:space="preserve">RK-0067  </w:t>
       </w:r>
       <w:r>
         <w:rPr>
@@ -4159,7 +4745,7 @@
           <w:sz w:val="14"/>
           <w:szCs w:val="14"/>
         </w:rPr>
-        <w:t xml:space="preserve">RK-0054  </w:t>
+        <w:t xml:space="preserve">RK-0068  </w:t>
       </w:r>
       <w:r>
         <w:rPr>
@@ -4227,7 +4813,7 @@
           <w:sz w:val="14"/>
           <w:szCs w:val="14"/>
         </w:rPr>
-        <w:t xml:space="preserve">RK-0055  </w:t>
+        <w:t xml:space="preserve">RK-0069  </w:t>
       </w:r>
       <w:r>
         <w:rPr>
@@ -4295,7 +4881,7 @@
           <w:sz w:val="14"/>
           <w:szCs w:val="14"/>
         </w:rPr>
-        <w:t xml:space="preserve">RK-0056  </w:t>
+        <w:t xml:space="preserve">RK-0070  </w:t>
       </w:r>
       <w:r>
         <w:rPr>
@@ -4363,7 +4949,7 @@
           <w:sz w:val="14"/>
           <w:szCs w:val="14"/>
         </w:rPr>
-        <w:t xml:space="preserve">RK-0057  </w:t>
+        <w:t xml:space="preserve">RK-0071  </w:t>
       </w:r>
       <w:r>
         <w:rPr>
@@ -4401,7 +4987,7 @@
           <w:sz w:val="14"/>
           <w:szCs w:val="14"/>
         </w:rPr>
-        <w:t xml:space="preserve">RK-0058  </w:t>
+        <w:t xml:space="preserve">RK-0072  </w:t>
       </w:r>
       <w:r>
         <w:rPr>
@@ -4425,7 +5011,7 @@
           <w:sz w:val="14"/>
           <w:szCs w:val="14"/>
         </w:rPr>
-        <w:t xml:space="preserve">RK-0059  </w:t>
+        <w:t xml:space="preserve">RK-0073  </w:t>
       </w:r>
       <w:r>
         <w:rPr>
@@ -4449,7 +5035,7 @@
           <w:sz w:val="14"/>
           <w:szCs w:val="14"/>
         </w:rPr>
-        <w:t xml:space="preserve">RK-0060  </w:t>
+        <w:t xml:space="preserve">RK-0074  </w:t>
       </w:r>
       <w:r>
         <w:rPr>
@@ -4473,7 +5059,7 @@
           <w:sz w:val="14"/>
           <w:szCs w:val="14"/>
         </w:rPr>
-        <w:t xml:space="preserve">RK-0061  </w:t>
+        <w:t xml:space="preserve">RK-0075  </w:t>
       </w:r>
       <w:r>
         <w:rPr>
@@ -4497,7 +5083,7 @@
           <w:sz w:val="14"/>
           <w:szCs w:val="14"/>
         </w:rPr>
-        <w:t xml:space="preserve">RK-0062  </w:t>
+        <w:t xml:space="preserve">RK-0076  </w:t>
       </w:r>
       <w:r>
         <w:rPr>
@@ -4521,7 +5107,7 @@
           <w:sz w:val="14"/>
           <w:szCs w:val="14"/>
         </w:rPr>
-        <w:t xml:space="preserve">RK-0063  </w:t>
+        <w:t xml:space="preserve">RK-0077  </w:t>
       </w:r>
       <w:r>
         <w:rPr>
@@ -4545,7 +5131,7 @@
           <w:sz w:val="14"/>
           <w:szCs w:val="14"/>
         </w:rPr>
-        <w:t xml:space="preserve">RK-0064  </w:t>
+        <w:t xml:space="preserve">RK-0078  </w:t>
       </w:r>
       <w:r>
         <w:rPr>
@@ -4569,7 +5155,7 @@
           <w:sz w:val="14"/>
           <w:szCs w:val="14"/>
         </w:rPr>
-        <w:t xml:space="preserve">RK-0065  </w:t>
+        <w:t xml:space="preserve">RK-0079  </w:t>
       </w:r>
       <w:r>
         <w:rPr>
@@ -4593,7 +5179,7 @@
           <w:sz w:val="14"/>
           <w:szCs w:val="14"/>
         </w:rPr>
-        <w:t xml:space="preserve">RK-0066  </w:t>
+        <w:t xml:space="preserve">RK-0080  </w:t>
       </w:r>
       <w:r>
         <w:rPr>
@@ -4617,7 +5203,7 @@
           <w:sz w:val="14"/>
           <w:szCs w:val="14"/>
         </w:rPr>
-        <w:t xml:space="preserve">RK-0067  </w:t>
+        <w:t xml:space="preserve">RK-0081  </w:t>
       </w:r>
       <w:r>
         <w:rPr>
@@ -4641,7 +5227,7 @@
           <w:sz w:val="14"/>
           <w:szCs w:val="14"/>
         </w:rPr>
-        <w:t xml:space="preserve">RK-0068  </w:t>
+        <w:t xml:space="preserve">RK-0082  </w:t>
       </w:r>
       <w:r>
         <w:rPr>
@@ -4665,7 +5251,7 @@
           <w:sz w:val="14"/>
           <w:szCs w:val="14"/>
         </w:rPr>
-        <w:t xml:space="preserve">RK-0069  </w:t>
+        <w:t xml:space="preserve">RK-0083  </w:t>
       </w:r>
       <w:r>
         <w:rPr>
@@ -4689,7 +5275,7 @@
           <w:sz w:val="14"/>
           <w:szCs w:val="14"/>
         </w:rPr>
-        <w:t xml:space="preserve">RK-0070  </w:t>
+        <w:t xml:space="preserve">RK-0084  </w:t>
       </w:r>
       <w:r>
         <w:rPr>
@@ -4713,7 +5299,7 @@
           <w:sz w:val="14"/>
           <w:szCs w:val="14"/>
         </w:rPr>
-        <w:t xml:space="preserve">RK-0071  </w:t>
+        <w:t xml:space="preserve">RK-0085  </w:t>
       </w:r>
       <w:r>
         <w:rPr>
@@ -4737,7 +5323,7 @@
           <w:sz w:val="14"/>
           <w:szCs w:val="14"/>
         </w:rPr>
-        <w:t xml:space="preserve">RK-0072  </w:t>
+        <w:t xml:space="preserve">RK-0086  </w:t>
       </w:r>
       <w:r>
         <w:rPr>
@@ -4761,7 +5347,7 @@
           <w:sz w:val="14"/>
           <w:szCs w:val="14"/>
         </w:rPr>
-        <w:t xml:space="preserve">RK-0073  </w:t>
+        <w:t xml:space="preserve">RK-0087  </w:t>
       </w:r>
       <w:r>
         <w:rPr>
@@ -4785,7 +5371,7 @@
           <w:sz w:val="14"/>
           <w:szCs w:val="14"/>
         </w:rPr>
-        <w:t xml:space="preserve">RK-0074  </w:t>
+        <w:t xml:space="preserve">RK-0088  </w:t>
       </w:r>
       <w:r>
         <w:rPr>
@@ -4809,7 +5395,7 @@
           <w:sz w:val="14"/>
           <w:szCs w:val="14"/>
         </w:rPr>
-        <w:t xml:space="preserve">RK-0075  </w:t>
+        <w:t xml:space="preserve">RK-0089  </w:t>
       </w:r>
       <w:r>
         <w:rPr>
@@ -4833,7 +5419,7 @@
           <w:sz w:val="14"/>
           <w:szCs w:val="14"/>
         </w:rPr>
-        <w:t xml:space="preserve">RK-0076  </w:t>
+        <w:t xml:space="preserve">RK-0090  </w:t>
       </w:r>
       <w:r>
         <w:rPr>
@@ -4857,7 +5443,7 @@
           <w:sz w:val="14"/>
           <w:szCs w:val="14"/>
         </w:rPr>
-        <w:t xml:space="preserve">RK-0077  </w:t>
+        <w:t xml:space="preserve">RK-0091  </w:t>
       </w:r>
       <w:r>
         <w:rPr>
@@ -4881,7 +5467,7 @@
           <w:sz w:val="14"/>
           <w:szCs w:val="14"/>
         </w:rPr>
-        <w:t xml:space="preserve">RK-0078  </w:t>
+        <w:t xml:space="preserve">RK-0092  </w:t>
       </w:r>
       <w:r>
         <w:rPr>
@@ -4905,7 +5491,7 @@
           <w:sz w:val="14"/>
           <w:szCs w:val="14"/>
         </w:rPr>
-        <w:t xml:space="preserve">RK-0079  </w:t>
+        <w:t xml:space="preserve">RK-0093  </w:t>
       </w:r>
       <w:r>
         <w:rPr>
@@ -4929,7 +5515,7 @@
           <w:sz w:val="14"/>
           <w:szCs w:val="14"/>
         </w:rPr>
-        <w:t xml:space="preserve">RK-0080  </w:t>
+        <w:t xml:space="preserve">RK-0094  </w:t>
       </w:r>
       <w:r>
         <w:rPr>
@@ -4953,7 +5539,7 @@
           <w:sz w:val="14"/>
           <w:szCs w:val="14"/>
         </w:rPr>
-        <w:t xml:space="preserve">RK-0081  </w:t>
+        <w:t xml:space="preserve">RK-0095  </w:t>
       </w:r>
       <w:r>
         <w:rPr>
@@ -4977,7 +5563,7 @@
           <w:sz w:val="14"/>
           <w:szCs w:val="14"/>
         </w:rPr>
-        <w:t xml:space="preserve">RK-0082  </w:t>
+        <w:t xml:space="preserve">RK-0096  </w:t>
       </w:r>
       <w:r>
         <w:rPr>
@@ -5001,7 +5587,7 @@
           <w:sz w:val="14"/>
           <w:szCs w:val="14"/>
         </w:rPr>
-        <w:t xml:space="preserve">RK-0083  </w:t>
+        <w:t xml:space="preserve">RK-0097  </w:t>
       </w:r>
       <w:r>
         <w:rPr>
@@ -5025,7 +5611,7 @@
           <w:sz w:val="14"/>
           <w:szCs w:val="14"/>
         </w:rPr>
-        <w:t xml:space="preserve">RK-0084  </w:t>
+        <w:t xml:space="preserve">RK-0098  </w:t>
       </w:r>
       <w:r>
         <w:rPr>
@@ -5049,7 +5635,7 @@
           <w:sz w:val="14"/>
           <w:szCs w:val="14"/>
         </w:rPr>
-        <w:t xml:space="preserve">RK-0085  </w:t>
+        <w:t xml:space="preserve">RK-0099  </w:t>
       </w:r>
       <w:r>
         <w:rPr>
@@ -5073,7 +5659,7 @@
           <w:sz w:val="14"/>
           <w:szCs w:val="14"/>
         </w:rPr>
-        <w:t xml:space="preserve">RK-0086  </w:t>
+        <w:t xml:space="preserve">RK-0100  </w:t>
       </w:r>
       <w:r>
         <w:rPr>
@@ -5097,7 +5683,7 @@
           <w:sz w:val="14"/>
           <w:szCs w:val="14"/>
         </w:rPr>
-        <w:t xml:space="preserve">RK-0087  </w:t>
+        <w:t xml:space="preserve">RK-0101  </w:t>
       </w:r>
       <w:r>
         <w:rPr>
@@ -5121,7 +5707,7 @@
           <w:sz w:val="14"/>
           <w:szCs w:val="14"/>
         </w:rPr>
-        <w:t xml:space="preserve">RK-0088  </w:t>
+        <w:t xml:space="preserve">RK-0102  </w:t>
       </w:r>
       <w:r>
         <w:rPr>
@@ -5145,7 +5731,7 @@
           <w:sz w:val="14"/>
           <w:szCs w:val="14"/>
         </w:rPr>
-        <w:t xml:space="preserve">RK-0089  </w:t>
+        <w:t xml:space="preserve">RK-0103  </w:t>
       </w:r>
       <w:r>
         <w:rPr>
@@ -5169,7 +5755,7 @@
           <w:sz w:val="14"/>
           <w:szCs w:val="14"/>
         </w:rPr>
-        <w:t xml:space="preserve">RK-0090  </w:t>
+        <w:t xml:space="preserve">RK-0104  </w:t>
       </w:r>
       <w:r>
         <w:rPr>
@@ -5193,7 +5779,7 @@
           <w:sz w:val="14"/>
           <w:szCs w:val="14"/>
         </w:rPr>
-        <w:t xml:space="preserve">RK-0091  </w:t>
+        <w:t xml:space="preserve">RK-0105  </w:t>
       </w:r>
       <w:r>
         <w:rPr>
@@ -5217,7 +5803,7 @@
           <w:sz w:val="14"/>
           <w:szCs w:val="14"/>
         </w:rPr>
-        <w:t xml:space="preserve">RK-0092  </w:t>
+        <w:t xml:space="preserve">RK-0106  </w:t>
       </w:r>
       <w:r>
         <w:rPr>
@@ -5241,7 +5827,7 @@
           <w:sz w:val="14"/>
           <w:szCs w:val="14"/>
         </w:rPr>
-        <w:t xml:space="preserve">RK-0093  </w:t>
+        <w:t xml:space="preserve">RK-0107  </w:t>
       </w:r>
       <w:r>
         <w:rPr>
@@ -5265,7 +5851,7 @@
           <w:sz w:val="14"/>
           <w:szCs w:val="14"/>
         </w:rPr>
-        <w:t xml:space="preserve">RK-0094  </w:t>
+        <w:t xml:space="preserve">RK-0108  </w:t>
       </w:r>
       <w:r>
         <w:rPr>
@@ -5289,7 +5875,7 @@
           <w:sz w:val="14"/>
           <w:szCs w:val="14"/>
         </w:rPr>
-        <w:t xml:space="preserve">RK-0095  </w:t>
+        <w:t xml:space="preserve">RK-0109  </w:t>
       </w:r>
       <w:r>
         <w:rPr>
@@ -5313,7 +5899,7 @@
           <w:sz w:val="14"/>
           <w:szCs w:val="14"/>
         </w:rPr>
-        <w:t xml:space="preserve">RK-0096  </w:t>
+        <w:t xml:space="preserve">RK-0110  </w:t>
       </w:r>
       <w:r>
         <w:rPr>
@@ -5337,7 +5923,7 @@
           <w:sz w:val="14"/>
           <w:szCs w:val="14"/>
         </w:rPr>
-        <w:t xml:space="preserve">RK-0097  </w:t>
+        <w:t xml:space="preserve">RK-0111  </w:t>
       </w:r>
       <w:r>
         <w:rPr>
@@ -5361,7 +5947,7 @@
           <w:sz w:val="14"/>
           <w:szCs w:val="14"/>
         </w:rPr>
-        <w:t xml:space="preserve">RK-0098  </w:t>
+        <w:t xml:space="preserve">RK-0112  </w:t>
       </w:r>
       <w:r>
         <w:rPr>
@@ -5385,7 +5971,7 @@
           <w:sz w:val="14"/>
           <w:szCs w:val="14"/>
         </w:rPr>
-        <w:t xml:space="preserve">RK-0099  </w:t>
+        <w:t xml:space="preserve">RK-0113  </w:t>
       </w:r>
       <w:r>
         <w:rPr>
@@ -5409,7 +5995,7 @@
           <w:sz w:val="14"/>
           <w:szCs w:val="14"/>
         </w:rPr>
-        <w:t xml:space="preserve">RK-0100  </w:t>
+        <w:t xml:space="preserve">RK-0114  </w:t>
       </w:r>
       <w:r>
         <w:rPr>
@@ -5433,7 +6019,7 @@
           <w:sz w:val="14"/>
           <w:szCs w:val="14"/>
         </w:rPr>
-        <w:t xml:space="preserve">RK-0101  </w:t>
+        <w:t xml:space="preserve">RK-0115  </w:t>
       </w:r>
       <w:r>
         <w:rPr>
@@ -5457,7 +6043,7 @@
           <w:sz w:val="14"/>
           <w:szCs w:val="14"/>
         </w:rPr>
-        <w:t xml:space="preserve">RK-0102  </w:t>
+        <w:t xml:space="preserve">RK-0116  </w:t>
       </w:r>
       <w:r>
         <w:rPr>
@@ -5481,7 +6067,7 @@
           <w:sz w:val="14"/>
           <w:szCs w:val="14"/>
         </w:rPr>
-        <w:t xml:space="preserve">RK-0103  </w:t>
+        <w:t xml:space="preserve">RK-0117  </w:t>
       </w:r>
       <w:r>
         <w:rPr>
@@ -5505,7 +6091,7 @@
           <w:sz w:val="14"/>
           <w:szCs w:val="14"/>
         </w:rPr>
-        <w:t xml:space="preserve">RK-0104  </w:t>
+        <w:t xml:space="preserve">RK-0118  </w:t>
       </w:r>
       <w:r>
         <w:rPr>
@@ -5529,7 +6115,7 @@
           <w:sz w:val="14"/>
           <w:szCs w:val="14"/>
         </w:rPr>
-        <w:t xml:space="preserve">RK-0105  </w:t>
+        <w:t xml:space="preserve">RK-0119  </w:t>
       </w:r>
       <w:r>
         <w:rPr>
@@ -5553,7 +6139,7 @@
           <w:sz w:val="14"/>
           <w:szCs w:val="14"/>
         </w:rPr>
-        <w:t xml:space="preserve">RK-0106  </w:t>
+        <w:t xml:space="preserve">RK-0120  </w:t>
       </w:r>
       <w:r>
         <w:rPr>
@@ -5577,7 +6163,7 @@
           <w:sz w:val="14"/>
           <w:szCs w:val="14"/>
         </w:rPr>
-        <w:t xml:space="preserve">RK-0107  </w:t>
+        <w:t xml:space="preserve">RK-0121  </w:t>
       </w:r>
       <w:r>
         <w:rPr>
@@ -5601,7 +6187,7 @@
           <w:sz w:val="14"/>
           <w:szCs w:val="14"/>
         </w:rPr>
-        <w:t xml:space="preserve">RK-0108  </w:t>
+        <w:t xml:space="preserve">RK-0122  </w:t>
       </w:r>
       <w:r>
         <w:rPr>
@@ -5625,7 +6211,7 @@
           <w:sz w:val="14"/>
           <w:szCs w:val="14"/>
         </w:rPr>
-        <w:t xml:space="preserve">RK-0109  </w:t>
+        <w:t xml:space="preserve">RK-0123  </w:t>
       </w:r>
       <w:r>
         <w:rPr>
@@ -5649,7 +6235,7 @@
           <w:sz w:val="14"/>
           <w:szCs w:val="14"/>
         </w:rPr>
-        <w:t xml:space="preserve">RK-0110  </w:t>
+        <w:t xml:space="preserve">RK-0124  </w:t>
       </w:r>
       <w:r>
         <w:rPr>
@@ -5673,7 +6259,7 @@
           <w:sz w:val="14"/>
           <w:szCs w:val="14"/>
         </w:rPr>
-        <w:t xml:space="preserve">RK-0111  </w:t>
+        <w:t xml:space="preserve">RK-0125  </w:t>
       </w:r>
       <w:r>
         <w:rPr>
@@ -5697,7 +6283,7 @@
           <w:sz w:val="14"/>
           <w:szCs w:val="14"/>
         </w:rPr>
-        <w:t xml:space="preserve">RK-0112  </w:t>
+        <w:t xml:space="preserve">RK-0126  </w:t>
       </w:r>
       <w:r>
         <w:rPr>
@@ -5721,7 +6307,7 @@
           <w:sz w:val="14"/>
           <w:szCs w:val="14"/>
         </w:rPr>
-        <w:t xml:space="preserve">RK-0113  </w:t>
+        <w:t xml:space="preserve">RK-0127  </w:t>
       </w:r>
       <w:r>
         <w:rPr>
@@ -5745,7 +6331,7 @@
           <w:sz w:val="14"/>
           <w:szCs w:val="14"/>
         </w:rPr>
-        <w:t xml:space="preserve">RK-0114  </w:t>
+        <w:t xml:space="preserve">RK-0128  </w:t>
       </w:r>
       <w:r>
         <w:rPr>
@@ -5769,7 +6355,7 @@
           <w:sz w:val="14"/>
           <w:szCs w:val="14"/>
         </w:rPr>
-        <w:t xml:space="preserve">RK-0115  </w:t>
+        <w:t xml:space="preserve">RK-0129  </w:t>
       </w:r>
       <w:r>
         <w:rPr>
@@ -5809,7 +6395,7 @@
           <w:sz w:val="14"/>
           <w:szCs w:val="14"/>
         </w:rPr>
-        <w:t xml:space="preserve">RK-0116  </w:t>
+        <w:t xml:space="preserve">RK-0130  </w:t>
       </w:r>
       <w:r>
         <w:rPr>
@@ -5846,7 +6432,7 @@
           <w:sz w:val="14"/>
           <w:szCs w:val="14"/>
         </w:rPr>
-        <w:t xml:space="preserve">RK-0117  </w:t>
+        <w:t xml:space="preserve">RK-0131  </w:t>
       </w:r>
       <w:r>
         <w:rPr>
@@ -5886,22 +6472,31 @@
           <w:sz w:val="34"/>
           <w:szCs w:val="34"/>
         </w:rPr>
-        <w:t xml:space="preserve">Fazendo as Malas — bagagem aerea</w:t>
-      </w:r>
-    </w:p>
-    <w:p>
-      <w:pPr>
-        <w:pStyle w:val="Heading2"/>
-        <w:spacing w:after="120" w:before="280"/>
-      </w:pPr>
-      <w:r>
-        <w:rPr>
-          <w:b/>
-          <w:bCs/>
-          <w:sz w:val="26"/>
-          <w:szCs w:val="26"/>
-        </w:rPr>
-        <w:t xml:space="preserve">Bagagem Aérea: o que pode e onde</w:t>
+        <w:t xml:space="preserve">Radar Sazonal (Brasil) — raios e temporais</w:t>
+      </w:r>
+    </w:p>
+    <w:p>
+      <w:pPr>
+        <w:pStyle w:val="Heading2"/>
+        <w:spacing w:after="120" w:before="280"/>
+      </w:pPr>
+      <w:r>
+        <w:rPr>
+          <w:rFonts w:ascii="Consolas" w:cs="Consolas" w:eastAsia="Consolas" w:hAnsi="Consolas"/>
+          <w:color w:val="9AA0A6"/>
+          <w:sz w:val="14"/>
+          <w:szCs w:val="14"/>
+        </w:rPr>
+        <w:t xml:space="preserve">RK-0132  </w:t>
+      </w:r>
+      <w:r>
+        <w:rPr>
+          <w:b/>
+          <w:bCs/>
+          <w:sz w:val="26"/>
+          <w:szCs w:val="26"/>
+        </w:rPr>
+        <w:t xml:space="preserve">Temporada de chuvas fortes</w:t>
       </w:r>
     </w:p>
     <w:p>
@@ -5917,28 +6512,28 @@
           <w:sz w:val="16"/>
           <w:szCs w:val="16"/>
         </w:rPr>
-        <w:t xml:space="preserve">INTRODUCAO</w:t>
-      </w:r>
-    </w:p>
-    <w:p>
-      <w:pPr>
-        <w:spacing w:after="160" w:line="300"/>
-      </w:pPr>
-      <w:r>
-        <w:rPr>
-          <w:rFonts w:ascii="Consolas" w:cs="Consolas" w:eastAsia="Consolas" w:hAnsi="Consolas"/>
-          <w:color w:val="9AA0A6"/>
-          <w:sz w:val="14"/>
-          <w:szCs w:val="14"/>
-        </w:rPr>
-        <w:t xml:space="preserve">RK-0118  </w:t>
-      </w:r>
-      <w:r>
-        <w:rPr>
-          <w:sz w:val="22"/>
-          <w:szCs w:val="22"/>
-        </w:rPr>
-        <w:t xml:space="preserve">Vai de avião? Estas regras ajudam a evitar problemas no embarque. Mudaram em 2026 — confirme com a sua companhia aérea.</w:t>
+        <w:t xml:space="preserve">RESUMO</w:t>
+      </w:r>
+    </w:p>
+    <w:p>
+      <w:pPr>
+        <w:spacing w:after="160" w:line="300"/>
+      </w:pPr>
+      <w:r>
+        <w:rPr>
+          <w:rFonts w:ascii="Consolas" w:cs="Consolas" w:eastAsia="Consolas" w:hAnsi="Consolas"/>
+          <w:color w:val="9AA0A6"/>
+          <w:sz w:val="14"/>
+          <w:szCs w:val="14"/>
+        </w:rPr>
+        <w:t xml:space="preserve">RK-0133  </w:t>
+      </w:r>
+      <w:r>
+        <w:rPr>
+          <w:sz w:val="22"/>
+          <w:szCs w:val="22"/>
+        </w:rPr>
+        <w:t xml:space="preserve">As tempestades de verão trazem alagamento, deslizamento e choque elétrico em casa alagada. Para raios, veja o alerta próprio.</w:t>
       </w:r>
     </w:p>
     <w:p>
@@ -5954,44 +6549,674 @@
           <w:sz w:val="18"/>
           <w:szCs w:val="18"/>
         </w:rPr>
-        <w:t xml:space="preserve">ANTES (até 22/10/2026): Vai de avião? Estas regras evitam barreira no embarque. Mudaram em 2026 — confirme com a sua companhia.</w:t>
-      </w:r>
-    </w:p>
-    <w:p>
-      <w:pPr>
-        <w:spacing w:after="160" w:line="300"/>
-      </w:pPr>
-      <w:r>
-        <w:rPr>
-          <w:rFonts w:ascii="Consolas" w:cs="Consolas" w:eastAsia="Consolas" w:hAnsi="Consolas"/>
-          <w:color w:val="9AA0A6"/>
-          <w:sz w:val="14"/>
-          <w:szCs w:val="14"/>
-        </w:rPr>
-        <w:t xml:space="preserve">RK-0119  </w:t>
-      </w:r>
-      <w:r>
-        <w:rPr>
-          <w:sz w:val="22"/>
-          <w:szCs w:val="22"/>
-        </w:rPr>
-        <w:t xml:space="preserve">Leve na bagagem de mão, na embalagem original e com a receita (física ou digital) — sobretudo os de uso contínuo e de tarja preta. Em viagem internacional, leve a receita com o nome do princípio ativo e, se possível, uma tradução para o inglês ou para o idioma do destino; alguns países exigem autorização prévia para remédios controlados — consulte a embaixada ou o consulado.</w:t>
-      </w:r>
-    </w:p>
-    <w:p>
-      <w:pPr>
-        <w:spacing w:after="160" w:before="0"/>
-        <w:ind w:left="360"/>
-      </w:pPr>
-      <w:r>
-        <w:rPr>
-          <w:i/>
-          <w:iCs/>
-          <w:color w:val="8A6D00"/>
-          <w:sz w:val="18"/>
-          <w:szCs w:val="18"/>
-        </w:rPr>
-        <w:t xml:space="preserve">ANTES (até 22/10/2026): Só na bagagem de mão, nunca na despachada. Até 2 por pessoa, de até 100 Wh; de 100 a 160 Wh, só com autorização da companhia; acima disso, proibido. A bordo: não recarregue o power bank, não ligue na USB do avião, evite usá-lo para carregar outros aparelhos e guarde na bolsa embaixo do assento ou no bolsão — nunca no compartimento de cima. A companhia pode ter regra mais rígida.</w:t>
+        <w:t xml:space="preserve">ANTES (até 22/10/2026): O Brasil é o país com mais raios no mundo, e as tempestades de verão trazem alagamento, deslizamento e choque elétrico em casa alagada. Cerca de 1 em cada 5 mortes por raio acontece com a pessoa dentro de casa, perto da rede elétrica ou hidráulica.</w:t>
+      </w:r>
+    </w:p>
+    <w:p>
+      <w:pPr>
+        <w:pStyle w:val="Heading2"/>
+        <w:spacing w:after="120" w:before="280"/>
+      </w:pPr>
+      <w:r>
+        <w:rPr>
+          <w:rFonts w:ascii="Consolas" w:cs="Consolas" w:eastAsia="Consolas" w:hAnsi="Consolas"/>
+          <w:color w:val="9AA0A6"/>
+          <w:sz w:val="14"/>
+          <w:szCs w:val="14"/>
+        </w:rPr>
+        <w:t xml:space="preserve">RK-0134  </w:t>
+      </w:r>
+      <w:r>
+        <w:rPr>
+          <w:b/>
+          <w:bCs/>
+          <w:sz w:val="26"/>
+          <w:szCs w:val="26"/>
+        </w:rPr>
+        <w:t xml:space="preserve">Raios: proteção dentro e fora de casa</w:t>
+      </w:r>
+    </w:p>
+    <w:p>
+      <w:pPr>
+        <w:spacing w:after="60" w:before="180"/>
+      </w:pPr>
+      <w:r>
+        <w:rPr>
+          <w:b/>
+          <w:bCs/>
+          <w:color w:val="9AA0A6"/>
+          <w:spacing w:val="20"/>
+          <w:sz w:val="16"/>
+          <w:szCs w:val="16"/>
+        </w:rPr>
+        <w:t xml:space="preserve">RESUMO</w:t>
+      </w:r>
+    </w:p>
+    <w:p>
+      <w:pPr>
+        <w:spacing w:after="160" w:line="300"/>
+      </w:pPr>
+      <w:r>
+        <w:rPr>
+          <w:rFonts w:ascii="Consolas" w:cs="Consolas" w:eastAsia="Consolas" w:hAnsi="Consolas"/>
+          <w:color w:val="9AA0A6"/>
+          <w:sz w:val="14"/>
+          <w:szCs w:val="14"/>
+        </w:rPr>
+        <w:t xml:space="preserve">RK-0135  </w:t>
+      </w:r>
+      <w:r>
+        <w:rPr>
+          <w:sz w:val="22"/>
+          <w:szCs w:val="22"/>
+        </w:rPr>
+        <w:t xml:space="preserve">O Brasil é o país com mais raios no mundo e, em média, cerca de 100 pessoas morrem atingidas por ano. Cerca de 1 em cada 5 dessas mortes acontece dentro de casa, perto da rede elétrica ou hidráulica. Ouviu trovão, o raio já pode alcançar você.</w:t>
+      </w:r>
+    </w:p>
+    <w:p>
+      <w:pPr>
+        <w:spacing w:after="160" w:before="0"/>
+        <w:ind w:left="360"/>
+      </w:pPr>
+      <w:r>
+        <w:rPr>
+          <w:i/>
+          <w:iCs/>
+          <w:color w:val="065F46"/>
+          <w:sz w:val="18"/>
+          <w:szCs w:val="18"/>
+        </w:rPr>
+        <w:t xml:space="preserve">NOVO EM 22/10/2026 — este texto nao existia.</w:t>
+      </w:r>
+    </w:p>
+    <w:p>
+      <w:pPr>
+        <w:spacing w:after="60" w:before="180"/>
+      </w:pPr>
+      <w:r>
+        <w:rPr>
+          <w:b/>
+          <w:bCs/>
+          <w:color w:val="9AA0A6"/>
+          <w:spacing w:val="20"/>
+          <w:sz w:val="16"/>
+          <w:szCs w:val="16"/>
+        </w:rPr>
+        <w:t xml:space="preserve">ORIENTACOES</w:t>
+      </w:r>
+    </w:p>
+    <w:p>
+      <w:pPr>
+        <w:spacing w:after="160" w:line="300"/>
+      </w:pPr>
+      <w:r>
+        <w:rPr>
+          <w:rFonts w:ascii="Consolas" w:cs="Consolas" w:eastAsia="Consolas" w:hAnsi="Consolas"/>
+          <w:color w:val="9AA0A6"/>
+          <w:sz w:val="14"/>
+          <w:szCs w:val="14"/>
+        </w:rPr>
+        <w:t xml:space="preserve">RK-0136  </w:t>
+      </w:r>
+      <w:r>
+        <w:rPr>
+          <w:sz w:val="22"/>
+          <w:szCs w:val="22"/>
+        </w:rPr>
+        <w:t xml:space="preserve">Ouviu trovão: procure abrigo e só saia 30 minutos depois do último trovão. Abrigo seguro é dentro de casa ou de um carro fechado — quiosque, guarda-sol, barraca e árvore não protegem.</w:t>
+      </w:r>
+    </w:p>
+    <w:p>
+      <w:pPr>
+        <w:spacing w:after="160" w:before="0"/>
+        <w:ind w:left="360"/>
+      </w:pPr>
+      <w:r>
+        <w:rPr>
+          <w:i/>
+          <w:iCs/>
+          <w:color w:val="065F46"/>
+          <w:sz w:val="18"/>
+          <w:szCs w:val="18"/>
+        </w:rPr>
+        <w:t xml:space="preserve">NOVO EM 22/10/2026 — este texto nao existia.</w:t>
+      </w:r>
+    </w:p>
+    <w:p>
+      <w:pPr>
+        <w:spacing w:after="160" w:line="300"/>
+      </w:pPr>
+      <w:r>
+        <w:rPr>
+          <w:rFonts w:ascii="Consolas" w:cs="Consolas" w:eastAsia="Consolas" w:hAnsi="Consolas"/>
+          <w:color w:val="9AA0A6"/>
+          <w:sz w:val="14"/>
+          <w:szCs w:val="14"/>
+        </w:rPr>
+        <w:t xml:space="preserve">RK-0137  </w:t>
+      </w:r>
+      <w:r>
+        <w:rPr>
+          <w:sz w:val="22"/>
+          <w:szCs w:val="22"/>
+        </w:rPr>
+        <w:t xml:space="preserve">Fora de casa, saia de campo aberto, praia, piscina, rio, laje e quadra; fique longe de árvores isoladas, cercas de arame e postes. Não solte pipa.</w:t>
+      </w:r>
+    </w:p>
+    <w:p>
+      <w:pPr>
+        <w:spacing w:after="160" w:before="0"/>
+        <w:ind w:left="360"/>
+      </w:pPr>
+      <w:r>
+        <w:rPr>
+          <w:i/>
+          <w:iCs/>
+          <w:color w:val="065F46"/>
+          <w:sz w:val="18"/>
+          <w:szCs w:val="18"/>
+        </w:rPr>
+        <w:t xml:space="preserve">NOVO EM 22/10/2026 — este texto nao existia.</w:t>
+      </w:r>
+    </w:p>
+    <w:p>
+      <w:pPr>
+        <w:spacing w:after="160" w:line="300"/>
+      </w:pPr>
+      <w:r>
+        <w:rPr>
+          <w:rFonts w:ascii="Consolas" w:cs="Consolas" w:eastAsia="Consolas" w:hAnsi="Consolas"/>
+          <w:color w:val="9AA0A6"/>
+          <w:sz w:val="14"/>
+          <w:szCs w:val="14"/>
+        </w:rPr>
+        <w:t xml:space="preserve">RK-0138  </w:t>
+      </w:r>
+      <w:r>
+        <w:rPr>
+          <w:sz w:val="22"/>
+          <w:szCs w:val="22"/>
+        </w:rPr>
+        <w:t xml:space="preserve">Sem abrigo por perto, como último recurso: agache-se com os pés juntos, a cabeça abaixada e longe de outras pessoas — não se deite no chão.</w:t>
+      </w:r>
+    </w:p>
+    <w:p>
+      <w:pPr>
+        <w:spacing w:after="160" w:before="0"/>
+        <w:ind w:left="360"/>
+      </w:pPr>
+      <w:r>
+        <w:rPr>
+          <w:i/>
+          <w:iCs/>
+          <w:color w:val="065F46"/>
+          <w:sz w:val="18"/>
+          <w:szCs w:val="18"/>
+        </w:rPr>
+        <w:t xml:space="preserve">NOVO EM 22/10/2026 — este texto nao existia.</w:t>
+      </w:r>
+    </w:p>
+    <w:p>
+      <w:pPr>
+        <w:spacing w:after="160" w:line="300"/>
+      </w:pPr>
+      <w:r>
+        <w:rPr>
+          <w:rFonts w:ascii="Consolas" w:cs="Consolas" w:eastAsia="Consolas" w:hAnsi="Consolas"/>
+          <w:color w:val="9AA0A6"/>
+          <w:sz w:val="14"/>
+          <w:szCs w:val="14"/>
+        </w:rPr>
+        <w:t xml:space="preserve">RK-0139  </w:t>
+      </w:r>
+      <w:r>
+        <w:rPr>
+          <w:sz w:val="22"/>
+          <w:szCs w:val="22"/>
+        </w:rPr>
+        <w:t xml:space="preserve">Em casa, durante a tempestade: nada de banho de chuveiro elétrico, torneiras ou aparelhos ligados na tomada. Antes de ela chegar, tire da tomada os eletrônicos que puder.</w:t>
+      </w:r>
+    </w:p>
+    <w:p>
+      <w:pPr>
+        <w:spacing w:after="160" w:before="0"/>
+        <w:ind w:left="360"/>
+      </w:pPr>
+      <w:r>
+        <w:rPr>
+          <w:i/>
+          <w:iCs/>
+          <w:color w:val="065F46"/>
+          <w:sz w:val="18"/>
+          <w:szCs w:val="18"/>
+        </w:rPr>
+        <w:t xml:space="preserve">NOVO EM 22/10/2026 — este texto nao existia.</w:t>
+      </w:r>
+    </w:p>
+    <w:p>
+      <w:pPr>
+        <w:spacing w:after="160" w:line="300"/>
+      </w:pPr>
+      <w:r>
+        <w:rPr>
+          <w:rFonts w:ascii="Consolas" w:cs="Consolas" w:eastAsia="Consolas" w:hAnsi="Consolas"/>
+          <w:color w:val="9AA0A6"/>
+          <w:sz w:val="14"/>
+          <w:szCs w:val="14"/>
+        </w:rPr>
+        <w:t xml:space="preserve">RK-0140  </w:t>
+      </w:r>
+      <w:r>
+        <w:rPr>
+          <w:sz w:val="22"/>
+          <w:szCs w:val="22"/>
+        </w:rPr>
+        <w:t xml:space="preserve">Prédios e casas altas ou isoladas (sítio, chácara) podem precisar de para-raios. A instalação e a inspeção periódica são trabalho de profissional habilitado.</w:t>
+      </w:r>
+    </w:p>
+    <w:p>
+      <w:pPr>
+        <w:spacing w:after="160" w:before="0"/>
+        <w:ind w:left="360"/>
+      </w:pPr>
+      <w:r>
+        <w:rPr>
+          <w:i/>
+          <w:iCs/>
+          <w:color w:val="065F46"/>
+          <w:sz w:val="18"/>
+          <w:szCs w:val="18"/>
+        </w:rPr>
+        <w:t xml:space="preserve">NOVO EM 22/10/2026 — este texto nao existia.</w:t>
+      </w:r>
+    </w:p>
+    <w:p>
+      <w:pPr>
+        <w:spacing w:after="160" w:line="300"/>
+      </w:pPr>
+      <w:r>
+        <w:rPr>
+          <w:rFonts w:ascii="Consolas" w:cs="Consolas" w:eastAsia="Consolas" w:hAnsi="Consolas"/>
+          <w:color w:val="9AA0A6"/>
+          <w:sz w:val="14"/>
+          <w:szCs w:val="14"/>
+        </w:rPr>
+        <w:t xml:space="preserve">RK-0141  </w:t>
+      </w:r>
+      <w:r>
+        <w:rPr>
+          <w:sz w:val="22"/>
+          <w:szCs w:val="22"/>
+        </w:rPr>
+        <w:t xml:space="preserve">Traga os pets para dentro antes da tempestade e não os deixe amarrados no quintal: com medo do trovão, eles fogem e se machucam.</w:t>
+      </w:r>
+    </w:p>
+    <w:p>
+      <w:pPr>
+        <w:spacing w:after="160" w:before="0"/>
+        <w:ind w:left="360"/>
+      </w:pPr>
+      <w:r>
+        <w:rPr>
+          <w:i/>
+          <w:iCs/>
+          <w:color w:val="065F46"/>
+          <w:sz w:val="18"/>
+          <w:szCs w:val="18"/>
+        </w:rPr>
+        <w:t xml:space="preserve">NOVO EM 22/10/2026 — este texto nao existia.</w:t>
+      </w:r>
+    </w:p>
+    <w:p>
+      <w:pPr>
+        <w:spacing w:after="160" w:line="300"/>
+      </w:pPr>
+      <w:r>
+        <w:rPr>
+          <w:rFonts w:ascii="Consolas" w:cs="Consolas" w:eastAsia="Consolas" w:hAnsi="Consolas"/>
+          <w:color w:val="9AA0A6"/>
+          <w:sz w:val="14"/>
+          <w:szCs w:val="14"/>
+        </w:rPr>
+        <w:t xml:space="preserve">RK-0142  </w:t>
+      </w:r>
+      <w:r>
+        <w:rPr>
+          <w:sz w:val="22"/>
+          <w:szCs w:val="22"/>
+        </w:rPr>
+        <w:t xml:space="preserve">Se alguém for atingido, socorra na hora: o corpo da vítima não fica com carga elétrica. Veja Primeiros Socorros › Atingido por Raio.</w:t>
+      </w:r>
+    </w:p>
+    <w:p>
+      <w:pPr>
+        <w:spacing w:after="160" w:before="0"/>
+        <w:ind w:left="360"/>
+      </w:pPr>
+      <w:r>
+        <w:rPr>
+          <w:i/>
+          <w:iCs/>
+          <w:color w:val="065F46"/>
+          <w:sz w:val="18"/>
+          <w:szCs w:val="18"/>
+        </w:rPr>
+        <w:t xml:space="preserve">NOVO EM 22/10/2026 — este texto nao existia.</w:t>
+      </w:r>
+    </w:p>
+    <w:p>
+      <w:pPr>
+        <w:pStyle w:val="Heading2"/>
+        <w:spacing w:after="120" w:before="280"/>
+      </w:pPr>
+      <w:r>
+        <w:rPr>
+          <w:rFonts w:ascii="Consolas" w:cs="Consolas" w:eastAsia="Consolas" w:hAnsi="Consolas"/>
+          <w:color w:val="9AA0A6"/>
+          <w:sz w:val="14"/>
+          <w:szCs w:val="14"/>
+        </w:rPr>
+        <w:t xml:space="preserve">RK-0143  </w:t>
+      </w:r>
+      <w:r>
+        <w:rPr>
+          <w:b/>
+          <w:bCs/>
+          <w:sz w:val="26"/>
+          <w:szCs w:val="26"/>
+        </w:rPr>
+        <w:t xml:space="preserve">Vendaval, granizo e ciclone no Sul</w:t>
+      </w:r>
+    </w:p>
+    <w:p>
+      <w:pPr>
+        <w:spacing w:after="60" w:before="180"/>
+      </w:pPr>
+      <w:r>
+        <w:rPr>
+          <w:b/>
+          <w:bCs/>
+          <w:color w:val="9AA0A6"/>
+          <w:spacing w:val="20"/>
+          <w:sz w:val="16"/>
+          <w:szCs w:val="16"/>
+        </w:rPr>
+        <w:t xml:space="preserve">RESUMO</w:t>
+      </w:r>
+    </w:p>
+    <w:p>
+      <w:pPr>
+        <w:spacing w:after="160" w:line="300"/>
+      </w:pPr>
+      <w:r>
+        <w:rPr>
+          <w:rFonts w:ascii="Consolas" w:cs="Consolas" w:eastAsia="Consolas" w:hAnsi="Consolas"/>
+          <w:color w:val="9AA0A6"/>
+          <w:sz w:val="14"/>
+          <w:szCs w:val="14"/>
+        </w:rPr>
+        <w:t xml:space="preserve">RK-0144  </w:t>
+      </w:r>
+      <w:r>
+        <w:rPr>
+          <w:sz w:val="22"/>
+          <w:szCs w:val="22"/>
+        </w:rPr>
+        <w:t xml:space="preserve">No Sul, ciclones extratropicais e temporais trazem vento forte, granizo e queda de árvores e de fios. Em geral, a previsão chega com um ou dois dias de antecedência — dá tempo de preparar a casa.</w:t>
+      </w:r>
+    </w:p>
+    <w:p>
+      <w:pPr>
+        <w:spacing w:after="160" w:before="0"/>
+        <w:ind w:left="360"/>
+      </w:pPr>
+      <w:r>
+        <w:rPr>
+          <w:i/>
+          <w:iCs/>
+          <w:color w:val="065F46"/>
+          <w:sz w:val="18"/>
+          <w:szCs w:val="18"/>
+        </w:rPr>
+        <w:t xml:space="preserve">NOVO EM 22/10/2026 — este texto nao existia.</w:t>
+      </w:r>
+    </w:p>
+    <w:p>
+      <w:pPr>
+        <w:spacing w:after="60" w:before="180"/>
+      </w:pPr>
+      <w:r>
+        <w:rPr>
+          <w:b/>
+          <w:bCs/>
+          <w:color w:val="9AA0A6"/>
+          <w:spacing w:val="20"/>
+          <w:sz w:val="16"/>
+          <w:szCs w:val="16"/>
+        </w:rPr>
+        <w:t xml:space="preserve">ORIENTACOES</w:t>
+      </w:r>
+    </w:p>
+    <w:p>
+      <w:pPr>
+        <w:spacing w:after="160" w:line="300"/>
+      </w:pPr>
+      <w:r>
+        <w:rPr>
+          <w:rFonts w:ascii="Consolas" w:cs="Consolas" w:eastAsia="Consolas" w:hAnsi="Consolas"/>
+          <w:color w:val="9AA0A6"/>
+          <w:sz w:val="14"/>
+          <w:szCs w:val="14"/>
+        </w:rPr>
+        <w:t xml:space="preserve">RK-0145  </w:t>
+      </w:r>
+      <w:r>
+        <w:rPr>
+          <w:sz w:val="22"/>
+          <w:szCs w:val="22"/>
+        </w:rPr>
+        <w:t xml:space="preserve">Cadastre seu CEP para alertas da Defesa Civil (SMS para 40199, gratuito) e deixe ligados os alertas de emergência do celular.</w:t>
+      </w:r>
+    </w:p>
+    <w:p>
+      <w:pPr>
+        <w:spacing w:after="160" w:before="0"/>
+        <w:ind w:left="360"/>
+      </w:pPr>
+      <w:r>
+        <w:rPr>
+          <w:i/>
+          <w:iCs/>
+          <w:color w:val="065F46"/>
+          <w:sz w:val="18"/>
+          <w:szCs w:val="18"/>
+        </w:rPr>
+        <w:t xml:space="preserve">NOVO EM 22/10/2026 — este texto nao existia.</w:t>
+      </w:r>
+    </w:p>
+    <w:p>
+      <w:pPr>
+        <w:spacing w:after="160" w:line="300"/>
+      </w:pPr>
+      <w:r>
+        <w:rPr>
+          <w:rFonts w:ascii="Consolas" w:cs="Consolas" w:eastAsia="Consolas" w:hAnsi="Consolas"/>
+          <w:color w:val="9AA0A6"/>
+          <w:sz w:val="14"/>
+          <w:szCs w:val="14"/>
+        </w:rPr>
+        <w:t xml:space="preserve">RK-0146  </w:t>
+      </w:r>
+      <w:r>
+        <w:rPr>
+          <w:sz w:val="22"/>
+          <w:szCs w:val="22"/>
+        </w:rPr>
+        <w:t xml:space="preserve">Antes do temporal: recolha ou amarre o que o vento pode arremessar (vasos, móveis de área externa, telhas soltas) e deixe o carro longe de árvores e postes.</w:t>
+      </w:r>
+    </w:p>
+    <w:p>
+      <w:pPr>
+        <w:spacing w:after="160" w:before="0"/>
+        <w:ind w:left="360"/>
+      </w:pPr>
+      <w:r>
+        <w:rPr>
+          <w:i/>
+          <w:iCs/>
+          <w:color w:val="065F46"/>
+          <w:sz w:val="18"/>
+          <w:szCs w:val="18"/>
+        </w:rPr>
+        <w:t xml:space="preserve">NOVO EM 22/10/2026 — este texto nao existia.</w:t>
+      </w:r>
+    </w:p>
+    <w:p>
+      <w:pPr>
+        <w:spacing w:after="160" w:line="300"/>
+      </w:pPr>
+      <w:r>
+        <w:rPr>
+          <w:rFonts w:ascii="Consolas" w:cs="Consolas" w:eastAsia="Consolas" w:hAnsi="Consolas"/>
+          <w:color w:val="9AA0A6"/>
+          <w:sz w:val="14"/>
+          <w:szCs w:val="14"/>
+        </w:rPr>
+        <w:t xml:space="preserve">RK-0147  </w:t>
+      </w:r>
+      <w:r>
+        <w:rPr>
+          <w:sz w:val="22"/>
+          <w:szCs w:val="22"/>
+        </w:rPr>
+        <w:t xml:space="preserve">Durante: fique dentro de casa, longe de janelas e portas de vidro. Se o telhado começar a ceder, vá para um cômodo interno, como banheiro ou corredor.</w:t>
+      </w:r>
+    </w:p>
+    <w:p>
+      <w:pPr>
+        <w:spacing w:after="160" w:before="0"/>
+        <w:ind w:left="360"/>
+      </w:pPr>
+      <w:r>
+        <w:rPr>
+          <w:i/>
+          <w:iCs/>
+          <w:color w:val="065F46"/>
+          <w:sz w:val="18"/>
+          <w:szCs w:val="18"/>
+        </w:rPr>
+        <w:t xml:space="preserve">NOVO EM 22/10/2026 — este texto nao existia.</w:t>
+      </w:r>
+    </w:p>
+    <w:p>
+      <w:pPr>
+        <w:spacing w:after="160" w:line="300"/>
+      </w:pPr>
+      <w:r>
+        <w:rPr>
+          <w:rFonts w:ascii="Consolas" w:cs="Consolas" w:eastAsia="Consolas" w:hAnsi="Consolas"/>
+          <w:color w:val="9AA0A6"/>
+          <w:sz w:val="14"/>
+          <w:szCs w:val="14"/>
+        </w:rPr>
+        <w:t xml:space="preserve">RK-0148  </w:t>
+      </w:r>
+      <w:r>
+        <w:rPr>
+          <w:sz w:val="22"/>
+          <w:szCs w:val="22"/>
+        </w:rPr>
+        <w:t xml:space="preserve">Granizo: não saia para proteger o carro nem para recolher coisas — pedras grandes ferem.</w:t>
+      </w:r>
+    </w:p>
+    <w:p>
+      <w:pPr>
+        <w:spacing w:after="160" w:before="0"/>
+        <w:ind w:left="360"/>
+      </w:pPr>
+      <w:r>
+        <w:rPr>
+          <w:i/>
+          <w:iCs/>
+          <w:color w:val="065F46"/>
+          <w:sz w:val="18"/>
+          <w:szCs w:val="18"/>
+        </w:rPr>
+        <w:t xml:space="preserve">NOVO EM 22/10/2026 — este texto nao existia.</w:t>
+      </w:r>
+    </w:p>
+    <w:p>
+      <w:pPr>
+        <w:spacing w:after="160" w:line="300"/>
+      </w:pPr>
+      <w:r>
+        <w:rPr>
+          <w:rFonts w:ascii="Consolas" w:cs="Consolas" w:eastAsia="Consolas" w:hAnsi="Consolas"/>
+          <w:color w:val="9AA0A6"/>
+          <w:sz w:val="14"/>
+          <w:szCs w:val="14"/>
+        </w:rPr>
+        <w:t xml:space="preserve">RK-0149  </w:t>
+      </w:r>
+      <w:r>
+        <w:rPr>
+          <w:sz w:val="22"/>
+          <w:szCs w:val="22"/>
+        </w:rPr>
+        <w:t xml:space="preserve">Depois: trate todo fio caído como energizado — mantenha distância e chame a companhia de energia. Não suba no telhado com chuva ou vento.</w:t>
+      </w:r>
+    </w:p>
+    <w:p>
+      <w:pPr>
+        <w:spacing w:after="160" w:before="0"/>
+        <w:ind w:left="360"/>
+      </w:pPr>
+      <w:r>
+        <w:rPr>
+          <w:i/>
+          <w:iCs/>
+          <w:color w:val="065F46"/>
+          <w:sz w:val="18"/>
+          <w:szCs w:val="18"/>
+        </w:rPr>
+        <w:t xml:space="preserve">NOVO EM 22/10/2026 — este texto nao existia.</w:t>
+      </w:r>
+    </w:p>
+    <w:p>
+      <w:pPr>
+        <w:spacing w:after="160" w:line="300"/>
+      </w:pPr>
+      <w:r>
+        <w:rPr>
+          <w:rFonts w:ascii="Consolas" w:cs="Consolas" w:eastAsia="Consolas" w:hAnsi="Consolas"/>
+          <w:color w:val="9AA0A6"/>
+          <w:sz w:val="14"/>
+          <w:szCs w:val="14"/>
+        </w:rPr>
+        <w:t xml:space="preserve">RK-0150  </w:t>
+      </w:r>
+      <w:r>
+        <w:rPr>
+          <w:sz w:val="22"/>
+          <w:szCs w:val="22"/>
+        </w:rPr>
+        <w:t xml:space="preserve">Traga os pets para dentro antes do temporal: assustados, eles fogem e se ferem.</w:t>
+      </w:r>
+    </w:p>
+    <w:p>
+      <w:pPr>
+        <w:spacing w:after="160" w:before="0"/>
+        <w:ind w:left="360"/>
+      </w:pPr>
+      <w:r>
+        <w:rPr>
+          <w:i/>
+          <w:iCs/>
+          <w:color w:val="065F46"/>
+          <w:sz w:val="18"/>
+          <w:szCs w:val="18"/>
+        </w:rPr>
+        <w:t xml:space="preserve">NOVO EM 22/10/2026 — este texto nao existia.</w:t>
       </w:r>
     </w:p>
     <w:p>
@@ -6008,6 +7233,182 @@
           <w:sz w:val="34"/>
           <w:szCs w:val="34"/>
         </w:rPr>
+        <w:t xml:space="preserve">PrimeirosSocorrosScreen</w:t>
+      </w:r>
+    </w:p>
+    <w:p>
+      <w:pPr>
+        <w:spacing w:after="160" w:line="300"/>
+      </w:pPr>
+      <w:r>
+        <w:rPr>
+          <w:rFonts w:ascii="Consolas" w:cs="Consolas" w:eastAsia="Consolas" w:hAnsi="Consolas"/>
+          <w:color w:val="9AA0A6"/>
+          <w:sz w:val="14"/>
+          <w:szCs w:val="14"/>
+        </w:rPr>
+        <w:t xml:space="preserve">RK-0151  </w:t>
+      </w:r>
+      <w:r>
+        <w:rPr>
+          <w:sz w:val="22"/>
+          <w:szCs w:val="22"/>
+        </w:rPr>
+        <w:t xml:space="preserve">raio raios relampago trovao trovoada tempestade descarga atmosferica lightning rayo rcp cpr</w:t>
+      </w:r>
+    </w:p>
+    <w:p>
+      <w:pPr>
+        <w:spacing w:after="160" w:before="0"/>
+        <w:ind w:left="360"/>
+      </w:pPr>
+      <w:r>
+        <w:rPr>
+          <w:i/>
+          <w:iCs/>
+          <w:color w:val="065F46"/>
+          <w:sz w:val="18"/>
+          <w:szCs w:val="18"/>
+        </w:rPr>
+        <w:t xml:space="preserve">NOVO EM 22/10/2026 — este texto nao existia.</w:t>
+      </w:r>
+    </w:p>
+    <w:p>
+      <w:pPr>
+        <w:pStyle w:val="Heading1"/>
+        <w:pageBreakBefore/>
+        <w:spacing w:after="200"/>
+      </w:pPr>
+      <w:r>
+        <w:rPr>
+          <w:b/>
+          <w:bCs/>
+          <w:color w:val="065F46"/>
+          <w:sz w:val="34"/>
+          <w:szCs w:val="34"/>
+        </w:rPr>
+        <w:t xml:space="preserve">Fazendo as Malas — bagagem aerea</w:t>
+      </w:r>
+    </w:p>
+    <w:p>
+      <w:pPr>
+        <w:pStyle w:val="Heading2"/>
+        <w:spacing w:after="120" w:before="280"/>
+      </w:pPr>
+      <w:r>
+        <w:rPr>
+          <w:b/>
+          <w:bCs/>
+          <w:sz w:val="26"/>
+          <w:szCs w:val="26"/>
+        </w:rPr>
+        <w:t xml:space="preserve">Bagagem Aérea: o que pode e onde</w:t>
+      </w:r>
+    </w:p>
+    <w:p>
+      <w:pPr>
+        <w:spacing w:after="60" w:before="180"/>
+      </w:pPr>
+      <w:r>
+        <w:rPr>
+          <w:b/>
+          <w:bCs/>
+          <w:color w:val="9AA0A6"/>
+          <w:spacing w:val="20"/>
+          <w:sz w:val="16"/>
+          <w:szCs w:val="16"/>
+        </w:rPr>
+        <w:t xml:space="preserve">INTRODUCAO</w:t>
+      </w:r>
+    </w:p>
+    <w:p>
+      <w:pPr>
+        <w:spacing w:after="160" w:line="300"/>
+      </w:pPr>
+      <w:r>
+        <w:rPr>
+          <w:rFonts w:ascii="Consolas" w:cs="Consolas" w:eastAsia="Consolas" w:hAnsi="Consolas"/>
+          <w:color w:val="9AA0A6"/>
+          <w:sz w:val="14"/>
+          <w:szCs w:val="14"/>
+        </w:rPr>
+        <w:t xml:space="preserve">RK-0152  </w:t>
+      </w:r>
+      <w:r>
+        <w:rPr>
+          <w:sz w:val="22"/>
+          <w:szCs w:val="22"/>
+        </w:rPr>
+        <w:t xml:space="preserve">Vai de avião? Estas regras ajudam a evitar problemas no embarque. Mudaram em 2026 — confirme com a sua companhia aérea.</w:t>
+      </w:r>
+    </w:p>
+    <w:p>
+      <w:pPr>
+        <w:spacing w:after="160" w:before="0"/>
+        <w:ind w:left="360"/>
+      </w:pPr>
+      <w:r>
+        <w:rPr>
+          <w:i/>
+          <w:iCs/>
+          <w:color w:val="8A6D00"/>
+          <w:sz w:val="18"/>
+          <w:szCs w:val="18"/>
+        </w:rPr>
+        <w:t xml:space="preserve">ANTES (até 22/10/2026): Vai de avião? Estas regras evitam barreira no embarque. Mudaram em 2026 — confirme com a sua companhia.</w:t>
+      </w:r>
+    </w:p>
+    <w:p>
+      <w:pPr>
+        <w:spacing w:after="160" w:line="300"/>
+      </w:pPr>
+      <w:r>
+        <w:rPr>
+          <w:rFonts w:ascii="Consolas" w:cs="Consolas" w:eastAsia="Consolas" w:hAnsi="Consolas"/>
+          <w:color w:val="9AA0A6"/>
+          <w:sz w:val="14"/>
+          <w:szCs w:val="14"/>
+        </w:rPr>
+        <w:t xml:space="preserve">RK-0153  </w:t>
+      </w:r>
+      <w:r>
+        <w:rPr>
+          <w:sz w:val="22"/>
+          <w:szCs w:val="22"/>
+        </w:rPr>
+        <w:t xml:space="preserve">Leve na bagagem de mão, na embalagem original e com a receita (física ou digital) — sobretudo os de uso contínuo e de tarja preta. Em viagem internacional, leve a receita com o nome do princípio ativo e, se possível, uma tradução para o inglês ou para o idioma do destino; alguns países exigem autorização prévia para remédios controlados — consulte a embaixada ou o consulado.</w:t>
+      </w:r>
+    </w:p>
+    <w:p>
+      <w:pPr>
+        <w:spacing w:after="160" w:before="0"/>
+        <w:ind w:left="360"/>
+      </w:pPr>
+      <w:r>
+        <w:rPr>
+          <w:i/>
+          <w:iCs/>
+          <w:color w:val="8A6D00"/>
+          <w:sz w:val="18"/>
+          <w:szCs w:val="18"/>
+        </w:rPr>
+        <w:t xml:space="preserve">ANTES (até 22/10/2026): Só na bagagem de mão, nunca na despachada. Até 2 por pessoa, de até 100 Wh; de 100 a 160 Wh, só com autorização da companhia; acima disso, proibido. A bordo: não recarregue o power bank, não ligue na USB do avião, evite usá-lo para carregar outros aparelhos e guarde na bolsa embaixo do assento ou no bolsão — nunca no compartimento de cima. A companhia pode ter regra mais rígida.</w:t>
+      </w:r>
+    </w:p>
+    <w:p>
+      <w:pPr>
+        <w:pStyle w:val="Heading1"/>
+        <w:pageBreakBefore/>
+        <w:spacing w:after="200"/>
+      </w:pPr>
+      <w:r>
+        <w:rPr>
+          <w:b/>
+          <w:bCs/>
+          <w:color w:val="065F46"/>
+          <w:sz w:val="34"/>
+          <w:szCs w:val="34"/>
+        </w:rPr>
         <w:t xml:space="preserve">Textos de interface</w:t>
       </w:r>
     </w:p>
@@ -6037,7 +7438,7 @@
           <w:sz w:val="14"/>
           <w:szCs w:val="14"/>
         </w:rPr>
-        <w:t xml:space="preserve">RK-0120  </w:t>
+        <w:t xml:space="preserve">RK-0154  </w:t>
       </w:r>
       <w:r>
         <w:rPr>
@@ -6089,7 +7490,7 @@
           <w:sz w:val="14"/>
           <w:szCs w:val="14"/>
         </w:rPr>
-        <w:t xml:space="preserve">RK-0121  </w:t>
+        <w:t xml:space="preserve">RK-0155  </w:t>
       </w:r>
       <w:r>
         <w:rPr>
@@ -6141,7 +7542,7 @@
           <w:sz w:val="14"/>
           <w:szCs w:val="14"/>
         </w:rPr>
-        <w:t xml:space="preserve">RK-0122  </w:t>
+        <w:t xml:space="preserve">RK-0156  </w:t>
       </w:r>
       <w:r>
         <w:rPr>
@@ -6178,7 +7579,7 @@
           <w:sz w:val="14"/>
           <w:szCs w:val="14"/>
         </w:rPr>
-        <w:t xml:space="preserve">RK-0123  </w:t>
+        <w:t xml:space="preserve">RK-0157  </w:t>
       </w:r>
       <w:r>
         <w:rPr>
@@ -6215,7 +7616,7 @@
           <w:sz w:val="14"/>
           <w:szCs w:val="14"/>
         </w:rPr>
-        <w:t xml:space="preserve">RK-0124  </w:t>
+        <w:t xml:space="preserve">RK-0158  </w:t>
       </w:r>
       <w:r>
         <w:rPr>
@@ -6252,7 +7653,7 @@
           <w:sz w:val="14"/>
           <w:szCs w:val="14"/>
         </w:rPr>
-        <w:t xml:space="preserve">RK-0125  </w:t>
+        <w:t xml:space="preserve">RK-0159  </w:t>
       </w:r>
       <w:r>
         <w:rPr>
@@ -6289,7 +7690,7 @@
           <w:sz w:val="14"/>
           <w:szCs w:val="14"/>
         </w:rPr>
-        <w:t xml:space="preserve">RK-0126  </w:t>
+        <w:t xml:space="preserve">RK-0160  </w:t>
       </w:r>
       <w:r>
         <w:rPr>
@@ -6341,7 +7742,7 @@
           <w:sz w:val="14"/>
           <w:szCs w:val="14"/>
         </w:rPr>
-        <w:t xml:space="preserve">RK-0127  </w:t>
+        <w:t xml:space="preserve">RK-0161  </w:t>
       </w:r>
       <w:r>
         <w:rPr>
@@ -6378,7 +7779,7 @@
           <w:sz w:val="14"/>
           <w:szCs w:val="14"/>
         </w:rPr>
-        <w:t xml:space="preserve">RK-0128  </w:t>
+        <w:t xml:space="preserve">RK-0162  </w:t>
       </w:r>
       <w:r>
         <w:rPr>
@@ -6415,7 +7816,7 @@
           <w:sz w:val="14"/>
           <w:szCs w:val="14"/>
         </w:rPr>
-        <w:t xml:space="preserve">RK-0129  </w:t>
+        <w:t xml:space="preserve">RK-0163  </w:t>
       </w:r>
       <w:r>
         <w:rPr>
@@ -6452,7 +7853,7 @@
           <w:sz w:val="14"/>
           <w:szCs w:val="14"/>
         </w:rPr>
-        <w:t xml:space="preserve">RK-0130  </w:t>
+        <w:t xml:space="preserve">RK-0164  </w:t>
       </w:r>
       <w:r>
         <w:rPr>
@@ -6489,7 +7890,7 @@
           <w:sz w:val="14"/>
           <w:szCs w:val="14"/>
         </w:rPr>
-        <w:t xml:space="preserve">RK-0131  </w:t>
+        <w:t xml:space="preserve">RK-0165  </w:t>
       </w:r>
       <w:r>
         <w:rPr>
@@ -6526,7 +7927,7 @@
           <w:sz w:val="14"/>
           <w:szCs w:val="14"/>
         </w:rPr>
-        <w:t xml:space="preserve">RK-0132  </w:t>
+        <w:t xml:space="preserve">RK-0166  </w:t>
       </w:r>
       <w:r>
         <w:rPr>
@@ -6563,7 +7964,7 @@
           <w:sz w:val="14"/>
           <w:szCs w:val="14"/>
         </w:rPr>
-        <w:t xml:space="preserve">RK-0133  </w:t>
+        <w:t xml:space="preserve">RK-0167  </w:t>
       </w:r>
       <w:r>
         <w:rPr>
@@ -6600,7 +8001,7 @@
           <w:sz w:val="14"/>
           <w:szCs w:val="14"/>
         </w:rPr>
-        <w:t xml:space="preserve">RK-0134  </w:t>
+        <w:t xml:space="preserve">RK-0168  </w:t>
       </w:r>
       <w:r>
         <w:rPr>
@@ -6637,7 +8038,7 @@
           <w:sz w:val="14"/>
           <w:szCs w:val="14"/>
         </w:rPr>
-        <w:t xml:space="preserve">RK-0135  </w:t>
+        <w:t xml:space="preserve">RK-0169  </w:t>
       </w:r>
       <w:r>
         <w:rPr>
@@ -6674,7 +8075,7 @@
           <w:sz w:val="14"/>
           <w:szCs w:val="14"/>
         </w:rPr>
-        <w:t xml:space="preserve">RK-0136  </w:t>
+        <w:t xml:space="preserve">RK-0170  </w:t>
       </w:r>
       <w:r>
         <w:rPr>

</xml_diff>

<commit_message>
feat(vistorias): Mapa de Riscos e Relatorio no fim da tela, com aviso antes de abrir
Decisao do Agnaldo (22/10/2026). Cada um avisa so sobre o que ELE usa:
- Mapa de Riscos: monta-se com o cadastro da casa e dos moradores, nao com
  a vistoria (CLAUDE.md: mapa != vistoria). Avisa quando falta morador.
- Relatorio: usa as respostas da vistoria. Avisa quando ha item sem
  resposta e oferece continuar a vistoria de onde parou.
Textos nos 4 idiomas; no RK para revisao. D14 ganha o historico da
central de kits (sem registro de motivo; acessos removidos sem decisao).

Co-Authored-By: Claude Opus 5.5 <noreply@anthropic.com>
</commit_message>
<xml_diff>
--- a/docs/revisao-conteudo/RK-Retorno-CK-AV-IF.docx
+++ b/docs/revisao-conteudo/RK-Retorno-CK-AV-IF.docx
@@ -42,7 +42,7 @@
           <w:sz w:val="22"/>
           <w:szCs w:val="22"/>
         </w:rPr>
-        <w:t xml:space="preserve">Retorno da sua revisao do CK, do AV e do IF. Suas edicoes entraram como voce escreveu; aqui estao so os textos que voce ainda nao viu: onde ajustei a sua edicao ao aplicar (concordancia, repeticao), as respostas aos seus comentarios (sobrocado, pilha botao, cerca de piscina, aranha-marrom, churrasqueira, radonio, soro de reidratacao...), a cautela que estava esperando estes documentos, os ambientes do checklist e as telas EPI e Ferramentas que nao tinham traducao, e o que levei das partes mortas do checklist para as telas vivas de Escola, Asilo e Kits. No fim, o conteudo de clima que voce pediu: alerta de raios para todas as regioes, alerta de vendaval, granizo e ciclone no Sul e o tema de primeiros socorros Atingido por Raio. A linha ANTES mostra como estava; texto sem ANTES e novo.</w:t>
+        <w:t xml:space="preserve">Retorno da sua revisao do CK, do AV e do IF. Suas edicoes entraram como voce escreveu; aqui estao so os textos que voce ainda nao viu: onde ajustei a sua edicao ao aplicar (concordancia, repeticao), as respostas aos seus comentarios (sobrocado, pilha botao, cerca de piscina, aranha-marrom, churrasqueira, radonio, soro de reidratacao...), a cautela que estava esperando estes documentos, os ambientes do checklist e as telas EPI e Ferramentas que nao tinham traducao, e o que levei das partes mortas do checklist para as telas vivas de Escola, Asilo e Kits. No fim, o conteudo de clima que voce pediu: alerta de raios para todas as regioes, alerta de vendaval, granizo e ciclone no Sul e o tema de primeiros socorros Atingido por Raio. E os avisos que o Mapa de Riscos e o Relatorio dao antes de abrir, agora no fim da tela de vistorias. A linha ANTES mostra como estava; texto sem ANTES e novo.</w:t>
       </w:r>
     </w:p>
     <w:p>
@@ -176,7 +176,7 @@
           <w:sz w:val="20"/>
           <w:szCs w:val="20"/>
         </w:rPr>
-        <w:t xml:space="preserve">107 textos neste documento.</w:t>
+        <w:t xml:space="preserve">113 textos neste documento.</w:t>
       </w:r>
     </w:p>
     <w:p>
@@ -7233,7 +7233,7 @@
           <w:sz w:val="34"/>
           <w:szCs w:val="34"/>
         </w:rPr>
-        <w:t xml:space="preserve">PrimeirosSocorrosScreen</w:t>
+        <w:t xml:space="preserve">RelatoriosScreenNeo</w:t>
       </w:r>
     </w:p>
     <w:p>
@@ -7254,7 +7254,44 @@
           <w:sz w:val="22"/>
           <w:szCs w:val="22"/>
         </w:rPr>
-        <w:t xml:space="preserve">raio raios relampago trovao trovoada tempestade descarga atmosferica lightning rayo rcp cpr</w:t>
+        <w:t xml:space="preserve">O Mapa de Riscos se monta com o que você cadastrou sobre a casa e os moradores — não depende da vistoria. Ainda falta cadastrar {{count}} morador(es), e o mapa pode ficar incompleto.</w:t>
+      </w:r>
+    </w:p>
+    <w:p>
+      <w:pPr>
+        <w:spacing w:after="160" w:before="0"/>
+        <w:ind w:left="360"/>
+      </w:pPr>
+      <w:r>
+        <w:rPr>
+          <w:i/>
+          <w:iCs/>
+          <w:color w:val="065F46"/>
+          <w:sz w:val="18"/>
+          <w:szCs w:val="18"/>
+        </w:rPr>
+        <w:t xml:space="preserve">NOVO EM 22/10/2026 — este texto nao existia.</w:t>
+      </w:r>
+    </w:p>
+    <w:p>
+      <w:pPr>
+        <w:spacing w:after="160" w:line="300"/>
+      </w:pPr>
+      <w:r>
+        <w:rPr>
+          <w:rFonts w:ascii="Consolas" w:cs="Consolas" w:eastAsia="Consolas" w:hAnsi="Consolas"/>
+          <w:color w:val="9AA0A6"/>
+          <w:sz w:val="14"/>
+          <w:szCs w:val="14"/>
+        </w:rPr>
+        <w:t xml:space="preserve">RK-0152  </w:t>
+      </w:r>
+      <w:r>
+        <w:rPr>
+          <w:sz w:val="22"/>
+          <w:szCs w:val="22"/>
+        </w:rPr>
+        <w:t xml:space="preserve">O relatório usa as respostas da vistoria. Ainda faltam {{count}} item(ns) sem resposta; até lá, ele mostra só o que já foi respondido.</w:t>
       </w:r>
     </w:p>
     <w:p>
@@ -7287,6 +7324,60 @@
           <w:sz w:val="34"/>
           <w:szCs w:val="34"/>
         </w:rPr>
+        <w:t xml:space="preserve">PrimeirosSocorrosScreen</w:t>
+      </w:r>
+    </w:p>
+    <w:p>
+      <w:pPr>
+        <w:spacing w:after="160" w:line="300"/>
+      </w:pPr>
+      <w:r>
+        <w:rPr>
+          <w:rFonts w:ascii="Consolas" w:cs="Consolas" w:eastAsia="Consolas" w:hAnsi="Consolas"/>
+          <w:color w:val="9AA0A6"/>
+          <w:sz w:val="14"/>
+          <w:szCs w:val="14"/>
+        </w:rPr>
+        <w:t xml:space="preserve">RK-0153  </w:t>
+      </w:r>
+      <w:r>
+        <w:rPr>
+          <w:sz w:val="22"/>
+          <w:szCs w:val="22"/>
+        </w:rPr>
+        <w:t xml:space="preserve">raio raios relampago trovao trovoada tempestade descarga atmosferica lightning rayo rcp cpr</w:t>
+      </w:r>
+    </w:p>
+    <w:p>
+      <w:pPr>
+        <w:spacing w:after="160" w:before="0"/>
+        <w:ind w:left="360"/>
+      </w:pPr>
+      <w:r>
+        <w:rPr>
+          <w:i/>
+          <w:iCs/>
+          <w:color w:val="065F46"/>
+          <w:sz w:val="18"/>
+          <w:szCs w:val="18"/>
+        </w:rPr>
+        <w:t xml:space="preserve">NOVO EM 22/10/2026 — este texto nao existia.</w:t>
+      </w:r>
+    </w:p>
+    <w:p>
+      <w:pPr>
+        <w:pStyle w:val="Heading1"/>
+        <w:pageBreakBefore/>
+        <w:spacing w:after="200"/>
+      </w:pPr>
+      <w:r>
+        <w:rPr>
+          <w:b/>
+          <w:bCs/>
+          <w:color w:val="065F46"/>
+          <w:sz w:val="34"/>
+          <w:szCs w:val="34"/>
+        </w:rPr>
         <w:t xml:space="preserve">Fazendo as Malas — bagagem aerea</w:t>
       </w:r>
     </w:p>
@@ -7332,7 +7423,7 @@
           <w:sz w:val="14"/>
           <w:szCs w:val="14"/>
         </w:rPr>
-        <w:t xml:space="preserve">RK-0152  </w:t>
+        <w:t xml:space="preserve">RK-0154  </w:t>
       </w:r>
       <w:r>
         <w:rPr>
@@ -7369,7 +7460,7 @@
           <w:sz w:val="14"/>
           <w:szCs w:val="14"/>
         </w:rPr>
-        <w:t xml:space="preserve">RK-0153  </w:t>
+        <w:t xml:space="preserve">RK-0155  </w:t>
       </w:r>
       <w:r>
         <w:rPr>
@@ -7438,7 +7529,7 @@
           <w:sz w:val="14"/>
           <w:szCs w:val="14"/>
         </w:rPr>
-        <w:t xml:space="preserve">RK-0154  </w:t>
+        <w:t xml:space="preserve">RK-0156  </w:t>
       </w:r>
       <w:r>
         <w:rPr>
@@ -7476,6 +7567,169 @@
           <w:sz w:val="26"/>
           <w:szCs w:val="26"/>
         </w:rPr>
+        <w:t xml:space="preserve">reports</w:t>
+      </w:r>
+    </w:p>
+    <w:p>
+      <w:pPr>
+        <w:spacing w:after="160" w:line="300"/>
+      </w:pPr>
+      <w:r>
+        <w:rPr>
+          <w:rFonts w:ascii="Consolas" w:cs="Consolas" w:eastAsia="Consolas" w:hAnsi="Consolas"/>
+          <w:color w:val="9AA0A6"/>
+          <w:sz w:val="14"/>
+          <w:szCs w:val="14"/>
+        </w:rPr>
+        <w:t xml:space="preserve">RK-0157  </w:t>
+      </w:r>
+      <w:r>
+        <w:rPr>
+          <w:sz w:val="22"/>
+          <w:szCs w:val="22"/>
+        </w:rPr>
+        <w:t xml:space="preserve">O Mapa de Riscos se monta com o que você cadastrou sobre a casa e os moradores — não depende da vistoria. Ainda falta cadastrar {{count}} morador, e o mapa pode ficar incompleto.</w:t>
+      </w:r>
+    </w:p>
+    <w:p>
+      <w:pPr>
+        <w:spacing w:after="160" w:before="0"/>
+        <w:ind w:left="360"/>
+      </w:pPr>
+      <w:r>
+        <w:rPr>
+          <w:i/>
+          <w:iCs/>
+          <w:color w:val="065F46"/>
+          <w:sz w:val="18"/>
+          <w:szCs w:val="18"/>
+        </w:rPr>
+        <w:t xml:space="preserve">NOVO EM 22/10/2026 — este texto nao existia.</w:t>
+      </w:r>
+    </w:p>
+    <w:p>
+      <w:pPr>
+        <w:spacing w:after="160" w:line="300"/>
+      </w:pPr>
+      <w:r>
+        <w:rPr>
+          <w:rFonts w:ascii="Consolas" w:cs="Consolas" w:eastAsia="Consolas" w:hAnsi="Consolas"/>
+          <w:color w:val="9AA0A6"/>
+          <w:sz w:val="14"/>
+          <w:szCs w:val="14"/>
+        </w:rPr>
+        <w:t xml:space="preserve">RK-0158  </w:t>
+      </w:r>
+      <w:r>
+        <w:rPr>
+          <w:sz w:val="22"/>
+          <w:szCs w:val="22"/>
+        </w:rPr>
+        <w:t xml:space="preserve">O Mapa de Riscos se monta com o que você cadastrou sobre a casa e os moradores — não depende da vistoria. Ainda falta cadastrar {{count}} moradores, e o mapa pode ficar incompleto.</w:t>
+      </w:r>
+    </w:p>
+    <w:p>
+      <w:pPr>
+        <w:spacing w:after="160" w:before="0"/>
+        <w:ind w:left="360"/>
+      </w:pPr>
+      <w:r>
+        <w:rPr>
+          <w:i/>
+          <w:iCs/>
+          <w:color w:val="065F46"/>
+          <w:sz w:val="18"/>
+          <w:szCs w:val="18"/>
+        </w:rPr>
+        <w:t xml:space="preserve">NOVO EM 22/10/2026 — este texto nao existia.</w:t>
+      </w:r>
+    </w:p>
+    <w:p>
+      <w:pPr>
+        <w:spacing w:after="160" w:line="300"/>
+      </w:pPr>
+      <w:r>
+        <w:rPr>
+          <w:rFonts w:ascii="Consolas" w:cs="Consolas" w:eastAsia="Consolas" w:hAnsi="Consolas"/>
+          <w:color w:val="9AA0A6"/>
+          <w:sz w:val="14"/>
+          <w:szCs w:val="14"/>
+        </w:rPr>
+        <w:t xml:space="preserve">RK-0159  </w:t>
+      </w:r>
+      <w:r>
+        <w:rPr>
+          <w:sz w:val="22"/>
+          <w:szCs w:val="22"/>
+        </w:rPr>
+        <w:t xml:space="preserve">O relatório usa as respostas da vistoria. Ainda falta {{count}} item sem resposta; até lá, ele mostra só o que já foi respondido.</w:t>
+      </w:r>
+    </w:p>
+    <w:p>
+      <w:pPr>
+        <w:spacing w:after="160" w:before="0"/>
+        <w:ind w:left="360"/>
+      </w:pPr>
+      <w:r>
+        <w:rPr>
+          <w:i/>
+          <w:iCs/>
+          <w:color w:val="065F46"/>
+          <w:sz w:val="18"/>
+          <w:szCs w:val="18"/>
+        </w:rPr>
+        <w:t xml:space="preserve">NOVO EM 22/10/2026 — este texto nao existia.</w:t>
+      </w:r>
+    </w:p>
+    <w:p>
+      <w:pPr>
+        <w:spacing w:after="160" w:line="300"/>
+      </w:pPr>
+      <w:r>
+        <w:rPr>
+          <w:rFonts w:ascii="Consolas" w:cs="Consolas" w:eastAsia="Consolas" w:hAnsi="Consolas"/>
+          <w:color w:val="9AA0A6"/>
+          <w:sz w:val="14"/>
+          <w:szCs w:val="14"/>
+        </w:rPr>
+        <w:t xml:space="preserve">RK-0160  </w:t>
+      </w:r>
+      <w:r>
+        <w:rPr>
+          <w:sz w:val="22"/>
+          <w:szCs w:val="22"/>
+        </w:rPr>
+        <w:t xml:space="preserve">O relatório usa as respostas da vistoria. Ainda faltam {{count}} itens sem resposta; até lá, ele mostra só o que já foi respondido.</w:t>
+      </w:r>
+    </w:p>
+    <w:p>
+      <w:pPr>
+        <w:spacing w:after="160" w:before="0"/>
+        <w:ind w:left="360"/>
+      </w:pPr>
+      <w:r>
+        <w:rPr>
+          <w:i/>
+          <w:iCs/>
+          <w:color w:val="065F46"/>
+          <w:sz w:val="18"/>
+          <w:szCs w:val="18"/>
+        </w:rPr>
+        <w:t xml:space="preserve">NOVO EM 22/10/2026 — este texto nao existia.</w:t>
+      </w:r>
+    </w:p>
+    <w:p>
+      <w:pPr>
+        <w:pStyle w:val="Heading2"/>
+        <w:spacing w:after="120" w:before="280"/>
+      </w:pPr>
+      <w:r>
+        <w:rPr>
+          <w:b/>
+          <w:bCs/>
+          <w:sz w:val="26"/>
+          <w:szCs w:val="26"/>
+        </w:rPr>
         <w:t xml:space="preserve">upgrade</w:t>
       </w:r>
     </w:p>
@@ -7490,7 +7744,7 @@
           <w:sz w:val="14"/>
           <w:szCs w:val="14"/>
         </w:rPr>
-        <w:t xml:space="preserve">RK-0155  </w:t>
+        <w:t xml:space="preserve">RK-0161  </w:t>
       </w:r>
       <w:r>
         <w:rPr>
@@ -7542,7 +7796,7 @@
           <w:sz w:val="14"/>
           <w:szCs w:val="14"/>
         </w:rPr>
-        <w:t xml:space="preserve">RK-0156  </w:t>
+        <w:t xml:space="preserve">RK-0162  </w:t>
       </w:r>
       <w:r>
         <w:rPr>
@@ -7579,7 +7833,7 @@
           <w:sz w:val="14"/>
           <w:szCs w:val="14"/>
         </w:rPr>
-        <w:t xml:space="preserve">RK-0157  </w:t>
+        <w:t xml:space="preserve">RK-0163  </w:t>
       </w:r>
       <w:r>
         <w:rPr>
@@ -7616,7 +7870,7 @@
           <w:sz w:val="14"/>
           <w:szCs w:val="14"/>
         </w:rPr>
-        <w:t xml:space="preserve">RK-0158  </w:t>
+        <w:t xml:space="preserve">RK-0164  </w:t>
       </w:r>
       <w:r>
         <w:rPr>
@@ -7653,7 +7907,7 @@
           <w:sz w:val="14"/>
           <w:szCs w:val="14"/>
         </w:rPr>
-        <w:t xml:space="preserve">RK-0159  </w:t>
+        <w:t xml:space="preserve">RK-0165  </w:t>
       </w:r>
       <w:r>
         <w:rPr>
@@ -7690,7 +7944,7 @@
           <w:sz w:val="14"/>
           <w:szCs w:val="14"/>
         </w:rPr>
-        <w:t xml:space="preserve">RK-0160  </w:t>
+        <w:t xml:space="preserve">RK-0166  </w:t>
       </w:r>
       <w:r>
         <w:rPr>
@@ -7742,7 +7996,7 @@
           <w:sz w:val="14"/>
           <w:szCs w:val="14"/>
         </w:rPr>
-        <w:t xml:space="preserve">RK-0161  </w:t>
+        <w:t xml:space="preserve">RK-0167  </w:t>
       </w:r>
       <w:r>
         <w:rPr>
@@ -7779,7 +8033,7 @@
           <w:sz w:val="14"/>
           <w:szCs w:val="14"/>
         </w:rPr>
-        <w:t xml:space="preserve">RK-0162  </w:t>
+        <w:t xml:space="preserve">RK-0168  </w:t>
       </w:r>
       <w:r>
         <w:rPr>
@@ -7816,7 +8070,7 @@
           <w:sz w:val="14"/>
           <w:szCs w:val="14"/>
         </w:rPr>
-        <w:t xml:space="preserve">RK-0163  </w:t>
+        <w:t xml:space="preserve">RK-0169  </w:t>
       </w:r>
       <w:r>
         <w:rPr>
@@ -7853,7 +8107,7 @@
           <w:sz w:val="14"/>
           <w:szCs w:val="14"/>
         </w:rPr>
-        <w:t xml:space="preserve">RK-0164  </w:t>
+        <w:t xml:space="preserve">RK-0170  </w:t>
       </w:r>
       <w:r>
         <w:rPr>
@@ -7890,7 +8144,7 @@
           <w:sz w:val="14"/>
           <w:szCs w:val="14"/>
         </w:rPr>
-        <w:t xml:space="preserve">RK-0165  </w:t>
+        <w:t xml:space="preserve">RK-0171  </w:t>
       </w:r>
       <w:r>
         <w:rPr>
@@ -7927,7 +8181,7 @@
           <w:sz w:val="14"/>
           <w:szCs w:val="14"/>
         </w:rPr>
-        <w:t xml:space="preserve">RK-0166  </w:t>
+        <w:t xml:space="preserve">RK-0172  </w:t>
       </w:r>
       <w:r>
         <w:rPr>
@@ -7964,7 +8218,7 @@
           <w:sz w:val="14"/>
           <w:szCs w:val="14"/>
         </w:rPr>
-        <w:t xml:space="preserve">RK-0167  </w:t>
+        <w:t xml:space="preserve">RK-0173  </w:t>
       </w:r>
       <w:r>
         <w:rPr>
@@ -8001,7 +8255,7 @@
           <w:sz w:val="14"/>
           <w:szCs w:val="14"/>
         </w:rPr>
-        <w:t xml:space="preserve">RK-0168  </w:t>
+        <w:t xml:space="preserve">RK-0174  </w:t>
       </w:r>
       <w:r>
         <w:rPr>
@@ -8038,7 +8292,7 @@
           <w:sz w:val="14"/>
           <w:szCs w:val="14"/>
         </w:rPr>
-        <w:t xml:space="preserve">RK-0169  </w:t>
+        <w:t xml:space="preserve">RK-0175  </w:t>
       </w:r>
       <w:r>
         <w:rPr>
@@ -8075,7 +8329,7 @@
           <w:sz w:val="14"/>
           <w:szCs w:val="14"/>
         </w:rPr>
-        <w:t xml:space="preserve">RK-0170  </w:t>
+        <w:t xml:space="preserve">RK-0176  </w:t>
       </w:r>
       <w:r>
         <w:rPr>

</xml_diff>